<commit_message>
fix: update videoId parameter type in status route for better type safety
</commit_message>
<xml_diff>
--- a/metaadsAPI/docs/Meta_Marketing_API_Learning_Documentation_Updated_2026-10-21.docx
+++ b/metaadsAPI/docs/Meta_Marketing_API_Learning_Documentation_Updated_2026-10-21.docx
@@ -9,7 +9,7 @@
       </w:pPr>
       <w:r>
         <w:rPr>
-          <w:rFonts w:ascii="Aptos Display" w:hAnsi="Aptos Display" w:eastAsia="Aptos" w:cs="Aptos Display" w:csTheme="minorBidi"/>
+          <w:rFonts w:ascii="Aptos Display" w:hAnsi="Aptos Display" w:eastAsia="Aptos" w:cs="Aptos Display"/>
           <w:b/>
           <w:bCs/>
           <w:color w:val="2A9D8F"/>
@@ -27,7 +27,7 @@
       </w:pPr>
       <w:r>
         <w:rPr>
-          <w:rFonts w:ascii="Aptos Display" w:hAnsi="Aptos Display" w:eastAsia="Aptos Display" w:cs="Aptos Display" w:asciiTheme="majorHAnsi" w:hAnsiTheme="majorHAnsi" w:eastAsiaTheme="majorEastAsia" w:csTheme="majorBidi"/>
+          <w:rFonts w:ascii="Aptos Display" w:hAnsi="Aptos Display" w:eastAsia="Aptos Display" w:cs="Aptos Display" w:asciiTheme="majorHAnsi" w:hAnsiTheme="majorHAnsi" w:eastAsiaTheme="majorEastAsia"/>
           <w:b/>
           <w:bCs/>
           <w:color w:val="17324D"/>
@@ -36,16 +36,50 @@
           <w:sz w:val="60"/>
           <w:szCs w:val="52"/>
         </w:rPr>
-        <w:t>Learning Documentation &amp; Project Runbook</w:t>
+        <w:t>Learning Documentation &amp; Project Runbo</w:t>
       </w:r>
     </w:p>
     <w:p>
       <w:pPr>
-        <w:spacing w:before="240"/>
+        <w:pStyle w:val="Title"/>
+        <w:spacing w:before="160"/>
+        <w:jc w:val="center"/>
+      </w:pPr>
+    </w:p>
+    <w:p>
+      <w:pPr>
+        <w:pStyle w:val="Title"/>
+        <w:spacing w:before="160"/>
+        <w:jc w:val="center"/>
+      </w:pPr>
+    </w:p>
+    <w:p>
+      <w:pPr>
+        <w:pStyle w:val="Title"/>
+        <w:spacing w:before="160"/>
+        <w:jc w:val="center"/>
       </w:pPr>
       <w:r>
         <w:rPr>
-          <w:rFonts w:ascii="Aptos" w:hAnsi="Aptos" w:eastAsia="Aptos" w:cs="Aptos" w:csTheme="minorBidi"/>
+          <w:rFonts w:ascii="Aptos Display" w:hAnsi="Aptos Display" w:eastAsia="Aptos Display" w:cs="Aptos Display" w:asciiTheme="majorHAnsi" w:hAnsiTheme="majorHAnsi" w:eastAsiaTheme="majorEastAsia"/>
+          <w:b/>
+          <w:bCs/>
+          <w:color w:val="17324D"/>
+          <w:spacing w:val="5"/>
+          <w:kern w:val="28"/>
+          <w:sz w:val="60"/>
+          <w:szCs w:val="52"/>
+        </w:rPr>
+        <w:t>ok</w:t>
+      </w:r>
+    </w:p>
+    <w:p>
+      <w:pPr>
+        <w:spacing w:before="240"/>
+      </w:pPr>
+      <w:r>
+        <w:rPr>
+          <w:rFonts w:ascii="Aptos" w:hAnsi="Aptos" w:eastAsia="Aptos" w:cs="Aptos"/>
           <w:color w:val="176B87"/>
           <w:sz w:val="32"/>
           <w:szCs w:val="22"/>
@@ -59,7 +93,7 @@
       </w:pPr>
       <w:r>
         <w:rPr>
-          <w:rFonts w:ascii="Aptos" w:hAnsi="Aptos" w:eastAsia="Aptos" w:cs="Aptos" w:csTheme="minorBidi"/>
+          <w:rFonts w:ascii="Aptos" w:hAnsi="Aptos" w:eastAsia="Aptos" w:cs="Aptos"/>
           <w:color w:val="23313F"/>
           <w:sz w:val="22"/>
           <w:szCs w:val="22"/>
@@ -101,7 +135,7 @@
             <w:r/>
             <w:r>
               <w:rPr>
-                <w:rFonts w:ascii="Aptos" w:hAnsi="Aptos" w:eastAsia="Aptos" w:cs="Aptos" w:csTheme="minorBidi"/>
+                <w:rFonts w:ascii="Aptos" w:hAnsi="Aptos" w:eastAsia="Aptos" w:cs="Aptos"/>
                 <w:b/>
                 <w:bCs/>
                 <w:color w:val="20744A"/>
@@ -117,7 +151,7 @@
             </w:pPr>
             <w:r>
               <w:rPr>
-                <w:rFonts w:ascii="Aptos" w:hAnsi="Aptos" w:eastAsia="Aptos" w:cs="Aptos" w:csTheme="minorBidi"/>
+                <w:rFonts w:ascii="Aptos" w:hAnsi="Aptos" w:eastAsia="Aptos" w:cs="Aptos"/>
                 <w:color w:val="23313F"/>
                 <w:sz w:val="18"/>
                 <w:szCs w:val="22"/>
@@ -139,7 +173,7 @@
       </w:pPr>
       <w:r>
         <w:rPr>
-          <w:rFonts w:ascii="Aptos" w:hAnsi="Aptos" w:eastAsia="Aptos" w:cs="Aptos" w:csTheme="minorBidi"/>
+          <w:rFonts w:ascii="Aptos" w:hAnsi="Aptos" w:eastAsia="Aptos" w:cs="Aptos"/>
           <w:color w:val="23313F"/>
           <w:sz w:val="19"/>
           <w:szCs w:val="22"/>
@@ -153,7 +187,7 @@
       </w:pPr>
       <w:r>
         <w:rPr>
-          <w:rFonts w:ascii="Aptos" w:hAnsi="Aptos" w:eastAsia="Aptos" w:cs="Aptos" w:csTheme="minorBidi"/>
+          <w:rFonts w:ascii="Aptos" w:hAnsi="Aptos" w:eastAsia="Aptos" w:cs="Aptos"/>
           <w:color w:val="23313F"/>
           <w:sz w:val="19"/>
           <w:szCs w:val="22"/>
@@ -166,9 +200,7 @@
         <w:pageBreakBefore/>
         <w:spacing w:after="80" w:line="259" w:lineRule="auto"/>
       </w:pPr>
-      <w:r>
-        <w:lastRenderedPageBreak/>
-      </w:r>
+      <w:r/>
     </w:p>
     <w:p>
       <w:pPr>
@@ -176,7 +208,7 @@
       </w:pPr>
       <w:r>
         <w:rPr>
-          <w:rFonts w:ascii="Aptos Display" w:hAnsi="Aptos Display" w:eastAsia="Aptos Display" w:cs="Aptos Display" w:asciiTheme="majorHAnsi" w:hAnsiTheme="majorHAnsi" w:eastAsiaTheme="majorEastAsia" w:csTheme="majorBidi"/>
+          <w:rFonts w:ascii="Aptos Display" w:hAnsi="Aptos Display" w:eastAsia="Aptos Display" w:cs="Aptos Display" w:asciiTheme="majorHAnsi" w:hAnsiTheme="majorHAnsi" w:eastAsiaTheme="majorEastAsia"/>
           <w:b/>
           <w:bCs/>
           <w:color w:val="17324D"/>
@@ -194,7 +226,7 @@
       </w:pPr>
       <w:r>
         <w:rPr>
-          <w:rFonts w:ascii="Aptos" w:hAnsi="Aptos" w:eastAsia="Aptos" w:cs="Aptos" w:csTheme="minorBidi"/>
+          <w:rFonts w:ascii="Aptos" w:hAnsi="Aptos" w:eastAsia="Aptos" w:cs="Aptos"/>
           <w:color w:val="23313F"/>
           <w:sz w:val="19"/>
           <w:szCs w:val="22"/>
@@ -210,7 +242,7 @@
       </w:pPr>
       <w:r>
         <w:rPr>
-          <w:rFonts w:ascii="Aptos" w:hAnsi="Aptos" w:eastAsia="Aptos" w:cs="Aptos" w:csTheme="minorBidi"/>
+          <w:rFonts w:ascii="Aptos" w:hAnsi="Aptos" w:eastAsia="Aptos" w:cs="Aptos"/>
           <w:color w:val="23313F"/>
           <w:sz w:val="19"/>
           <w:szCs w:val="22"/>
@@ -226,7 +258,7 @@
       </w:pPr>
       <w:r>
         <w:rPr>
-          <w:rFonts w:ascii="Aptos" w:hAnsi="Aptos" w:eastAsia="Aptos" w:cs="Aptos" w:csTheme="minorBidi"/>
+          <w:rFonts w:ascii="Aptos" w:hAnsi="Aptos" w:eastAsia="Aptos" w:cs="Aptos"/>
           <w:color w:val="23313F"/>
           <w:sz w:val="19"/>
           <w:szCs w:val="22"/>
@@ -242,7 +274,7 @@
       </w:pPr>
       <w:r>
         <w:rPr>
-          <w:rFonts w:ascii="Aptos" w:hAnsi="Aptos" w:eastAsia="Aptos" w:cs="Aptos" w:csTheme="minorBidi"/>
+          <w:rFonts w:ascii="Aptos" w:hAnsi="Aptos" w:eastAsia="Aptos" w:cs="Aptos"/>
           <w:color w:val="23313F"/>
           <w:sz w:val="19"/>
           <w:szCs w:val="22"/>
@@ -258,7 +290,7 @@
       </w:pPr>
       <w:r>
         <w:rPr>
-          <w:rFonts w:ascii="Aptos" w:hAnsi="Aptos" w:eastAsia="Aptos" w:cs="Aptos" w:csTheme="minorBidi"/>
+          <w:rFonts w:ascii="Aptos" w:hAnsi="Aptos" w:eastAsia="Aptos" w:cs="Aptos"/>
           <w:color w:val="23313F"/>
           <w:sz w:val="19"/>
           <w:szCs w:val="22"/>
@@ -274,7 +306,7 @@
       </w:pPr>
       <w:r>
         <w:rPr>
-          <w:rFonts w:ascii="Aptos" w:hAnsi="Aptos" w:eastAsia="Aptos" w:cs="Aptos" w:csTheme="minorBidi"/>
+          <w:rFonts w:ascii="Aptos" w:hAnsi="Aptos" w:eastAsia="Aptos" w:cs="Aptos"/>
           <w:color w:val="23313F"/>
           <w:sz w:val="19"/>
           <w:szCs w:val="22"/>
@@ -290,7 +322,7 @@
       </w:pPr>
       <w:r>
         <w:rPr>
-          <w:rFonts w:ascii="Aptos" w:hAnsi="Aptos" w:eastAsia="Aptos" w:cs="Aptos" w:csTheme="minorBidi"/>
+          <w:rFonts w:ascii="Aptos" w:hAnsi="Aptos" w:eastAsia="Aptos" w:cs="Aptos"/>
           <w:color w:val="23313F"/>
           <w:sz w:val="19"/>
           <w:szCs w:val="22"/>
@@ -306,7 +338,7 @@
       </w:pPr>
       <w:r>
         <w:rPr>
-          <w:rFonts w:ascii="Aptos" w:hAnsi="Aptos" w:eastAsia="Aptos" w:cs="Aptos" w:csTheme="minorBidi"/>
+          <w:rFonts w:ascii="Aptos" w:hAnsi="Aptos" w:eastAsia="Aptos" w:cs="Aptos"/>
           <w:color w:val="23313F"/>
           <w:sz w:val="19"/>
           <w:szCs w:val="22"/>
@@ -322,7 +354,7 @@
       </w:pPr>
       <w:r>
         <w:rPr>
-          <w:rFonts w:ascii="Aptos" w:hAnsi="Aptos" w:eastAsia="Aptos" w:cs="Aptos" w:csTheme="minorBidi"/>
+          <w:rFonts w:ascii="Aptos" w:hAnsi="Aptos" w:eastAsia="Aptos" w:cs="Aptos"/>
           <w:color w:val="23313F"/>
           <w:sz w:val="19"/>
           <w:szCs w:val="22"/>
@@ -338,7 +370,7 @@
       </w:pPr>
       <w:r>
         <w:rPr>
-          <w:rFonts w:ascii="Aptos" w:hAnsi="Aptos" w:eastAsia="Aptos" w:cs="Aptos" w:csTheme="minorBidi"/>
+          <w:rFonts w:ascii="Aptos" w:hAnsi="Aptos" w:eastAsia="Aptos" w:cs="Aptos"/>
           <w:color w:val="23313F"/>
           <w:sz w:val="19"/>
           <w:szCs w:val="22"/>
@@ -354,7 +386,7 @@
       </w:pPr>
       <w:r>
         <w:rPr>
-          <w:rFonts w:ascii="Aptos" w:hAnsi="Aptos" w:eastAsia="Aptos" w:cs="Aptos" w:csTheme="minorBidi"/>
+          <w:rFonts w:ascii="Aptos" w:hAnsi="Aptos" w:eastAsia="Aptos" w:cs="Aptos"/>
           <w:color w:val="23313F"/>
           <w:sz w:val="19"/>
           <w:szCs w:val="22"/>
@@ -396,7 +428,7 @@
             <w:r/>
             <w:r>
               <w:rPr>
-                <w:rFonts w:ascii="Aptos" w:hAnsi="Aptos" w:eastAsia="Aptos" w:cs="Aptos" w:csTheme="minorBidi"/>
+                <w:rFonts w:ascii="Aptos" w:hAnsi="Aptos" w:eastAsia="Aptos" w:cs="Aptos"/>
                 <w:b/>
                 <w:bCs/>
                 <w:color w:val="B86616"/>
@@ -412,7 +444,7 @@
             </w:pPr>
             <w:r>
               <w:rPr>
-                <w:rFonts w:ascii="Aptos" w:hAnsi="Aptos" w:eastAsia="Aptos" w:cs="Aptos" w:csTheme="minorBidi"/>
+                <w:rFonts w:ascii="Aptos" w:hAnsi="Aptos" w:eastAsia="Aptos" w:cs="Aptos"/>
                 <w:color w:val="23313F"/>
                 <w:sz w:val="18"/>
                 <w:szCs w:val="22"/>
@@ -434,7 +466,7 @@
       </w:pPr>
       <w:r>
         <w:rPr>
-          <w:rFonts w:ascii="Aptos Display" w:hAnsi="Aptos Display" w:eastAsia="Aptos Display" w:cs="Aptos Display" w:asciiTheme="majorHAnsi" w:hAnsiTheme="majorHAnsi" w:eastAsiaTheme="majorEastAsia" w:csTheme="majorBidi"/>
+          <w:rFonts w:ascii="Aptos Display" w:hAnsi="Aptos Display" w:eastAsia="Aptos Display" w:cs="Aptos Display" w:asciiTheme="majorHAnsi" w:hAnsiTheme="majorHAnsi" w:eastAsiaTheme="majorEastAsia"/>
           <w:b/>
           <w:bCs/>
           <w:color w:val="17324D"/>
@@ -450,7 +482,7 @@
       </w:pPr>
       <w:r>
         <w:rPr>
-          <w:rFonts w:ascii="Aptos" w:hAnsi="Aptos" w:eastAsia="Aptos" w:cs="Aptos" w:csTheme="minorBidi"/>
+          <w:rFonts w:ascii="Aptos" w:hAnsi="Aptos" w:eastAsia="Aptos" w:cs="Aptos"/>
           <w:color w:val="23313F"/>
           <w:sz w:val="19"/>
           <w:szCs w:val="22"/>
@@ -464,7 +496,7 @@
       </w:pPr>
       <w:r>
         <w:rPr>
-          <w:rFonts w:ascii="Aptos" w:hAnsi="Aptos" w:eastAsia="Aptos" w:cs="Aptos" w:csTheme="minorBidi"/>
+          <w:rFonts w:ascii="Aptos" w:hAnsi="Aptos" w:eastAsia="Aptos" w:cs="Aptos"/>
           <w:color w:val="23313F"/>
           <w:sz w:val="19"/>
           <w:szCs w:val="22"/>
@@ -513,7 +545,7 @@
             <w:r/>
             <w:r>
               <w:rPr>
-                <w:rFonts w:ascii="Aptos" w:hAnsi="Aptos" w:eastAsia="Aptos" w:cs="Aptos" w:csTheme="minorBidi"/>
+                <w:rFonts w:ascii="Aptos" w:hAnsi="Aptos" w:eastAsia="Aptos" w:cs="Aptos"/>
                 <w:b/>
                 <w:bCs/>
                 <w:color w:val="FFFFFF"/>
@@ -543,7 +575,7 @@
             <w:r/>
             <w:r>
               <w:rPr>
-                <w:rFonts w:ascii="Aptos" w:hAnsi="Aptos" w:eastAsia="Aptos" w:cs="Aptos" w:csTheme="minorBidi"/>
+                <w:rFonts w:ascii="Aptos" w:hAnsi="Aptos" w:eastAsia="Aptos" w:cs="Aptos"/>
                 <w:b/>
                 <w:bCs/>
                 <w:color w:val="FFFFFF"/>
@@ -573,7 +605,7 @@
             <w:r/>
             <w:r>
               <w:rPr>
-                <w:rFonts w:ascii="Aptos" w:hAnsi="Aptos" w:eastAsia="Aptos" w:cs="Aptos" w:csTheme="minorBidi"/>
+                <w:rFonts w:ascii="Aptos" w:hAnsi="Aptos" w:eastAsia="Aptos" w:cs="Aptos"/>
                 <w:b/>
                 <w:bCs/>
                 <w:color w:val="FFFFFF"/>
@@ -608,7 +640,7 @@
             <w:r/>
             <w:r>
               <w:rPr>
-                <w:rFonts w:ascii="Aptos" w:hAnsi="Aptos" w:eastAsia="Aptos" w:cs="Aptos" w:csTheme="minorBidi"/>
+                <w:rFonts w:ascii="Aptos" w:hAnsi="Aptos" w:eastAsia="Aptos" w:cs="Aptos"/>
                 <w:color w:val="23313F"/>
                 <w:sz w:val="16"/>
                 <w:szCs w:val="22"/>
@@ -636,7 +668,7 @@
             <w:r/>
             <w:r>
               <w:rPr>
-                <w:rFonts w:ascii="Aptos" w:hAnsi="Aptos" w:eastAsia="Aptos" w:cs="Aptos" w:csTheme="minorBidi"/>
+                <w:rFonts w:ascii="Aptos" w:hAnsi="Aptos" w:eastAsia="Aptos" w:cs="Aptos"/>
                 <w:color w:val="23313F"/>
                 <w:sz w:val="16"/>
                 <w:szCs w:val="22"/>
@@ -664,7 +696,7 @@
             <w:r/>
             <w:r>
               <w:rPr>
-                <w:rFonts w:ascii="Aptos" w:hAnsi="Aptos" w:eastAsia="Aptos" w:cs="Aptos" w:csTheme="minorBidi"/>
+                <w:rFonts w:ascii="Aptos" w:hAnsi="Aptos" w:eastAsia="Aptos" w:cs="Aptos"/>
                 <w:color w:val="23313F"/>
                 <w:sz w:val="16"/>
                 <w:szCs w:val="22"/>
@@ -697,7 +729,7 @@
             <w:r/>
             <w:r>
               <w:rPr>
-                <w:rFonts w:ascii="Aptos" w:hAnsi="Aptos" w:eastAsia="Aptos" w:cs="Aptos" w:csTheme="minorBidi"/>
+                <w:rFonts w:ascii="Aptos" w:hAnsi="Aptos" w:eastAsia="Aptos" w:cs="Aptos"/>
                 <w:color w:val="23313F"/>
                 <w:sz w:val="16"/>
                 <w:szCs w:val="22"/>
@@ -725,7 +757,7 @@
             <w:r/>
             <w:r>
               <w:rPr>
-                <w:rFonts w:ascii="Aptos" w:hAnsi="Aptos" w:eastAsia="Aptos" w:cs="Aptos" w:csTheme="minorBidi"/>
+                <w:rFonts w:ascii="Aptos" w:hAnsi="Aptos" w:eastAsia="Aptos" w:cs="Aptos"/>
                 <w:color w:val="23313F"/>
                 <w:sz w:val="16"/>
                 <w:szCs w:val="22"/>
@@ -753,7 +785,7 @@
             <w:r/>
             <w:r>
               <w:rPr>
-                <w:rFonts w:ascii="Aptos" w:hAnsi="Aptos" w:eastAsia="Aptos" w:cs="Aptos" w:csTheme="minorBidi"/>
+                <w:rFonts w:ascii="Aptos" w:hAnsi="Aptos" w:eastAsia="Aptos" w:cs="Aptos"/>
                 <w:color w:val="23313F"/>
                 <w:sz w:val="16"/>
                 <w:szCs w:val="22"/>
@@ -786,7 +818,7 @@
             <w:r/>
             <w:r>
               <w:rPr>
-                <w:rFonts w:ascii="Aptos" w:hAnsi="Aptos" w:eastAsia="Aptos" w:cs="Aptos" w:csTheme="minorBidi"/>
+                <w:rFonts w:ascii="Aptos" w:hAnsi="Aptos" w:eastAsia="Aptos" w:cs="Aptos"/>
                 <w:color w:val="23313F"/>
                 <w:sz w:val="16"/>
                 <w:szCs w:val="22"/>
@@ -814,7 +846,7 @@
             <w:r/>
             <w:r>
               <w:rPr>
-                <w:rFonts w:ascii="Aptos" w:hAnsi="Aptos" w:eastAsia="Aptos" w:cs="Aptos" w:csTheme="minorBidi"/>
+                <w:rFonts w:ascii="Aptos" w:hAnsi="Aptos" w:eastAsia="Aptos" w:cs="Aptos"/>
                 <w:color w:val="23313F"/>
                 <w:sz w:val="16"/>
                 <w:szCs w:val="22"/>
@@ -842,7 +874,7 @@
             <w:r/>
             <w:r>
               <w:rPr>
-                <w:rFonts w:ascii="Aptos" w:hAnsi="Aptos" w:eastAsia="Aptos" w:cs="Aptos" w:csTheme="minorBidi"/>
+                <w:rFonts w:ascii="Aptos" w:hAnsi="Aptos" w:eastAsia="Aptos" w:cs="Aptos"/>
                 <w:color w:val="23313F"/>
                 <w:sz w:val="16"/>
                 <w:szCs w:val="22"/>
@@ -875,7 +907,7 @@
             <w:r/>
             <w:r>
               <w:rPr>
-                <w:rFonts w:ascii="Aptos" w:hAnsi="Aptos" w:eastAsia="Aptos" w:cs="Aptos" w:csTheme="minorBidi"/>
+                <w:rFonts w:ascii="Aptos" w:hAnsi="Aptos" w:eastAsia="Aptos" w:cs="Aptos"/>
                 <w:color w:val="23313F"/>
                 <w:sz w:val="16"/>
                 <w:szCs w:val="22"/>
@@ -903,7 +935,7 @@
             <w:r/>
             <w:r>
               <w:rPr>
-                <w:rFonts w:ascii="Aptos" w:hAnsi="Aptos" w:eastAsia="Aptos" w:cs="Aptos" w:csTheme="minorBidi"/>
+                <w:rFonts w:ascii="Aptos" w:hAnsi="Aptos" w:eastAsia="Aptos" w:cs="Aptos"/>
                 <w:color w:val="23313F"/>
                 <w:sz w:val="16"/>
                 <w:szCs w:val="22"/>
@@ -931,7 +963,7 @@
             <w:r/>
             <w:r>
               <w:rPr>
-                <w:rFonts w:ascii="Aptos" w:hAnsi="Aptos" w:eastAsia="Aptos" w:cs="Aptos" w:csTheme="minorBidi"/>
+                <w:rFonts w:ascii="Aptos" w:hAnsi="Aptos" w:eastAsia="Aptos" w:cs="Aptos"/>
                 <w:color w:val="23313F"/>
                 <w:sz w:val="16"/>
                 <w:szCs w:val="22"/>
@@ -964,7 +996,7 @@
             <w:r/>
             <w:r>
               <w:rPr>
-                <w:rFonts w:ascii="Aptos" w:hAnsi="Aptos" w:eastAsia="Aptos" w:cs="Aptos" w:csTheme="minorBidi"/>
+                <w:rFonts w:ascii="Aptos" w:hAnsi="Aptos" w:eastAsia="Aptos" w:cs="Aptos"/>
                 <w:color w:val="23313F"/>
                 <w:sz w:val="16"/>
                 <w:szCs w:val="22"/>
@@ -992,7 +1024,7 @@
             <w:r/>
             <w:r>
               <w:rPr>
-                <w:rFonts w:ascii="Aptos" w:hAnsi="Aptos" w:eastAsia="Aptos" w:cs="Aptos" w:csTheme="minorBidi"/>
+                <w:rFonts w:ascii="Aptos" w:hAnsi="Aptos" w:eastAsia="Aptos" w:cs="Aptos"/>
                 <w:color w:val="23313F"/>
                 <w:sz w:val="16"/>
                 <w:szCs w:val="22"/>
@@ -1020,7 +1052,7 @@
             <w:r/>
             <w:r>
               <w:rPr>
-                <w:rFonts w:ascii="Aptos" w:hAnsi="Aptos" w:eastAsia="Aptos" w:cs="Aptos" w:csTheme="minorBidi"/>
+                <w:rFonts w:ascii="Aptos" w:hAnsi="Aptos" w:eastAsia="Aptos" w:cs="Aptos"/>
                 <w:color w:val="23313F"/>
                 <w:sz w:val="16"/>
                 <w:szCs w:val="22"/>
@@ -1053,7 +1085,7 @@
             <w:r/>
             <w:r>
               <w:rPr>
-                <w:rFonts w:ascii="Aptos" w:hAnsi="Aptos" w:eastAsia="Aptos" w:cs="Aptos" w:csTheme="minorBidi"/>
+                <w:rFonts w:ascii="Aptos" w:hAnsi="Aptos" w:eastAsia="Aptos" w:cs="Aptos"/>
                 <w:color w:val="23313F"/>
                 <w:sz w:val="16"/>
                 <w:szCs w:val="22"/>
@@ -1081,7 +1113,7 @@
             <w:r/>
             <w:r>
               <w:rPr>
-                <w:rFonts w:ascii="Aptos" w:hAnsi="Aptos" w:eastAsia="Aptos" w:cs="Aptos" w:csTheme="minorBidi"/>
+                <w:rFonts w:ascii="Aptos" w:hAnsi="Aptos" w:eastAsia="Aptos" w:cs="Aptos"/>
                 <w:color w:val="23313F"/>
                 <w:sz w:val="16"/>
                 <w:szCs w:val="22"/>
@@ -1109,7 +1141,7 @@
             <w:r/>
             <w:r>
               <w:rPr>
-                <w:rFonts w:ascii="Aptos" w:hAnsi="Aptos" w:eastAsia="Aptos" w:cs="Aptos" w:csTheme="minorBidi"/>
+                <w:rFonts w:ascii="Aptos" w:hAnsi="Aptos" w:eastAsia="Aptos" w:cs="Aptos"/>
                 <w:color w:val="23313F"/>
                 <w:sz w:val="16"/>
                 <w:szCs w:val="22"/>
@@ -1142,7 +1174,7 @@
             <w:r/>
             <w:r>
               <w:rPr>
-                <w:rFonts w:ascii="Aptos" w:hAnsi="Aptos" w:eastAsia="Aptos" w:cs="Aptos" w:csTheme="minorBidi"/>
+                <w:rFonts w:ascii="Aptos" w:hAnsi="Aptos" w:eastAsia="Aptos" w:cs="Aptos"/>
                 <w:color w:val="23313F"/>
                 <w:sz w:val="16"/>
                 <w:szCs w:val="22"/>
@@ -1170,7 +1202,7 @@
             <w:r/>
             <w:r>
               <w:rPr>
-                <w:rFonts w:ascii="Aptos" w:hAnsi="Aptos" w:eastAsia="Aptos" w:cs="Aptos" w:csTheme="minorBidi"/>
+                <w:rFonts w:ascii="Aptos" w:hAnsi="Aptos" w:eastAsia="Aptos" w:cs="Aptos"/>
                 <w:color w:val="23313F"/>
                 <w:sz w:val="16"/>
                 <w:szCs w:val="22"/>
@@ -1198,7 +1230,7 @@
             <w:r/>
             <w:r>
               <w:rPr>
-                <w:rFonts w:ascii="Aptos" w:hAnsi="Aptos" w:eastAsia="Aptos" w:cs="Aptos" w:csTheme="minorBidi"/>
+                <w:rFonts w:ascii="Aptos" w:hAnsi="Aptos" w:eastAsia="Aptos" w:cs="Aptos"/>
                 <w:color w:val="23313F"/>
                 <w:sz w:val="16"/>
                 <w:szCs w:val="22"/>
@@ -1231,7 +1263,7 @@
             <w:r/>
             <w:r>
               <w:rPr>
-                <w:rFonts w:ascii="Aptos" w:hAnsi="Aptos" w:eastAsia="Aptos" w:cs="Aptos" w:csTheme="minorBidi"/>
+                <w:rFonts w:ascii="Aptos" w:hAnsi="Aptos" w:eastAsia="Aptos" w:cs="Aptos"/>
                 <w:color w:val="23313F"/>
                 <w:sz w:val="16"/>
                 <w:szCs w:val="22"/>
@@ -1259,7 +1291,7 @@
             <w:r/>
             <w:r>
               <w:rPr>
-                <w:rFonts w:ascii="Aptos" w:hAnsi="Aptos" w:eastAsia="Aptos" w:cs="Aptos" w:csTheme="minorBidi"/>
+                <w:rFonts w:ascii="Aptos" w:hAnsi="Aptos" w:eastAsia="Aptos" w:cs="Aptos"/>
                 <w:color w:val="23313F"/>
                 <w:sz w:val="16"/>
                 <w:szCs w:val="22"/>
@@ -1287,7 +1319,7 @@
             <w:r/>
             <w:r>
               <w:rPr>
-                <w:rFonts w:ascii="Aptos" w:hAnsi="Aptos" w:eastAsia="Aptos" w:cs="Aptos" w:csTheme="minorBidi"/>
+                <w:rFonts w:ascii="Aptos" w:hAnsi="Aptos" w:eastAsia="Aptos" w:cs="Aptos"/>
                 <w:color w:val="23313F"/>
                 <w:sz w:val="16"/>
                 <w:szCs w:val="22"/>
@@ -1320,7 +1352,7 @@
             <w:r/>
             <w:r>
               <w:rPr>
-                <w:rFonts w:ascii="Aptos" w:hAnsi="Aptos" w:eastAsia="Aptos" w:cs="Aptos" w:csTheme="minorBidi"/>
+                <w:rFonts w:ascii="Aptos" w:hAnsi="Aptos" w:eastAsia="Aptos" w:cs="Aptos"/>
                 <w:color w:val="23313F"/>
                 <w:sz w:val="16"/>
                 <w:szCs w:val="22"/>
@@ -1348,7 +1380,7 @@
             <w:r/>
             <w:r>
               <w:rPr>
-                <w:rFonts w:ascii="Aptos" w:hAnsi="Aptos" w:eastAsia="Aptos" w:cs="Aptos" w:csTheme="minorBidi"/>
+                <w:rFonts w:ascii="Aptos" w:hAnsi="Aptos" w:eastAsia="Aptos" w:cs="Aptos"/>
                 <w:color w:val="23313F"/>
                 <w:sz w:val="16"/>
                 <w:szCs w:val="22"/>
@@ -1376,7 +1408,7 @@
             <w:r/>
             <w:r>
               <w:rPr>
-                <w:rFonts w:ascii="Aptos" w:hAnsi="Aptos" w:eastAsia="Aptos" w:cs="Aptos" w:csTheme="minorBidi"/>
+                <w:rFonts w:ascii="Aptos" w:hAnsi="Aptos" w:eastAsia="Aptos" w:cs="Aptos"/>
                 <w:color w:val="23313F"/>
                 <w:sz w:val="16"/>
                 <w:szCs w:val="22"/>
@@ -1426,7 +1458,7 @@
             <w:r/>
             <w:r>
               <w:rPr>
-                <w:rFonts w:ascii="Aptos" w:hAnsi="Aptos" w:eastAsia="Aptos" w:cs="Aptos" w:csTheme="minorBidi"/>
+                <w:rFonts w:ascii="Aptos" w:hAnsi="Aptos" w:eastAsia="Aptos" w:cs="Aptos"/>
                 <w:b/>
                 <w:bCs/>
                 <w:color w:val="17324D"/>
@@ -1442,7 +1474,7 @@
             </w:pPr>
             <w:r>
               <w:rPr>
-                <w:rFonts w:ascii="Aptos" w:hAnsi="Aptos" w:eastAsia="Aptos" w:cs="Aptos" w:csTheme="minorBidi"/>
+                <w:rFonts w:ascii="Aptos" w:hAnsi="Aptos" w:eastAsia="Aptos" w:cs="Aptos"/>
                 <w:color w:val="23313F"/>
                 <w:sz w:val="18"/>
                 <w:szCs w:val="22"/>
@@ -1464,7 +1496,7 @@
       </w:pPr>
       <w:r>
         <w:rPr>
-          <w:rFonts w:ascii="Aptos Display" w:hAnsi="Aptos Display" w:eastAsia="Aptos Display" w:cs="Aptos Display" w:asciiTheme="majorHAnsi" w:hAnsiTheme="majorHAnsi" w:eastAsiaTheme="majorEastAsia" w:csTheme="majorBidi"/>
+          <w:rFonts w:ascii="Aptos Display" w:hAnsi="Aptos Display" w:eastAsia="Aptos Display" w:cs="Aptos Display" w:asciiTheme="majorHAnsi" w:hAnsiTheme="majorHAnsi" w:eastAsiaTheme="majorEastAsia"/>
           <w:b/>
           <w:bCs/>
           <w:color w:val="17324D"/>
@@ -1480,7 +1512,7 @@
       </w:pPr>
       <w:r>
         <w:rPr>
-          <w:rFonts w:ascii="Aptos" w:hAnsi="Aptos" w:eastAsia="Aptos" w:cs="Aptos" w:csTheme="minorBidi"/>
+          <w:rFonts w:ascii="Aptos" w:hAnsi="Aptos" w:eastAsia="Aptos" w:cs="Aptos"/>
           <w:color w:val="23313F"/>
           <w:sz w:val="19"/>
           <w:szCs w:val="22"/>
@@ -1494,7 +1526,7 @@
       </w:pPr>
       <w:r>
         <w:rPr>
-          <w:rFonts w:ascii="Aptos" w:hAnsi="Aptos" w:eastAsia="Aptos" w:cs="Aptos" w:asciiTheme="majorHAnsi" w:hAnsiTheme="majorHAnsi" w:eastAsiaTheme="majorEastAsia" w:csTheme="majorBidi"/>
+          <w:rFonts w:ascii="Aptos" w:hAnsi="Aptos" w:eastAsia="Aptos" w:cs="Aptos" w:asciiTheme="majorHAnsi" w:hAnsiTheme="majorHAnsi" w:eastAsiaTheme="majorEastAsia"/>
           <w:b/>
           <w:bCs/>
           <w:color w:val="176B87"/>
@@ -1545,7 +1577,7 @@
             <w:r/>
             <w:r>
               <w:rPr>
-                <w:rFonts w:ascii="Aptos" w:hAnsi="Aptos" w:eastAsia="Aptos" w:cs="Aptos" w:csTheme="minorBidi"/>
+                <w:rFonts w:ascii="Aptos" w:hAnsi="Aptos" w:eastAsia="Aptos" w:cs="Aptos"/>
                 <w:b/>
                 <w:bCs/>
                 <w:color w:val="FFFFFF"/>
@@ -1575,7 +1607,7 @@
             <w:r/>
             <w:r>
               <w:rPr>
-                <w:rFonts w:ascii="Aptos" w:hAnsi="Aptos" w:eastAsia="Aptos" w:cs="Aptos" w:csTheme="minorBidi"/>
+                <w:rFonts w:ascii="Aptos" w:hAnsi="Aptos" w:eastAsia="Aptos" w:cs="Aptos"/>
                 <w:b/>
                 <w:bCs/>
                 <w:color w:val="FFFFFF"/>
@@ -1605,7 +1637,7 @@
             <w:r/>
             <w:r>
               <w:rPr>
-                <w:rFonts w:ascii="Aptos" w:hAnsi="Aptos" w:eastAsia="Aptos" w:cs="Aptos" w:csTheme="minorBidi"/>
+                <w:rFonts w:ascii="Aptos" w:hAnsi="Aptos" w:eastAsia="Aptos" w:cs="Aptos"/>
                 <w:b/>
                 <w:bCs/>
                 <w:color w:val="FFFFFF"/>
@@ -1640,7 +1672,7 @@
             <w:r/>
             <w:r>
               <w:rPr>
-                <w:rFonts w:ascii="Aptos" w:hAnsi="Aptos" w:eastAsia="Aptos" w:cs="Aptos" w:csTheme="minorBidi"/>
+                <w:rFonts w:ascii="Aptos" w:hAnsi="Aptos" w:eastAsia="Aptos" w:cs="Aptos"/>
                 <w:color w:val="23313F"/>
                 <w:sz w:val="16"/>
                 <w:szCs w:val="22"/>
@@ -1668,7 +1700,7 @@
             <w:r/>
             <w:r>
               <w:rPr>
-                <w:rFonts w:ascii="Aptos" w:hAnsi="Aptos" w:eastAsia="Aptos" w:cs="Aptos" w:csTheme="minorBidi"/>
+                <w:rFonts w:ascii="Aptos" w:hAnsi="Aptos" w:eastAsia="Aptos" w:cs="Aptos"/>
                 <w:color w:val="23313F"/>
                 <w:sz w:val="16"/>
                 <w:szCs w:val="22"/>
@@ -1696,7 +1728,7 @@
             <w:r/>
             <w:r>
               <w:rPr>
-                <w:rFonts w:ascii="Aptos" w:hAnsi="Aptos" w:eastAsia="Aptos" w:cs="Aptos" w:csTheme="minorBidi"/>
+                <w:rFonts w:ascii="Aptos" w:hAnsi="Aptos" w:eastAsia="Aptos" w:cs="Aptos"/>
                 <w:color w:val="23313F"/>
                 <w:sz w:val="16"/>
                 <w:szCs w:val="22"/>
@@ -1729,7 +1761,7 @@
             <w:r/>
             <w:r>
               <w:rPr>
-                <w:rFonts w:ascii="Aptos" w:hAnsi="Aptos" w:eastAsia="Aptos" w:cs="Aptos" w:csTheme="minorBidi"/>
+                <w:rFonts w:ascii="Aptos" w:hAnsi="Aptos" w:eastAsia="Aptos" w:cs="Aptos"/>
                 <w:color w:val="23313F"/>
                 <w:sz w:val="16"/>
                 <w:szCs w:val="22"/>
@@ -1757,7 +1789,7 @@
             <w:r/>
             <w:r>
               <w:rPr>
-                <w:rFonts w:ascii="Aptos" w:hAnsi="Aptos" w:eastAsia="Aptos" w:cs="Aptos" w:csTheme="minorBidi"/>
+                <w:rFonts w:ascii="Aptos" w:hAnsi="Aptos" w:eastAsia="Aptos" w:cs="Aptos"/>
                 <w:color w:val="23313F"/>
                 <w:sz w:val="16"/>
                 <w:szCs w:val="22"/>
@@ -1785,7 +1817,7 @@
             <w:r/>
             <w:r>
               <w:rPr>
-                <w:rFonts w:ascii="Aptos" w:hAnsi="Aptos" w:eastAsia="Aptos" w:cs="Aptos" w:csTheme="minorBidi"/>
+                <w:rFonts w:ascii="Aptos" w:hAnsi="Aptos" w:eastAsia="Aptos" w:cs="Aptos"/>
                 <w:color w:val="23313F"/>
                 <w:sz w:val="16"/>
                 <w:szCs w:val="22"/>
@@ -1818,7 +1850,7 @@
             <w:r/>
             <w:r>
               <w:rPr>
-                <w:rFonts w:ascii="Aptos" w:hAnsi="Aptos" w:eastAsia="Aptos" w:cs="Aptos" w:csTheme="minorBidi"/>
+                <w:rFonts w:ascii="Aptos" w:hAnsi="Aptos" w:eastAsia="Aptos" w:cs="Aptos"/>
                 <w:color w:val="23313F"/>
                 <w:sz w:val="16"/>
                 <w:szCs w:val="22"/>
@@ -1846,7 +1878,7 @@
             <w:r/>
             <w:r>
               <w:rPr>
-                <w:rFonts w:ascii="Aptos" w:hAnsi="Aptos" w:eastAsia="Aptos" w:cs="Aptos" w:csTheme="minorBidi"/>
+                <w:rFonts w:ascii="Aptos" w:hAnsi="Aptos" w:eastAsia="Aptos" w:cs="Aptos"/>
                 <w:color w:val="23313F"/>
                 <w:sz w:val="16"/>
                 <w:szCs w:val="22"/>
@@ -1874,7 +1906,7 @@
             <w:r/>
             <w:r>
               <w:rPr>
-                <w:rFonts w:ascii="Aptos" w:hAnsi="Aptos" w:eastAsia="Aptos" w:cs="Aptos" w:csTheme="minorBidi"/>
+                <w:rFonts w:ascii="Aptos" w:hAnsi="Aptos" w:eastAsia="Aptos" w:cs="Aptos"/>
                 <w:color w:val="23313F"/>
                 <w:sz w:val="16"/>
                 <w:szCs w:val="22"/>
@@ -1907,7 +1939,7 @@
             <w:r/>
             <w:r>
               <w:rPr>
-                <w:rFonts w:ascii="Aptos" w:hAnsi="Aptos" w:eastAsia="Aptos" w:cs="Aptos" w:csTheme="minorBidi"/>
+                <w:rFonts w:ascii="Aptos" w:hAnsi="Aptos" w:eastAsia="Aptos" w:cs="Aptos"/>
                 <w:color w:val="23313F"/>
                 <w:sz w:val="16"/>
                 <w:szCs w:val="22"/>
@@ -1935,7 +1967,7 @@
             <w:r/>
             <w:r>
               <w:rPr>
-                <w:rFonts w:ascii="Aptos" w:hAnsi="Aptos" w:eastAsia="Aptos" w:cs="Aptos" w:csTheme="minorBidi"/>
+                <w:rFonts w:ascii="Aptos" w:hAnsi="Aptos" w:eastAsia="Aptos" w:cs="Aptos"/>
                 <w:color w:val="23313F"/>
                 <w:sz w:val="16"/>
                 <w:szCs w:val="22"/>
@@ -1963,7 +1995,7 @@
             <w:r/>
             <w:r>
               <w:rPr>
-                <w:rFonts w:ascii="Aptos" w:hAnsi="Aptos" w:eastAsia="Aptos" w:cs="Aptos" w:csTheme="minorBidi"/>
+                <w:rFonts w:ascii="Aptos" w:hAnsi="Aptos" w:eastAsia="Aptos" w:cs="Aptos"/>
                 <w:color w:val="23313F"/>
                 <w:sz w:val="16"/>
                 <w:szCs w:val="22"/>
@@ -1996,7 +2028,7 @@
             <w:r/>
             <w:r>
               <w:rPr>
-                <w:rFonts w:ascii="Aptos" w:hAnsi="Aptos" w:eastAsia="Aptos" w:cs="Aptos" w:csTheme="minorBidi"/>
+                <w:rFonts w:ascii="Aptos" w:hAnsi="Aptos" w:eastAsia="Aptos" w:cs="Aptos"/>
                 <w:color w:val="23313F"/>
                 <w:sz w:val="16"/>
                 <w:szCs w:val="22"/>
@@ -2024,7 +2056,7 @@
             <w:r/>
             <w:r>
               <w:rPr>
-                <w:rFonts w:ascii="Aptos" w:hAnsi="Aptos" w:eastAsia="Aptos" w:cs="Aptos" w:csTheme="minorBidi"/>
+                <w:rFonts w:ascii="Aptos" w:hAnsi="Aptos" w:eastAsia="Aptos" w:cs="Aptos"/>
                 <w:color w:val="23313F"/>
                 <w:sz w:val="16"/>
                 <w:szCs w:val="22"/>
@@ -2052,7 +2084,7 @@
             <w:r/>
             <w:r>
               <w:rPr>
-                <w:rFonts w:ascii="Aptos" w:hAnsi="Aptos" w:eastAsia="Aptos" w:cs="Aptos" w:csTheme="minorBidi"/>
+                <w:rFonts w:ascii="Aptos" w:hAnsi="Aptos" w:eastAsia="Aptos" w:cs="Aptos"/>
                 <w:color w:val="23313F"/>
                 <w:sz w:val="16"/>
                 <w:szCs w:val="22"/>
@@ -2074,7 +2106,7 @@
       </w:pPr>
       <w:r>
         <w:rPr>
-          <w:rFonts w:ascii="Aptos" w:hAnsi="Aptos" w:eastAsia="Aptos" w:cs="Aptos" w:asciiTheme="majorHAnsi" w:hAnsiTheme="majorHAnsi" w:eastAsiaTheme="majorEastAsia" w:csTheme="majorBidi"/>
+          <w:rFonts w:ascii="Aptos" w:hAnsi="Aptos" w:eastAsia="Aptos" w:cs="Aptos" w:asciiTheme="majorHAnsi" w:hAnsiTheme="majorHAnsi" w:eastAsiaTheme="majorEastAsia"/>
           <w:b/>
           <w:bCs/>
           <w:color w:val="176B87"/>
@@ -2091,7 +2123,7 @@
       </w:pPr>
       <w:r>
         <w:rPr>
-          <w:rFonts w:ascii="Aptos" w:hAnsi="Aptos" w:eastAsia="Aptos" w:cs="Aptos" w:csTheme="minorBidi"/>
+          <w:rFonts w:ascii="Aptos" w:hAnsi="Aptos" w:eastAsia="Aptos" w:cs="Aptos"/>
           <w:color w:val="23313F"/>
           <w:sz w:val="19"/>
           <w:szCs w:val="22"/>
@@ -2106,7 +2138,7 @@
       </w:pPr>
       <w:r>
         <w:rPr>
-          <w:rFonts w:ascii="Aptos" w:hAnsi="Aptos" w:eastAsia="Aptos" w:cs="Aptos" w:csTheme="minorBidi"/>
+          <w:rFonts w:ascii="Aptos" w:hAnsi="Aptos" w:eastAsia="Aptos" w:cs="Aptos"/>
           <w:color w:val="23313F"/>
           <w:sz w:val="19"/>
           <w:szCs w:val="22"/>
@@ -2121,7 +2153,7 @@
       </w:pPr>
       <w:r>
         <w:rPr>
-          <w:rFonts w:ascii="Aptos" w:hAnsi="Aptos" w:eastAsia="Aptos" w:cs="Aptos" w:csTheme="minorBidi"/>
+          <w:rFonts w:ascii="Aptos" w:hAnsi="Aptos" w:eastAsia="Aptos" w:cs="Aptos"/>
           <w:color w:val="23313F"/>
           <w:sz w:val="19"/>
           <w:szCs w:val="22"/>
@@ -2136,7 +2168,7 @@
       </w:pPr>
       <w:r>
         <w:rPr>
-          <w:rFonts w:ascii="Aptos" w:hAnsi="Aptos" w:eastAsia="Aptos" w:cs="Aptos" w:csTheme="minorBidi"/>
+          <w:rFonts w:ascii="Aptos" w:hAnsi="Aptos" w:eastAsia="Aptos" w:cs="Aptos"/>
           <w:color w:val="23313F"/>
           <w:sz w:val="19"/>
           <w:szCs w:val="22"/>
@@ -2151,7 +2183,7 @@
       </w:pPr>
       <w:r>
         <w:rPr>
-          <w:rFonts w:ascii="Aptos" w:hAnsi="Aptos" w:eastAsia="Aptos" w:cs="Aptos" w:csTheme="minorBidi"/>
+          <w:rFonts w:ascii="Aptos" w:hAnsi="Aptos" w:eastAsia="Aptos" w:cs="Aptos"/>
           <w:color w:val="23313F"/>
           <w:sz w:val="19"/>
           <w:szCs w:val="22"/>
@@ -2166,7 +2198,7 @@
       </w:pPr>
       <w:r>
         <w:rPr>
-          <w:rFonts w:ascii="Aptos" w:hAnsi="Aptos" w:eastAsia="Aptos" w:cs="Aptos" w:csTheme="minorBidi"/>
+          <w:rFonts w:ascii="Aptos" w:hAnsi="Aptos" w:eastAsia="Aptos" w:cs="Aptos"/>
           <w:color w:val="23313F"/>
           <w:sz w:val="19"/>
           <w:szCs w:val="22"/>
@@ -2181,7 +2213,7 @@
       </w:pPr>
       <w:r>
         <w:rPr>
-          <w:rFonts w:ascii="Aptos" w:hAnsi="Aptos" w:eastAsia="Aptos" w:cs="Aptos" w:csTheme="minorBidi"/>
+          <w:rFonts w:ascii="Aptos" w:hAnsi="Aptos" w:eastAsia="Aptos" w:cs="Aptos"/>
           <w:color w:val="23313F"/>
           <w:sz w:val="19"/>
           <w:szCs w:val="22"/>
@@ -2223,7 +2255,7 @@
             <w:r/>
             <w:r>
               <w:rPr>
-                <w:rFonts w:ascii="Aptos" w:hAnsi="Aptos" w:eastAsia="Aptos" w:cs="Aptos" w:csTheme="minorBidi"/>
+                <w:rFonts w:ascii="Aptos" w:hAnsi="Aptos" w:eastAsia="Aptos" w:cs="Aptos"/>
                 <w:b/>
                 <w:bCs/>
                 <w:color w:val="B86616"/>
@@ -2239,7 +2271,7 @@
             </w:pPr>
             <w:r>
               <w:rPr>
-                <w:rFonts w:ascii="Aptos" w:hAnsi="Aptos" w:eastAsia="Aptos" w:cs="Aptos" w:csTheme="minorBidi"/>
+                <w:rFonts w:ascii="Aptos" w:hAnsi="Aptos" w:eastAsia="Aptos" w:cs="Aptos"/>
                 <w:color w:val="23313F"/>
                 <w:sz w:val="18"/>
                 <w:szCs w:val="22"/>
@@ -2261,7 +2293,7 @@
       </w:pPr>
       <w:r>
         <w:rPr>
-          <w:rFonts w:ascii="Aptos" w:hAnsi="Aptos" w:eastAsia="Aptos" w:cs="Aptos" w:asciiTheme="majorHAnsi" w:hAnsiTheme="majorHAnsi" w:eastAsiaTheme="majorEastAsia" w:csTheme="majorBidi"/>
+          <w:rFonts w:ascii="Aptos" w:hAnsi="Aptos" w:eastAsia="Aptos" w:cs="Aptos" w:asciiTheme="majorHAnsi" w:hAnsiTheme="majorHAnsi" w:eastAsiaTheme="majorEastAsia"/>
           <w:b/>
           <w:bCs/>
           <w:color w:val="176B87"/>
@@ -2277,7 +2309,7 @@
       </w:pPr>
       <w:r>
         <w:rPr>
-          <w:rFonts w:ascii="Aptos" w:hAnsi="Aptos" w:eastAsia="Aptos" w:cs="Aptos" w:csTheme="minorBidi"/>
+          <w:rFonts w:ascii="Aptos" w:hAnsi="Aptos" w:eastAsia="Aptos" w:cs="Aptos"/>
           <w:color w:val="23313F"/>
           <w:sz w:val="19"/>
           <w:szCs w:val="22"/>
@@ -2293,7 +2325,7 @@
       </w:pPr>
       <w:r>
         <w:rPr>
-          <w:rFonts w:ascii="Aptos" w:hAnsi="Aptos" w:eastAsia="Aptos" w:cs="Aptos" w:csTheme="minorBidi"/>
+          <w:rFonts w:ascii="Aptos" w:hAnsi="Aptos" w:eastAsia="Aptos" w:cs="Aptos"/>
           <w:color w:val="23313F"/>
           <w:sz w:val="19"/>
           <w:szCs w:val="22"/>
@@ -2309,7 +2341,7 @@
       </w:pPr>
       <w:r>
         <w:rPr>
-          <w:rFonts w:ascii="Aptos" w:hAnsi="Aptos" w:eastAsia="Aptos" w:cs="Aptos" w:csTheme="minorBidi"/>
+          <w:rFonts w:ascii="Aptos" w:hAnsi="Aptos" w:eastAsia="Aptos" w:cs="Aptos"/>
           <w:color w:val="23313F"/>
           <w:sz w:val="19"/>
           <w:szCs w:val="22"/>
@@ -2325,7 +2357,7 @@
       </w:pPr>
       <w:r>
         <w:rPr>
-          <w:rFonts w:ascii="Aptos" w:hAnsi="Aptos" w:eastAsia="Aptos" w:cs="Aptos" w:csTheme="minorBidi"/>
+          <w:rFonts w:ascii="Aptos" w:hAnsi="Aptos" w:eastAsia="Aptos" w:cs="Aptos"/>
           <w:color w:val="23313F"/>
           <w:sz w:val="19"/>
           <w:szCs w:val="22"/>
@@ -2341,7 +2373,7 @@
       </w:pPr>
       <w:r>
         <w:rPr>
-          <w:rFonts w:ascii="Aptos" w:hAnsi="Aptos" w:eastAsia="Aptos" w:cs="Aptos" w:csTheme="minorBidi"/>
+          <w:rFonts w:ascii="Aptos" w:hAnsi="Aptos" w:eastAsia="Aptos" w:cs="Aptos"/>
           <w:color w:val="23313F"/>
           <w:sz w:val="19"/>
           <w:szCs w:val="22"/>
@@ -2355,7 +2387,7 @@
       </w:pPr>
       <w:r>
         <w:rPr>
-          <w:rFonts w:ascii="Aptos Display" w:hAnsi="Aptos Display" w:eastAsia="Aptos Display" w:cs="Aptos Display" w:asciiTheme="majorHAnsi" w:hAnsiTheme="majorHAnsi" w:eastAsiaTheme="majorEastAsia" w:csTheme="majorBidi"/>
+          <w:rFonts w:ascii="Aptos Display" w:hAnsi="Aptos Display" w:eastAsia="Aptos Display" w:cs="Aptos Display" w:asciiTheme="majorHAnsi" w:hAnsiTheme="majorHAnsi" w:eastAsiaTheme="majorEastAsia"/>
           <w:b/>
           <w:bCs/>
           <w:color w:val="17324D"/>
@@ -2371,7 +2403,7 @@
       </w:pPr>
       <w:r>
         <w:rPr>
-          <w:rFonts w:ascii="Aptos" w:hAnsi="Aptos" w:eastAsia="Aptos" w:cs="Aptos" w:asciiTheme="majorHAnsi" w:hAnsiTheme="majorHAnsi" w:eastAsiaTheme="majorEastAsia" w:csTheme="majorBidi"/>
+          <w:rFonts w:ascii="Aptos" w:hAnsi="Aptos" w:eastAsia="Aptos" w:cs="Aptos" w:asciiTheme="majorHAnsi" w:hAnsiTheme="majorHAnsi" w:eastAsiaTheme="majorEastAsia"/>
           <w:b/>
           <w:bCs/>
           <w:color w:val="176B87"/>
@@ -2388,7 +2420,7 @@
       </w:pPr>
       <w:r>
         <w:rPr>
-          <w:rFonts w:ascii="Aptos" w:hAnsi="Aptos" w:eastAsia="Aptos" w:cs="Aptos" w:csTheme="minorBidi"/>
+          <w:rFonts w:ascii="Aptos" w:hAnsi="Aptos" w:eastAsia="Aptos" w:cs="Aptos"/>
           <w:color w:val="23313F"/>
           <w:sz w:val="19"/>
           <w:szCs w:val="22"/>
@@ -2403,7 +2435,7 @@
       </w:pPr>
       <w:r>
         <w:rPr>
-          <w:rFonts w:ascii="Aptos" w:hAnsi="Aptos" w:eastAsia="Aptos" w:cs="Aptos" w:csTheme="minorBidi"/>
+          <w:rFonts w:ascii="Aptos" w:hAnsi="Aptos" w:eastAsia="Aptos" w:cs="Aptos"/>
           <w:color w:val="23313F"/>
           <w:sz w:val="19"/>
           <w:szCs w:val="22"/>
@@ -2418,7 +2450,7 @@
       </w:pPr>
       <w:r>
         <w:rPr>
-          <w:rFonts w:ascii="Aptos" w:hAnsi="Aptos" w:eastAsia="Aptos" w:cs="Aptos" w:csTheme="minorBidi"/>
+          <w:rFonts w:ascii="Aptos" w:hAnsi="Aptos" w:eastAsia="Aptos" w:cs="Aptos"/>
           <w:color w:val="23313F"/>
           <w:sz w:val="19"/>
           <w:szCs w:val="22"/>
@@ -2433,7 +2465,7 @@
       </w:pPr>
       <w:r>
         <w:rPr>
-          <w:rFonts w:ascii="Aptos" w:hAnsi="Aptos" w:eastAsia="Aptos" w:cs="Aptos" w:csTheme="minorBidi"/>
+          <w:rFonts w:ascii="Aptos" w:hAnsi="Aptos" w:eastAsia="Aptos" w:cs="Aptos"/>
           <w:color w:val="23313F"/>
           <w:sz w:val="19"/>
           <w:szCs w:val="22"/>
@@ -2448,7 +2480,7 @@
       </w:pPr>
       <w:r>
         <w:rPr>
-          <w:rFonts w:ascii="Aptos" w:hAnsi="Aptos" w:eastAsia="Aptos" w:cs="Aptos" w:csTheme="minorBidi"/>
+          <w:rFonts w:ascii="Aptos" w:hAnsi="Aptos" w:eastAsia="Aptos" w:cs="Aptos"/>
           <w:color w:val="23313F"/>
           <w:sz w:val="19"/>
           <w:szCs w:val="22"/>
@@ -2463,7 +2495,7 @@
       </w:pPr>
       <w:r>
         <w:rPr>
-          <w:rFonts w:ascii="Aptos" w:hAnsi="Aptos" w:eastAsia="Aptos" w:cs="Aptos" w:csTheme="minorBidi"/>
+          <w:rFonts w:ascii="Aptos" w:hAnsi="Aptos" w:eastAsia="Aptos" w:cs="Aptos"/>
           <w:color w:val="23313F"/>
           <w:sz w:val="19"/>
           <w:szCs w:val="22"/>
@@ -2477,7 +2509,7 @@
       </w:pPr>
       <w:r>
         <w:rPr>
-          <w:rFonts w:ascii="Aptos" w:hAnsi="Aptos" w:eastAsia="Aptos" w:cs="Aptos" w:asciiTheme="majorHAnsi" w:hAnsiTheme="majorHAnsi" w:eastAsiaTheme="majorEastAsia" w:csTheme="majorBidi"/>
+          <w:rFonts w:ascii="Aptos" w:hAnsi="Aptos" w:eastAsia="Aptos" w:cs="Aptos" w:asciiTheme="majorHAnsi" w:hAnsiTheme="majorHAnsi" w:eastAsiaTheme="majorEastAsia"/>
           <w:b/>
           <w:bCs/>
           <w:color w:val="176B87"/>
@@ -2527,7 +2559,7 @@
             <w:r/>
             <w:r>
               <w:rPr>
-                <w:rFonts w:ascii="Aptos" w:hAnsi="Aptos" w:eastAsia="Aptos" w:cs="Aptos" w:csTheme="minorBidi"/>
+                <w:rFonts w:ascii="Aptos" w:hAnsi="Aptos" w:eastAsia="Aptos" w:cs="Aptos"/>
                 <w:b/>
                 <w:bCs/>
                 <w:color w:val="FFFFFF"/>
@@ -2557,7 +2589,7 @@
             <w:r/>
             <w:r>
               <w:rPr>
-                <w:rFonts w:ascii="Aptos" w:hAnsi="Aptos" w:eastAsia="Aptos" w:cs="Aptos" w:csTheme="minorBidi"/>
+                <w:rFonts w:ascii="Aptos" w:hAnsi="Aptos" w:eastAsia="Aptos" w:cs="Aptos"/>
                 <w:b/>
                 <w:bCs/>
                 <w:color w:val="FFFFFF"/>
@@ -2592,7 +2624,7 @@
             <w:r/>
             <w:r>
               <w:rPr>
-                <w:rFonts w:ascii="Aptos" w:hAnsi="Aptos" w:eastAsia="Aptos" w:cs="Aptos" w:csTheme="minorBidi"/>
+                <w:rFonts w:ascii="Aptos" w:hAnsi="Aptos" w:eastAsia="Aptos" w:cs="Aptos"/>
                 <w:color w:val="23313F"/>
                 <w:sz w:val="16"/>
                 <w:szCs w:val="22"/>
@@ -2620,7 +2652,7 @@
             <w:r/>
             <w:r>
               <w:rPr>
-                <w:rFonts w:ascii="Aptos" w:hAnsi="Aptos" w:eastAsia="Aptos" w:cs="Aptos" w:csTheme="minorBidi"/>
+                <w:rFonts w:ascii="Aptos" w:hAnsi="Aptos" w:eastAsia="Aptos" w:cs="Aptos"/>
                 <w:color w:val="23313F"/>
                 <w:sz w:val="16"/>
                 <w:szCs w:val="22"/>
@@ -2653,7 +2685,7 @@
             <w:r/>
             <w:r>
               <w:rPr>
-                <w:rFonts w:ascii="Aptos" w:hAnsi="Aptos" w:eastAsia="Aptos" w:cs="Aptos" w:csTheme="minorBidi"/>
+                <w:rFonts w:ascii="Aptos" w:hAnsi="Aptos" w:eastAsia="Aptos" w:cs="Aptos"/>
                 <w:color w:val="23313F"/>
                 <w:sz w:val="16"/>
                 <w:szCs w:val="22"/>
@@ -2681,7 +2713,7 @@
             <w:r/>
             <w:r>
               <w:rPr>
-                <w:rFonts w:ascii="Aptos" w:hAnsi="Aptos" w:eastAsia="Aptos" w:cs="Aptos" w:csTheme="minorBidi"/>
+                <w:rFonts w:ascii="Aptos" w:hAnsi="Aptos" w:eastAsia="Aptos" w:cs="Aptos"/>
                 <w:color w:val="23313F"/>
                 <w:sz w:val="16"/>
                 <w:szCs w:val="22"/>
@@ -2714,7 +2746,7 @@
             <w:r/>
             <w:r>
               <w:rPr>
-                <w:rFonts w:ascii="Aptos" w:hAnsi="Aptos" w:eastAsia="Aptos" w:cs="Aptos" w:csTheme="minorBidi"/>
+                <w:rFonts w:ascii="Aptos" w:hAnsi="Aptos" w:eastAsia="Aptos" w:cs="Aptos"/>
                 <w:color w:val="23313F"/>
                 <w:sz w:val="16"/>
                 <w:szCs w:val="22"/>
@@ -2742,7 +2774,7 @@
             <w:r/>
             <w:r>
               <w:rPr>
-                <w:rFonts w:ascii="Aptos" w:hAnsi="Aptos" w:eastAsia="Aptos" w:cs="Aptos" w:csTheme="minorBidi"/>
+                <w:rFonts w:ascii="Aptos" w:hAnsi="Aptos" w:eastAsia="Aptos" w:cs="Aptos"/>
                 <w:color w:val="23313F"/>
                 <w:sz w:val="16"/>
                 <w:szCs w:val="22"/>
@@ -2775,7 +2807,7 @@
             <w:r/>
             <w:r>
               <w:rPr>
-                <w:rFonts w:ascii="Aptos" w:hAnsi="Aptos" w:eastAsia="Aptos" w:cs="Aptos" w:csTheme="minorBidi"/>
+                <w:rFonts w:ascii="Aptos" w:hAnsi="Aptos" w:eastAsia="Aptos" w:cs="Aptos"/>
                 <w:color w:val="23313F"/>
                 <w:sz w:val="16"/>
                 <w:szCs w:val="22"/>
@@ -2803,7 +2835,7 @@
             <w:r/>
             <w:r>
               <w:rPr>
-                <w:rFonts w:ascii="Aptos" w:hAnsi="Aptos" w:eastAsia="Aptos" w:cs="Aptos" w:csTheme="minorBidi"/>
+                <w:rFonts w:ascii="Aptos" w:hAnsi="Aptos" w:eastAsia="Aptos" w:cs="Aptos"/>
                 <w:color w:val="23313F"/>
                 <w:sz w:val="16"/>
                 <w:szCs w:val="22"/>
@@ -2836,7 +2868,7 @@
             <w:r/>
             <w:r>
               <w:rPr>
-                <w:rFonts w:ascii="Aptos" w:hAnsi="Aptos" w:eastAsia="Aptos" w:cs="Aptos" w:csTheme="minorBidi"/>
+                <w:rFonts w:ascii="Aptos" w:hAnsi="Aptos" w:eastAsia="Aptos" w:cs="Aptos"/>
                 <w:color w:val="23313F"/>
                 <w:sz w:val="16"/>
                 <w:szCs w:val="22"/>
@@ -2864,7 +2896,7 @@
             <w:r/>
             <w:r>
               <w:rPr>
-                <w:rFonts w:ascii="Aptos" w:hAnsi="Aptos" w:eastAsia="Aptos" w:cs="Aptos" w:csTheme="minorBidi"/>
+                <w:rFonts w:ascii="Aptos" w:hAnsi="Aptos" w:eastAsia="Aptos" w:cs="Aptos"/>
                 <w:color w:val="23313F"/>
                 <w:sz w:val="16"/>
                 <w:szCs w:val="22"/>
@@ -2897,7 +2929,7 @@
             <w:r/>
             <w:r>
               <w:rPr>
-                <w:rFonts w:ascii="Aptos" w:hAnsi="Aptos" w:eastAsia="Aptos" w:cs="Aptos" w:csTheme="minorBidi"/>
+                <w:rFonts w:ascii="Aptos" w:hAnsi="Aptos" w:eastAsia="Aptos" w:cs="Aptos"/>
                 <w:color w:val="23313F"/>
                 <w:sz w:val="16"/>
                 <w:szCs w:val="22"/>
@@ -2925,7 +2957,7 @@
             <w:r/>
             <w:r>
               <w:rPr>
-                <w:rFonts w:ascii="Aptos" w:hAnsi="Aptos" w:eastAsia="Aptos" w:cs="Aptos" w:csTheme="minorBidi"/>
+                <w:rFonts w:ascii="Aptos" w:hAnsi="Aptos" w:eastAsia="Aptos" w:cs="Aptos"/>
                 <w:color w:val="23313F"/>
                 <w:sz w:val="16"/>
                 <w:szCs w:val="22"/>
@@ -2958,7 +2990,7 @@
             <w:r/>
             <w:r>
               <w:rPr>
-                <w:rFonts w:ascii="Aptos" w:hAnsi="Aptos" w:eastAsia="Aptos" w:cs="Aptos" w:csTheme="minorBidi"/>
+                <w:rFonts w:ascii="Aptos" w:hAnsi="Aptos" w:eastAsia="Aptos" w:cs="Aptos"/>
                 <w:color w:val="23313F"/>
                 <w:sz w:val="16"/>
                 <w:szCs w:val="22"/>
@@ -2986,7 +3018,7 @@
             <w:r/>
             <w:r>
               <w:rPr>
-                <w:rFonts w:ascii="Aptos" w:hAnsi="Aptos" w:eastAsia="Aptos" w:cs="Aptos" w:csTheme="minorBidi"/>
+                <w:rFonts w:ascii="Aptos" w:hAnsi="Aptos" w:eastAsia="Aptos" w:cs="Aptos"/>
                 <w:color w:val="23313F"/>
                 <w:sz w:val="16"/>
                 <w:szCs w:val="22"/>
@@ -3019,7 +3051,7 @@
             <w:r/>
             <w:r>
               <w:rPr>
-                <w:rFonts w:ascii="Aptos" w:hAnsi="Aptos" w:eastAsia="Aptos" w:cs="Aptos" w:csTheme="minorBidi"/>
+                <w:rFonts w:ascii="Aptos" w:hAnsi="Aptos" w:eastAsia="Aptos" w:cs="Aptos"/>
                 <w:color w:val="23313F"/>
                 <w:sz w:val="16"/>
                 <w:szCs w:val="22"/>
@@ -3047,7 +3079,7 @@
             <w:r/>
             <w:r>
               <w:rPr>
-                <w:rFonts w:ascii="Aptos" w:hAnsi="Aptos" w:eastAsia="Aptos" w:cs="Aptos" w:csTheme="minorBidi"/>
+                <w:rFonts w:ascii="Aptos" w:hAnsi="Aptos" w:eastAsia="Aptos" w:cs="Aptos"/>
                 <w:color w:val="23313F"/>
                 <w:sz w:val="16"/>
                 <w:szCs w:val="22"/>
@@ -3080,7 +3112,7 @@
             <w:r/>
             <w:r>
               <w:rPr>
-                <w:rFonts w:ascii="Aptos" w:hAnsi="Aptos" w:eastAsia="Aptos" w:cs="Aptos" w:csTheme="minorBidi"/>
+                <w:rFonts w:ascii="Aptos" w:hAnsi="Aptos" w:eastAsia="Aptos" w:cs="Aptos"/>
                 <w:color w:val="23313F"/>
                 <w:sz w:val="16"/>
                 <w:szCs w:val="22"/>
@@ -3108,7 +3140,7 @@
             <w:r/>
             <w:r>
               <w:rPr>
-                <w:rFonts w:ascii="Aptos" w:hAnsi="Aptos" w:eastAsia="Aptos" w:cs="Aptos" w:csTheme="minorBidi"/>
+                <w:rFonts w:ascii="Aptos" w:hAnsi="Aptos" w:eastAsia="Aptos" w:cs="Aptos"/>
                 <w:color w:val="23313F"/>
                 <w:sz w:val="16"/>
                 <w:szCs w:val="22"/>
@@ -3130,7 +3162,7 @@
       </w:pPr>
       <w:r>
         <w:rPr>
-          <w:rFonts w:ascii="Aptos" w:hAnsi="Aptos" w:eastAsia="Aptos" w:cs="Aptos" w:asciiTheme="majorHAnsi" w:hAnsiTheme="majorHAnsi" w:eastAsiaTheme="majorEastAsia" w:csTheme="majorBidi"/>
+          <w:rFonts w:ascii="Aptos" w:hAnsi="Aptos" w:eastAsia="Aptos" w:cs="Aptos" w:asciiTheme="majorHAnsi" w:hAnsiTheme="majorHAnsi" w:eastAsiaTheme="majorEastAsia"/>
           <w:b/>
           <w:bCs/>
           <w:color w:val="176B87"/>
@@ -3146,7 +3178,7 @@
       </w:pPr>
       <w:r>
         <w:rPr>
-          <w:rFonts w:ascii="Aptos" w:hAnsi="Aptos" w:eastAsia="Aptos" w:cs="Aptos" w:csTheme="minorBidi"/>
+          <w:rFonts w:ascii="Aptos" w:hAnsi="Aptos" w:eastAsia="Aptos" w:cs="Aptos"/>
           <w:color w:val="23313F"/>
           <w:sz w:val="19"/>
           <w:szCs w:val="22"/>
@@ -3160,7 +3192,7 @@
       </w:pPr>
       <w:r>
         <w:rPr>
-          <w:rFonts w:ascii="Aptos Display" w:hAnsi="Aptos Display" w:eastAsia="Aptos Display" w:cs="Aptos Display" w:asciiTheme="majorHAnsi" w:hAnsiTheme="majorHAnsi" w:eastAsiaTheme="majorEastAsia" w:csTheme="majorBidi"/>
+          <w:rFonts w:ascii="Aptos Display" w:hAnsi="Aptos Display" w:eastAsia="Aptos Display" w:cs="Aptos Display" w:asciiTheme="majorHAnsi" w:hAnsiTheme="majorHAnsi" w:eastAsiaTheme="majorEastAsia"/>
           <w:b/>
           <w:bCs/>
           <w:color w:val="17324D"/>
@@ -3176,7 +3208,7 @@
       </w:pPr>
       <w:r>
         <w:rPr>
-          <w:rFonts w:ascii="Aptos" w:hAnsi="Aptos" w:eastAsia="Aptos" w:cs="Aptos" w:asciiTheme="majorHAnsi" w:hAnsiTheme="majorHAnsi" w:eastAsiaTheme="majorEastAsia" w:csTheme="majorBidi"/>
+          <w:rFonts w:ascii="Aptos" w:hAnsi="Aptos" w:eastAsia="Aptos" w:cs="Aptos" w:asciiTheme="majorHAnsi" w:hAnsiTheme="majorHAnsi" w:eastAsiaTheme="majorEastAsia"/>
           <w:b/>
           <w:bCs/>
           <w:color w:val="176B87"/>
@@ -3192,7 +3224,7 @@
       </w:pPr>
       <w:r>
         <w:rPr>
-          <w:rFonts w:ascii="Aptos" w:hAnsi="Aptos" w:eastAsia="Aptos" w:cs="Aptos" w:csTheme="minorBidi"/>
+          <w:rFonts w:ascii="Aptos" w:hAnsi="Aptos" w:eastAsia="Aptos" w:cs="Aptos"/>
           <w:color w:val="23313F"/>
           <w:sz w:val="19"/>
           <w:szCs w:val="22"/>
@@ -3206,7 +3238,7 @@
       </w:pPr>
       <w:r>
         <w:rPr>
-          <w:rFonts w:ascii="Aptos" w:hAnsi="Aptos" w:eastAsia="Aptos" w:cs="Aptos" w:asciiTheme="majorHAnsi" w:hAnsiTheme="majorHAnsi" w:eastAsiaTheme="majorEastAsia" w:csTheme="majorBidi"/>
+          <w:rFonts w:ascii="Aptos" w:hAnsi="Aptos" w:eastAsia="Aptos" w:cs="Aptos" w:asciiTheme="majorHAnsi" w:hAnsiTheme="majorHAnsi" w:eastAsiaTheme="majorEastAsia"/>
           <w:b/>
           <w:bCs/>
           <w:color w:val="176B87"/>
@@ -3223,7 +3255,7 @@
       </w:pPr>
       <w:r>
         <w:rPr>
-          <w:rFonts w:ascii="Aptos" w:hAnsi="Aptos" w:eastAsia="Aptos" w:cs="Aptos" w:csTheme="minorBidi"/>
+          <w:rFonts w:ascii="Aptos" w:hAnsi="Aptos" w:eastAsia="Aptos" w:cs="Aptos"/>
           <w:color w:val="23313F"/>
           <w:sz w:val="19"/>
           <w:szCs w:val="22"/>
@@ -3238,7 +3270,7 @@
       </w:pPr>
       <w:r>
         <w:rPr>
-          <w:rFonts w:ascii="Aptos" w:hAnsi="Aptos" w:eastAsia="Aptos" w:cs="Aptos" w:csTheme="minorBidi"/>
+          <w:rFonts w:ascii="Aptos" w:hAnsi="Aptos" w:eastAsia="Aptos" w:cs="Aptos"/>
           <w:color w:val="23313F"/>
           <w:sz w:val="19"/>
           <w:szCs w:val="22"/>
@@ -3253,7 +3285,7 @@
       </w:pPr>
       <w:r>
         <w:rPr>
-          <w:rFonts w:ascii="Aptos" w:hAnsi="Aptos" w:eastAsia="Aptos" w:cs="Aptos" w:csTheme="minorBidi"/>
+          <w:rFonts w:ascii="Aptos" w:hAnsi="Aptos" w:eastAsia="Aptos" w:cs="Aptos"/>
           <w:color w:val="23313F"/>
           <w:sz w:val="19"/>
           <w:szCs w:val="22"/>
@@ -3268,7 +3300,7 @@
       </w:pPr>
       <w:r>
         <w:rPr>
-          <w:rFonts w:ascii="Aptos" w:hAnsi="Aptos" w:eastAsia="Aptos" w:cs="Aptos" w:csTheme="minorBidi"/>
+          <w:rFonts w:ascii="Aptos" w:hAnsi="Aptos" w:eastAsia="Aptos" w:cs="Aptos"/>
           <w:color w:val="23313F"/>
           <w:sz w:val="19"/>
           <w:szCs w:val="22"/>
@@ -3283,7 +3315,7 @@
       </w:pPr>
       <w:r>
         <w:rPr>
-          <w:rFonts w:ascii="Aptos" w:hAnsi="Aptos" w:eastAsia="Aptos" w:cs="Aptos" w:csTheme="minorBidi"/>
+          <w:rFonts w:ascii="Aptos" w:hAnsi="Aptos" w:eastAsia="Aptos" w:cs="Aptos"/>
           <w:color w:val="23313F"/>
           <w:sz w:val="19"/>
           <w:szCs w:val="22"/>
@@ -3298,7 +3330,7 @@
       </w:pPr>
       <w:r>
         <w:rPr>
-          <w:rFonts w:ascii="Aptos" w:hAnsi="Aptos" w:eastAsia="Aptos" w:cs="Aptos" w:csTheme="minorBidi"/>
+          <w:rFonts w:ascii="Aptos" w:hAnsi="Aptos" w:eastAsia="Aptos" w:cs="Aptos"/>
           <w:color w:val="23313F"/>
           <w:sz w:val="19"/>
           <w:szCs w:val="22"/>
@@ -3313,7 +3345,7 @@
       </w:pPr>
       <w:r>
         <w:rPr>
-          <w:rFonts w:ascii="Aptos" w:hAnsi="Aptos" w:eastAsia="Aptos" w:cs="Aptos" w:csTheme="minorBidi"/>
+          <w:rFonts w:ascii="Aptos" w:hAnsi="Aptos" w:eastAsia="Aptos" w:cs="Aptos"/>
           <w:color w:val="23313F"/>
           <w:sz w:val="19"/>
           <w:szCs w:val="22"/>
@@ -3355,7 +3387,7 @@
             <w:r/>
             <w:r>
               <w:rPr>
-                <w:rFonts w:ascii="Aptos" w:hAnsi="Aptos" w:eastAsia="Aptos" w:cs="Aptos" w:csTheme="minorBidi"/>
+                <w:rFonts w:ascii="Aptos" w:hAnsi="Aptos" w:eastAsia="Aptos" w:cs="Aptos"/>
                 <w:b/>
                 <w:bCs/>
                 <w:color w:val="20744A"/>
@@ -3371,7 +3403,7 @@
             </w:pPr>
             <w:r>
               <w:rPr>
-                <w:rFonts w:ascii="Aptos" w:hAnsi="Aptos" w:eastAsia="Aptos" w:cs="Aptos" w:csTheme="minorBidi"/>
+                <w:rFonts w:ascii="Aptos" w:hAnsi="Aptos" w:eastAsia="Aptos" w:cs="Aptos"/>
                 <w:color w:val="23313F"/>
                 <w:sz w:val="18"/>
                 <w:szCs w:val="22"/>
@@ -3393,7 +3425,7 @@
       </w:pPr>
       <w:r>
         <w:rPr>
-          <w:rFonts w:ascii="Aptos" w:hAnsi="Aptos" w:eastAsia="Aptos" w:cs="Aptos" w:asciiTheme="majorHAnsi" w:hAnsiTheme="majorHAnsi" w:eastAsiaTheme="majorEastAsia" w:csTheme="majorBidi"/>
+          <w:rFonts w:ascii="Aptos" w:hAnsi="Aptos" w:eastAsia="Aptos" w:cs="Aptos" w:asciiTheme="majorHAnsi" w:hAnsiTheme="majorHAnsi" w:eastAsiaTheme="majorEastAsia"/>
           <w:b/>
           <w:bCs/>
           <w:color w:val="176B87"/>
@@ -3443,7 +3475,7 @@
             <w:r/>
             <w:r>
               <w:rPr>
-                <w:rFonts w:ascii="Aptos" w:hAnsi="Aptos" w:eastAsia="Aptos" w:cs="Aptos" w:csTheme="minorBidi"/>
+                <w:rFonts w:ascii="Aptos" w:hAnsi="Aptos" w:eastAsia="Aptos" w:cs="Aptos"/>
                 <w:b/>
                 <w:bCs/>
                 <w:color w:val="FFFFFF"/>
@@ -3473,7 +3505,7 @@
             <w:r/>
             <w:r>
               <w:rPr>
-                <w:rFonts w:ascii="Aptos" w:hAnsi="Aptos" w:eastAsia="Aptos" w:cs="Aptos" w:csTheme="minorBidi"/>
+                <w:rFonts w:ascii="Aptos" w:hAnsi="Aptos" w:eastAsia="Aptos" w:cs="Aptos"/>
                 <w:b/>
                 <w:bCs/>
                 <w:color w:val="FFFFFF"/>
@@ -3508,7 +3540,7 @@
             <w:r/>
             <w:r>
               <w:rPr>
-                <w:rFonts w:ascii="Aptos" w:hAnsi="Aptos" w:eastAsia="Aptos" w:cs="Aptos" w:csTheme="minorBidi"/>
+                <w:rFonts w:ascii="Aptos" w:hAnsi="Aptos" w:eastAsia="Aptos" w:cs="Aptos"/>
                 <w:color w:val="23313F"/>
                 <w:sz w:val="16"/>
                 <w:szCs w:val="22"/>
@@ -3536,7 +3568,7 @@
             <w:r/>
             <w:r>
               <w:rPr>
-                <w:rFonts w:ascii="Aptos" w:hAnsi="Aptos" w:eastAsia="Aptos" w:cs="Aptos" w:csTheme="minorBidi"/>
+                <w:rFonts w:ascii="Aptos" w:hAnsi="Aptos" w:eastAsia="Aptos" w:cs="Aptos"/>
                 <w:color w:val="23313F"/>
                 <w:sz w:val="16"/>
                 <w:szCs w:val="22"/>
@@ -3569,7 +3601,7 @@
             <w:r/>
             <w:r>
               <w:rPr>
-                <w:rFonts w:ascii="Aptos" w:hAnsi="Aptos" w:eastAsia="Aptos" w:cs="Aptos" w:csTheme="minorBidi"/>
+                <w:rFonts w:ascii="Aptos" w:hAnsi="Aptos" w:eastAsia="Aptos" w:cs="Aptos"/>
                 <w:color w:val="23313F"/>
                 <w:sz w:val="16"/>
                 <w:szCs w:val="22"/>
@@ -3597,7 +3629,7 @@
             <w:r/>
             <w:r>
               <w:rPr>
-                <w:rFonts w:ascii="Aptos" w:hAnsi="Aptos" w:eastAsia="Aptos" w:cs="Aptos" w:csTheme="minorBidi"/>
+                <w:rFonts w:ascii="Aptos" w:hAnsi="Aptos" w:eastAsia="Aptos" w:cs="Aptos"/>
                 <w:color w:val="23313F"/>
                 <w:sz w:val="16"/>
                 <w:szCs w:val="22"/>
@@ -3630,7 +3662,7 @@
             <w:r/>
             <w:r>
               <w:rPr>
-                <w:rFonts w:ascii="Aptos" w:hAnsi="Aptos" w:eastAsia="Aptos" w:cs="Aptos" w:csTheme="minorBidi"/>
+                <w:rFonts w:ascii="Aptos" w:hAnsi="Aptos" w:eastAsia="Aptos" w:cs="Aptos"/>
                 <w:color w:val="23313F"/>
                 <w:sz w:val="16"/>
                 <w:szCs w:val="22"/>
@@ -3658,7 +3690,7 @@
             <w:r/>
             <w:r>
               <w:rPr>
-                <w:rFonts w:ascii="Aptos" w:hAnsi="Aptos" w:eastAsia="Aptos" w:cs="Aptos" w:csTheme="minorBidi"/>
+                <w:rFonts w:ascii="Aptos" w:hAnsi="Aptos" w:eastAsia="Aptos" w:cs="Aptos"/>
                 <w:color w:val="23313F"/>
                 <w:sz w:val="16"/>
                 <w:szCs w:val="22"/>
@@ -3691,7 +3723,7 @@
             <w:r/>
             <w:r>
               <w:rPr>
-                <w:rFonts w:ascii="Aptos" w:hAnsi="Aptos" w:eastAsia="Aptos" w:cs="Aptos" w:csTheme="minorBidi"/>
+                <w:rFonts w:ascii="Aptos" w:hAnsi="Aptos" w:eastAsia="Aptos" w:cs="Aptos"/>
                 <w:color w:val="23313F"/>
                 <w:sz w:val="16"/>
                 <w:szCs w:val="22"/>
@@ -3719,7 +3751,7 @@
             <w:r/>
             <w:r>
               <w:rPr>
-                <w:rFonts w:ascii="Aptos" w:hAnsi="Aptos" w:eastAsia="Aptos" w:cs="Aptos" w:csTheme="minorBidi"/>
+                <w:rFonts w:ascii="Aptos" w:hAnsi="Aptos" w:eastAsia="Aptos" w:cs="Aptos"/>
                 <w:color w:val="23313F"/>
                 <w:sz w:val="16"/>
                 <w:szCs w:val="22"/>
@@ -3752,7 +3784,7 @@
             <w:r/>
             <w:r>
               <w:rPr>
-                <w:rFonts w:ascii="Aptos" w:hAnsi="Aptos" w:eastAsia="Aptos" w:cs="Aptos" w:csTheme="minorBidi"/>
+                <w:rFonts w:ascii="Aptos" w:hAnsi="Aptos" w:eastAsia="Aptos" w:cs="Aptos"/>
                 <w:color w:val="23313F"/>
                 <w:sz w:val="16"/>
                 <w:szCs w:val="22"/>
@@ -3780,7 +3812,7 @@
             <w:r/>
             <w:r>
               <w:rPr>
-                <w:rFonts w:ascii="Aptos" w:hAnsi="Aptos" w:eastAsia="Aptos" w:cs="Aptos" w:csTheme="minorBidi"/>
+                <w:rFonts w:ascii="Aptos" w:hAnsi="Aptos" w:eastAsia="Aptos" w:cs="Aptos"/>
                 <w:color w:val="23313F"/>
                 <w:sz w:val="16"/>
                 <w:szCs w:val="22"/>
@@ -3802,7 +3834,7 @@
       </w:pPr>
       <w:r>
         <w:rPr>
-          <w:rFonts w:ascii="Aptos" w:hAnsi="Aptos" w:eastAsia="Aptos" w:cs="Aptos" w:csTheme="minorBidi"/>
+          <w:rFonts w:ascii="Aptos" w:hAnsi="Aptos" w:eastAsia="Aptos" w:cs="Aptos"/>
           <w:color w:val="23313F"/>
           <w:sz w:val="19"/>
           <w:szCs w:val="22"/>
@@ -3816,7 +3848,7 @@
       </w:pPr>
       <w:r>
         <w:rPr>
-          <w:rFonts w:ascii="Aptos" w:hAnsi="Aptos" w:eastAsia="Aptos" w:cs="Aptos" w:asciiTheme="majorHAnsi" w:hAnsiTheme="majorHAnsi" w:eastAsiaTheme="majorEastAsia" w:csTheme="majorBidi"/>
+          <w:rFonts w:ascii="Aptos" w:hAnsi="Aptos" w:eastAsia="Aptos" w:cs="Aptos" w:asciiTheme="majorHAnsi" w:hAnsiTheme="majorHAnsi" w:eastAsiaTheme="majorEastAsia"/>
           <w:b/>
           <w:bCs/>
           <w:color w:val="176B87"/>
@@ -3832,7 +3864,7 @@
       </w:pPr>
       <w:r>
         <w:rPr>
-          <w:rFonts w:ascii="Aptos" w:hAnsi="Aptos" w:eastAsia="Aptos" w:cs="Aptos" w:csTheme="minorBidi"/>
+          <w:rFonts w:ascii="Aptos" w:hAnsi="Aptos" w:eastAsia="Aptos" w:cs="Aptos"/>
           <w:color w:val="23313F"/>
           <w:sz w:val="19"/>
           <w:szCs w:val="22"/>
@@ -3880,7 +3912,7 @@
             <w:r/>
             <w:r>
               <w:rPr>
-                <w:rFonts w:ascii="Aptos" w:hAnsi="Aptos" w:eastAsia="Aptos" w:cs="Aptos" w:csTheme="minorBidi"/>
+                <w:rFonts w:ascii="Aptos" w:hAnsi="Aptos" w:eastAsia="Aptos" w:cs="Aptos"/>
                 <w:b/>
                 <w:bCs/>
                 <w:color w:val="FFFFFF"/>
@@ -3910,7 +3942,7 @@
             <w:r/>
             <w:r>
               <w:rPr>
-                <w:rFonts w:ascii="Aptos" w:hAnsi="Aptos" w:eastAsia="Aptos" w:cs="Aptos" w:csTheme="minorBidi"/>
+                <w:rFonts w:ascii="Aptos" w:hAnsi="Aptos" w:eastAsia="Aptos" w:cs="Aptos"/>
                 <w:b/>
                 <w:bCs/>
                 <w:color w:val="FFFFFF"/>
@@ -3945,7 +3977,7 @@
             <w:r/>
             <w:r>
               <w:rPr>
-                <w:rFonts w:ascii="Aptos" w:hAnsi="Aptos" w:eastAsia="Aptos" w:cs="Aptos" w:csTheme="minorBidi"/>
+                <w:rFonts w:ascii="Aptos" w:hAnsi="Aptos" w:eastAsia="Aptos" w:cs="Aptos"/>
                 <w:color w:val="23313F"/>
                 <w:sz w:val="16"/>
                 <w:szCs w:val="22"/>
@@ -3973,7 +4005,7 @@
             <w:r/>
             <w:r>
               <w:rPr>
-                <w:rFonts w:ascii="Aptos" w:hAnsi="Aptos" w:eastAsia="Aptos" w:cs="Aptos" w:csTheme="minorBidi"/>
+                <w:rFonts w:ascii="Aptos" w:hAnsi="Aptos" w:eastAsia="Aptos" w:cs="Aptos"/>
                 <w:color w:val="23313F"/>
                 <w:sz w:val="16"/>
                 <w:szCs w:val="22"/>
@@ -4006,7 +4038,7 @@
             <w:r/>
             <w:r>
               <w:rPr>
-                <w:rFonts w:ascii="Aptos" w:hAnsi="Aptos" w:eastAsia="Aptos" w:cs="Aptos" w:csTheme="minorBidi"/>
+                <w:rFonts w:ascii="Aptos" w:hAnsi="Aptos" w:eastAsia="Aptos" w:cs="Aptos"/>
                 <w:color w:val="23313F"/>
                 <w:sz w:val="16"/>
                 <w:szCs w:val="22"/>
@@ -4034,7 +4066,7 @@
             <w:r/>
             <w:r>
               <w:rPr>
-                <w:rFonts w:ascii="Aptos" w:hAnsi="Aptos" w:eastAsia="Aptos" w:cs="Aptos" w:csTheme="minorBidi"/>
+                <w:rFonts w:ascii="Aptos" w:hAnsi="Aptos" w:eastAsia="Aptos" w:cs="Aptos"/>
                 <w:color w:val="23313F"/>
                 <w:sz w:val="16"/>
                 <w:szCs w:val="22"/>
@@ -4067,7 +4099,7 @@
             <w:r/>
             <w:r>
               <w:rPr>
-                <w:rFonts w:ascii="Aptos" w:hAnsi="Aptos" w:eastAsia="Aptos" w:cs="Aptos" w:csTheme="minorBidi"/>
+                <w:rFonts w:ascii="Aptos" w:hAnsi="Aptos" w:eastAsia="Aptos" w:cs="Aptos"/>
                 <w:color w:val="23313F"/>
                 <w:sz w:val="16"/>
                 <w:szCs w:val="22"/>
@@ -4095,7 +4127,7 @@
             <w:r/>
             <w:r>
               <w:rPr>
-                <w:rFonts w:ascii="Aptos" w:hAnsi="Aptos" w:eastAsia="Aptos" w:cs="Aptos" w:csTheme="minorBidi"/>
+                <w:rFonts w:ascii="Aptos" w:hAnsi="Aptos" w:eastAsia="Aptos" w:cs="Aptos"/>
                 <w:color w:val="23313F"/>
                 <w:sz w:val="16"/>
                 <w:szCs w:val="22"/>
@@ -4128,7 +4160,7 @@
             <w:r/>
             <w:r>
               <w:rPr>
-                <w:rFonts w:ascii="Aptos" w:hAnsi="Aptos" w:eastAsia="Aptos" w:cs="Aptos" w:csTheme="minorBidi"/>
+                <w:rFonts w:ascii="Aptos" w:hAnsi="Aptos" w:eastAsia="Aptos" w:cs="Aptos"/>
                 <w:color w:val="23313F"/>
                 <w:sz w:val="16"/>
                 <w:szCs w:val="22"/>
@@ -4156,7 +4188,7 @@
             <w:r/>
             <w:r>
               <w:rPr>
-                <w:rFonts w:ascii="Aptos" w:hAnsi="Aptos" w:eastAsia="Aptos" w:cs="Aptos" w:csTheme="minorBidi"/>
+                <w:rFonts w:ascii="Aptos" w:hAnsi="Aptos" w:eastAsia="Aptos" w:cs="Aptos"/>
                 <w:color w:val="23313F"/>
                 <w:sz w:val="16"/>
                 <w:szCs w:val="22"/>
@@ -4189,7 +4221,7 @@
             <w:r/>
             <w:r>
               <w:rPr>
-                <w:rFonts w:ascii="Aptos" w:hAnsi="Aptos" w:eastAsia="Aptos" w:cs="Aptos" w:csTheme="minorBidi"/>
+                <w:rFonts w:ascii="Aptos" w:hAnsi="Aptos" w:eastAsia="Aptos" w:cs="Aptos"/>
                 <w:color w:val="23313F"/>
                 <w:sz w:val="16"/>
                 <w:szCs w:val="22"/>
@@ -4217,7 +4249,7 @@
             <w:r/>
             <w:r>
               <w:rPr>
-                <w:rFonts w:ascii="Aptos" w:hAnsi="Aptos" w:eastAsia="Aptos" w:cs="Aptos" w:csTheme="minorBidi"/>
+                <w:rFonts w:ascii="Aptos" w:hAnsi="Aptos" w:eastAsia="Aptos" w:cs="Aptos"/>
                 <w:color w:val="23313F"/>
                 <w:sz w:val="16"/>
                 <w:szCs w:val="22"/>
@@ -4250,7 +4282,7 @@
             <w:r/>
             <w:r>
               <w:rPr>
-                <w:rFonts w:ascii="Aptos" w:hAnsi="Aptos" w:eastAsia="Aptos" w:cs="Aptos" w:csTheme="minorBidi"/>
+                <w:rFonts w:ascii="Aptos" w:hAnsi="Aptos" w:eastAsia="Aptos" w:cs="Aptos"/>
                 <w:color w:val="23313F"/>
                 <w:sz w:val="16"/>
                 <w:szCs w:val="22"/>
@@ -4278,7 +4310,7 @@
             <w:r/>
             <w:r>
               <w:rPr>
-                <w:rFonts w:ascii="Aptos" w:hAnsi="Aptos" w:eastAsia="Aptos" w:cs="Aptos" w:csTheme="minorBidi"/>
+                <w:rFonts w:ascii="Aptos" w:hAnsi="Aptos" w:eastAsia="Aptos" w:cs="Aptos"/>
                 <w:color w:val="23313F"/>
                 <w:sz w:val="16"/>
                 <w:szCs w:val="22"/>
@@ -4300,7 +4332,7 @@
       </w:pPr>
       <w:r>
         <w:rPr>
-          <w:rFonts w:ascii="Aptos" w:hAnsi="Aptos" w:eastAsia="Aptos" w:cs="Aptos" w:asciiTheme="majorHAnsi" w:hAnsiTheme="majorHAnsi" w:eastAsiaTheme="majorEastAsia" w:csTheme="majorBidi"/>
+          <w:rFonts w:ascii="Aptos" w:hAnsi="Aptos" w:eastAsia="Aptos" w:cs="Aptos" w:asciiTheme="majorHAnsi" w:hAnsiTheme="majorHAnsi" w:eastAsiaTheme="majorEastAsia"/>
           <w:b/>
           <w:bCs/>
           <w:color w:val="176B87"/>
@@ -4318,7 +4350,7 @@
       </w:pPr>
       <w:r>
         <w:rPr>
-          <w:rFonts w:ascii="Consolas" w:hAnsi="Consolas" w:eastAsia="Consolas" w:cs="Consolas" w:csTheme="minorBidi"/>
+          <w:rFonts w:ascii="Consolas" w:hAnsi="Consolas" w:eastAsia="Consolas" w:cs="Consolas"/>
           <w:color w:val="243746"/>
           <w:sz w:val="16"/>
           <w:szCs w:val="22"/>
@@ -4332,7 +4364,7 @@
       </w:pPr>
       <w:r>
         <w:rPr>
-          <w:rFonts w:ascii="Aptos" w:hAnsi="Aptos" w:eastAsia="Aptos" w:cs="Aptos" w:csTheme="minorBidi"/>
+          <w:rFonts w:ascii="Aptos" w:hAnsi="Aptos" w:eastAsia="Aptos" w:cs="Aptos"/>
           <w:color w:val="23313F"/>
           <w:sz w:val="19"/>
           <w:szCs w:val="22"/>
@@ -4346,7 +4378,7 @@
       </w:pPr>
       <w:r>
         <w:rPr>
-          <w:rFonts w:ascii="Aptos" w:hAnsi="Aptos" w:eastAsia="Aptos" w:cs="Aptos" w:asciiTheme="majorHAnsi" w:hAnsiTheme="majorHAnsi" w:eastAsiaTheme="majorEastAsia" w:csTheme="majorBidi"/>
+          <w:rFonts w:ascii="Aptos" w:hAnsi="Aptos" w:eastAsia="Aptos" w:cs="Aptos" w:asciiTheme="majorHAnsi" w:hAnsiTheme="majorHAnsi" w:eastAsiaTheme="majorEastAsia"/>
           <w:b/>
           <w:bCs/>
           <w:color w:val="176B87"/>
@@ -4364,7 +4396,7 @@
       </w:pPr>
       <w:r>
         <w:rPr>
-          <w:rFonts w:ascii="Aptos" w:hAnsi="Aptos" w:eastAsia="Aptos" w:cs="Aptos" w:csTheme="minorBidi"/>
+          <w:rFonts w:ascii="Aptos" w:hAnsi="Aptos" w:eastAsia="Aptos" w:cs="Aptos"/>
           <w:color w:val="23313F"/>
           <w:sz w:val="19"/>
           <w:szCs w:val="22"/>
@@ -4380,7 +4412,7 @@
       </w:pPr>
       <w:r>
         <w:rPr>
-          <w:rFonts w:ascii="Aptos" w:hAnsi="Aptos" w:eastAsia="Aptos" w:cs="Aptos" w:csTheme="minorBidi"/>
+          <w:rFonts w:ascii="Aptos" w:hAnsi="Aptos" w:eastAsia="Aptos" w:cs="Aptos"/>
           <w:color w:val="23313F"/>
           <w:sz w:val="19"/>
           <w:szCs w:val="22"/>
@@ -4396,7 +4428,7 @@
       </w:pPr>
       <w:r>
         <w:rPr>
-          <w:rFonts w:ascii="Aptos" w:hAnsi="Aptos" w:eastAsia="Aptos" w:cs="Aptos" w:csTheme="minorBidi"/>
+          <w:rFonts w:ascii="Aptos" w:hAnsi="Aptos" w:eastAsia="Aptos" w:cs="Aptos"/>
           <w:color w:val="23313F"/>
           <w:sz w:val="19"/>
           <w:szCs w:val="22"/>
@@ -4412,7 +4444,7 @@
       </w:pPr>
       <w:r>
         <w:rPr>
-          <w:rFonts w:ascii="Aptos" w:hAnsi="Aptos" w:eastAsia="Aptos" w:cs="Aptos" w:csTheme="minorBidi"/>
+          <w:rFonts w:ascii="Aptos" w:hAnsi="Aptos" w:eastAsia="Aptos" w:cs="Aptos"/>
           <w:color w:val="23313F"/>
           <w:sz w:val="19"/>
           <w:szCs w:val="22"/>
@@ -4426,7 +4458,7 @@
       </w:pPr>
       <w:r>
         <w:rPr>
-          <w:rFonts w:ascii="Aptos Display" w:hAnsi="Aptos Display" w:eastAsia="Aptos Display" w:cs="Aptos Display" w:asciiTheme="majorHAnsi" w:hAnsiTheme="majorHAnsi" w:eastAsiaTheme="majorEastAsia" w:csTheme="majorBidi"/>
+          <w:rFonts w:ascii="Aptos Display" w:hAnsi="Aptos Display" w:eastAsia="Aptos Display" w:cs="Aptos Display" w:asciiTheme="majorHAnsi" w:hAnsiTheme="majorHAnsi" w:eastAsiaTheme="majorEastAsia"/>
           <w:b/>
           <w:bCs/>
           <w:color w:val="17324D"/>
@@ -4442,7 +4474,7 @@
       </w:pPr>
       <w:r>
         <w:rPr>
-          <w:rFonts w:ascii="Aptos" w:hAnsi="Aptos" w:eastAsia="Aptos" w:cs="Aptos" w:asciiTheme="majorHAnsi" w:hAnsiTheme="majorHAnsi" w:eastAsiaTheme="majorEastAsia" w:csTheme="majorBidi"/>
+          <w:rFonts w:ascii="Aptos" w:hAnsi="Aptos" w:eastAsia="Aptos" w:cs="Aptos" w:asciiTheme="majorHAnsi" w:hAnsiTheme="majorHAnsi" w:eastAsiaTheme="majorEastAsia"/>
           <w:b/>
           <w:bCs/>
           <w:color w:val="176B87"/>
@@ -4460,7 +4492,7 @@
       </w:pPr>
       <w:r>
         <w:rPr>
-          <w:rFonts w:ascii="Consolas" w:hAnsi="Consolas" w:eastAsia="Consolas" w:cs="Consolas" w:csTheme="minorBidi"/>
+          <w:rFonts w:ascii="Consolas" w:hAnsi="Consolas" w:eastAsia="Consolas" w:cs="Consolas"/>
           <w:color w:val="243746"/>
           <w:sz w:val="16"/>
           <w:szCs w:val="22"/>
@@ -4476,7 +4508,7 @@
       </w:pPr>
       <w:r>
         <w:rPr>
-          <w:rFonts w:ascii="Consolas" w:hAnsi="Consolas" w:eastAsia="Consolas" w:cs="Consolas" w:csTheme="minorBidi"/>
+          <w:rFonts w:ascii="Consolas" w:hAnsi="Consolas" w:eastAsia="Consolas" w:cs="Consolas"/>
           <w:color w:val="243746"/>
           <w:sz w:val="16"/>
           <w:szCs w:val="22"/>
@@ -4492,7 +4524,7 @@
       </w:pPr>
       <w:r>
         <w:rPr>
-          <w:rFonts w:ascii="Consolas" w:hAnsi="Consolas" w:eastAsia="Consolas" w:cs="Consolas" w:csTheme="minorBidi"/>
+          <w:rFonts w:ascii="Consolas" w:hAnsi="Consolas" w:eastAsia="Consolas" w:cs="Consolas"/>
           <w:color w:val="243746"/>
           <w:sz w:val="16"/>
           <w:szCs w:val="22"/>
@@ -4508,7 +4540,7 @@
       </w:pPr>
       <w:r>
         <w:rPr>
-          <w:rFonts w:ascii="Consolas" w:hAnsi="Consolas" w:eastAsia="Consolas" w:cs="Consolas" w:csTheme="minorBidi"/>
+          <w:rFonts w:ascii="Consolas" w:hAnsi="Consolas" w:eastAsia="Consolas" w:cs="Consolas"/>
           <w:color w:val="243746"/>
           <w:sz w:val="16"/>
           <w:szCs w:val="22"/>
@@ -4524,7 +4556,7 @@
       </w:pPr>
       <w:r>
         <w:rPr>
-          <w:rFonts w:ascii="Consolas" w:hAnsi="Consolas" w:eastAsia="Consolas" w:cs="Consolas" w:csTheme="minorBidi"/>
+          <w:rFonts w:ascii="Consolas" w:hAnsi="Consolas" w:eastAsia="Consolas" w:cs="Consolas"/>
           <w:color w:val="243746"/>
           <w:sz w:val="16"/>
           <w:szCs w:val="22"/>
@@ -4540,7 +4572,7 @@
       </w:pPr>
       <w:r>
         <w:rPr>
-          <w:rFonts w:ascii="Consolas" w:hAnsi="Consolas" w:eastAsia="Consolas" w:cs="Consolas" w:csTheme="minorBidi"/>
+          <w:rFonts w:ascii="Consolas" w:hAnsi="Consolas" w:eastAsia="Consolas" w:cs="Consolas"/>
           <w:color w:val="243746"/>
           <w:sz w:val="16"/>
           <w:szCs w:val="22"/>
@@ -4556,7 +4588,7 @@
       </w:pPr>
       <w:r>
         <w:rPr>
-          <w:rFonts w:ascii="Consolas" w:hAnsi="Consolas" w:eastAsia="Consolas" w:cs="Consolas" w:csTheme="minorBidi"/>
+          <w:rFonts w:ascii="Consolas" w:hAnsi="Consolas" w:eastAsia="Consolas" w:cs="Consolas"/>
           <w:color w:val="243746"/>
           <w:sz w:val="16"/>
           <w:szCs w:val="22"/>
@@ -4572,7 +4604,7 @@
       </w:pPr>
       <w:r>
         <w:rPr>
-          <w:rFonts w:ascii="Consolas" w:hAnsi="Consolas" w:eastAsia="Consolas" w:cs="Consolas" w:csTheme="minorBidi"/>
+          <w:rFonts w:ascii="Consolas" w:hAnsi="Consolas" w:eastAsia="Consolas" w:cs="Consolas"/>
           <w:color w:val="243746"/>
           <w:sz w:val="16"/>
           <w:szCs w:val="22"/>
@@ -4586,7 +4618,7 @@
       </w:pPr>
       <w:r>
         <w:rPr>
-          <w:rFonts w:ascii="Aptos" w:hAnsi="Aptos" w:eastAsia="Aptos" w:cs="Aptos" w:csTheme="minorBidi"/>
+          <w:rFonts w:ascii="Aptos" w:hAnsi="Aptos" w:eastAsia="Aptos" w:cs="Aptos"/>
           <w:color w:val="23313F"/>
           <w:sz w:val="19"/>
           <w:szCs w:val="22"/>
@@ -4600,7 +4632,7 @@
       </w:pPr>
       <w:r>
         <w:rPr>
-          <w:rFonts w:ascii="Aptos" w:hAnsi="Aptos" w:eastAsia="Aptos" w:cs="Aptos" w:asciiTheme="majorHAnsi" w:hAnsiTheme="majorHAnsi" w:eastAsiaTheme="majorEastAsia" w:csTheme="majorBidi"/>
+          <w:rFonts w:ascii="Aptos" w:hAnsi="Aptos" w:eastAsia="Aptos" w:cs="Aptos" w:asciiTheme="majorHAnsi" w:hAnsiTheme="majorHAnsi" w:eastAsiaTheme="majorEastAsia"/>
           <w:b/>
           <w:bCs/>
           <w:color w:val="176B87"/>
@@ -4650,7 +4682,7 @@
             <w:r/>
             <w:r>
               <w:rPr>
-                <w:rFonts w:ascii="Aptos" w:hAnsi="Aptos" w:eastAsia="Aptos" w:cs="Aptos" w:csTheme="minorBidi"/>
+                <w:rFonts w:ascii="Aptos" w:hAnsi="Aptos" w:eastAsia="Aptos" w:cs="Aptos"/>
                 <w:b/>
                 <w:bCs/>
                 <w:color w:val="FFFFFF"/>
@@ -4680,7 +4712,7 @@
             <w:r/>
             <w:r>
               <w:rPr>
-                <w:rFonts w:ascii="Aptos" w:hAnsi="Aptos" w:eastAsia="Aptos" w:cs="Aptos" w:csTheme="minorBidi"/>
+                <w:rFonts w:ascii="Aptos" w:hAnsi="Aptos" w:eastAsia="Aptos" w:cs="Aptos"/>
                 <w:b/>
                 <w:bCs/>
                 <w:color w:val="FFFFFF"/>
@@ -4715,7 +4747,7 @@
             <w:r/>
             <w:r>
               <w:rPr>
-                <w:rFonts w:ascii="Aptos" w:hAnsi="Aptos" w:eastAsia="Aptos" w:cs="Aptos" w:csTheme="minorBidi"/>
+                <w:rFonts w:ascii="Aptos" w:hAnsi="Aptos" w:eastAsia="Aptos" w:cs="Aptos"/>
                 <w:color w:val="23313F"/>
                 <w:sz w:val="16"/>
                 <w:szCs w:val="22"/>
@@ -4743,7 +4775,7 @@
             <w:r/>
             <w:r>
               <w:rPr>
-                <w:rFonts w:ascii="Aptos" w:hAnsi="Aptos" w:eastAsia="Aptos" w:cs="Aptos" w:csTheme="minorBidi"/>
+                <w:rFonts w:ascii="Aptos" w:hAnsi="Aptos" w:eastAsia="Aptos" w:cs="Aptos"/>
                 <w:color w:val="23313F"/>
                 <w:sz w:val="16"/>
                 <w:szCs w:val="22"/>
@@ -4776,7 +4808,7 @@
             <w:r/>
             <w:r>
               <w:rPr>
-                <w:rFonts w:ascii="Aptos" w:hAnsi="Aptos" w:eastAsia="Aptos" w:cs="Aptos" w:csTheme="minorBidi"/>
+                <w:rFonts w:ascii="Aptos" w:hAnsi="Aptos" w:eastAsia="Aptos" w:cs="Aptos"/>
                 <w:color w:val="23313F"/>
                 <w:sz w:val="16"/>
                 <w:szCs w:val="22"/>
@@ -4804,7 +4836,7 @@
             <w:r/>
             <w:r>
               <w:rPr>
-                <w:rFonts w:ascii="Aptos" w:hAnsi="Aptos" w:eastAsia="Aptos" w:cs="Aptos" w:csTheme="minorBidi"/>
+                <w:rFonts w:ascii="Aptos" w:hAnsi="Aptos" w:eastAsia="Aptos" w:cs="Aptos"/>
                 <w:color w:val="23313F"/>
                 <w:sz w:val="16"/>
                 <w:szCs w:val="22"/>
@@ -4837,7 +4869,7 @@
             <w:r/>
             <w:r>
               <w:rPr>
-                <w:rFonts w:ascii="Aptos" w:hAnsi="Aptos" w:eastAsia="Aptos" w:cs="Aptos" w:csTheme="minorBidi"/>
+                <w:rFonts w:ascii="Aptos" w:hAnsi="Aptos" w:eastAsia="Aptos" w:cs="Aptos"/>
                 <w:color w:val="23313F"/>
                 <w:sz w:val="16"/>
                 <w:szCs w:val="22"/>
@@ -4865,7 +4897,7 @@
             <w:r/>
             <w:r>
               <w:rPr>
-                <w:rFonts w:ascii="Aptos" w:hAnsi="Aptos" w:eastAsia="Aptos" w:cs="Aptos" w:csTheme="minorBidi"/>
+                <w:rFonts w:ascii="Aptos" w:hAnsi="Aptos" w:eastAsia="Aptos" w:cs="Aptos"/>
                 <w:color w:val="23313F"/>
                 <w:sz w:val="16"/>
                 <w:szCs w:val="22"/>
@@ -4898,7 +4930,7 @@
             <w:r/>
             <w:r>
               <w:rPr>
-                <w:rFonts w:ascii="Aptos" w:hAnsi="Aptos" w:eastAsia="Aptos" w:cs="Aptos" w:csTheme="minorBidi"/>
+                <w:rFonts w:ascii="Aptos" w:hAnsi="Aptos" w:eastAsia="Aptos" w:cs="Aptos"/>
                 <w:color w:val="23313F"/>
                 <w:sz w:val="16"/>
                 <w:szCs w:val="22"/>
@@ -4926,7 +4958,7 @@
             <w:r/>
             <w:r>
               <w:rPr>
-                <w:rFonts w:ascii="Aptos" w:hAnsi="Aptos" w:eastAsia="Aptos" w:cs="Aptos" w:csTheme="minorBidi"/>
+                <w:rFonts w:ascii="Aptos" w:hAnsi="Aptos" w:eastAsia="Aptos" w:cs="Aptos"/>
                 <w:color w:val="23313F"/>
                 <w:sz w:val="16"/>
                 <w:szCs w:val="22"/>
@@ -4959,7 +4991,7 @@
             <w:r/>
             <w:r>
               <w:rPr>
-                <w:rFonts w:ascii="Aptos" w:hAnsi="Aptos" w:eastAsia="Aptos" w:cs="Aptos" w:csTheme="minorBidi"/>
+                <w:rFonts w:ascii="Aptos" w:hAnsi="Aptos" w:eastAsia="Aptos" w:cs="Aptos"/>
                 <w:color w:val="23313F"/>
                 <w:sz w:val="16"/>
                 <w:szCs w:val="22"/>
@@ -4987,7 +5019,7 @@
             <w:r/>
             <w:r>
               <w:rPr>
-                <w:rFonts w:ascii="Aptos" w:hAnsi="Aptos" w:eastAsia="Aptos" w:cs="Aptos" w:csTheme="minorBidi"/>
+                <w:rFonts w:ascii="Aptos" w:hAnsi="Aptos" w:eastAsia="Aptos" w:cs="Aptos"/>
                 <w:color w:val="23313F"/>
                 <w:sz w:val="16"/>
                 <w:szCs w:val="22"/>
@@ -5020,7 +5052,7 @@
             <w:r/>
             <w:r>
               <w:rPr>
-                <w:rFonts w:ascii="Aptos" w:hAnsi="Aptos" w:eastAsia="Aptos" w:cs="Aptos" w:csTheme="minorBidi"/>
+                <w:rFonts w:ascii="Aptos" w:hAnsi="Aptos" w:eastAsia="Aptos" w:cs="Aptos"/>
                 <w:color w:val="23313F"/>
                 <w:sz w:val="16"/>
                 <w:szCs w:val="22"/>
@@ -5048,7 +5080,7 @@
             <w:r/>
             <w:r>
               <w:rPr>
-                <w:rFonts w:ascii="Aptos" w:hAnsi="Aptos" w:eastAsia="Aptos" w:cs="Aptos" w:csTheme="minorBidi"/>
+                <w:rFonts w:ascii="Aptos" w:hAnsi="Aptos" w:eastAsia="Aptos" w:cs="Aptos"/>
                 <w:color w:val="23313F"/>
                 <w:sz w:val="16"/>
                 <w:szCs w:val="22"/>
@@ -5070,7 +5102,7 @@
       </w:pPr>
       <w:r>
         <w:rPr>
-          <w:rFonts w:ascii="Aptos" w:hAnsi="Aptos" w:eastAsia="Aptos" w:cs="Aptos" w:asciiTheme="majorHAnsi" w:hAnsiTheme="majorHAnsi" w:eastAsiaTheme="majorEastAsia" w:csTheme="majorBidi"/>
+          <w:rFonts w:ascii="Aptos" w:hAnsi="Aptos" w:eastAsia="Aptos" w:cs="Aptos" w:asciiTheme="majorHAnsi" w:hAnsiTheme="majorHAnsi" w:eastAsiaTheme="majorEastAsia"/>
           <w:b/>
           <w:bCs/>
           <w:color w:val="176B87"/>
@@ -5121,7 +5153,7 @@
             <w:r/>
             <w:r>
               <w:rPr>
-                <w:rFonts w:ascii="Aptos" w:hAnsi="Aptos" w:eastAsia="Aptos" w:cs="Aptos" w:csTheme="minorBidi"/>
+                <w:rFonts w:ascii="Aptos" w:hAnsi="Aptos" w:eastAsia="Aptos" w:cs="Aptos"/>
                 <w:b/>
                 <w:bCs/>
                 <w:color w:val="FFFFFF"/>
@@ -5151,7 +5183,7 @@
             <w:r/>
             <w:r>
               <w:rPr>
-                <w:rFonts w:ascii="Aptos" w:hAnsi="Aptos" w:eastAsia="Aptos" w:cs="Aptos" w:csTheme="minorBidi"/>
+                <w:rFonts w:ascii="Aptos" w:hAnsi="Aptos" w:eastAsia="Aptos" w:cs="Aptos"/>
                 <w:b/>
                 <w:bCs/>
                 <w:color w:val="FFFFFF"/>
@@ -5181,7 +5213,7 @@
             <w:r/>
             <w:r>
               <w:rPr>
-                <w:rFonts w:ascii="Aptos" w:hAnsi="Aptos" w:eastAsia="Aptos" w:cs="Aptos" w:csTheme="minorBidi"/>
+                <w:rFonts w:ascii="Aptos" w:hAnsi="Aptos" w:eastAsia="Aptos" w:cs="Aptos"/>
                 <w:b/>
                 <w:bCs/>
                 <w:color w:val="FFFFFF"/>
@@ -5216,7 +5248,7 @@
             <w:r/>
             <w:r>
               <w:rPr>
-                <w:rFonts w:ascii="Aptos" w:hAnsi="Aptos" w:eastAsia="Aptos" w:cs="Aptos" w:csTheme="minorBidi"/>
+                <w:rFonts w:ascii="Aptos" w:hAnsi="Aptos" w:eastAsia="Aptos" w:cs="Aptos"/>
                 <w:color w:val="23313F"/>
                 <w:sz w:val="16"/>
                 <w:szCs w:val="22"/>
@@ -5244,7 +5276,7 @@
             <w:r/>
             <w:r>
               <w:rPr>
-                <w:rFonts w:ascii="Aptos" w:hAnsi="Aptos" w:eastAsia="Aptos" w:cs="Aptos" w:csTheme="minorBidi"/>
+                <w:rFonts w:ascii="Aptos" w:hAnsi="Aptos" w:eastAsia="Aptos" w:cs="Aptos"/>
                 <w:color w:val="23313F"/>
                 <w:sz w:val="16"/>
                 <w:szCs w:val="22"/>
@@ -5272,7 +5304,7 @@
             <w:r/>
             <w:r>
               <w:rPr>
-                <w:rFonts w:ascii="Aptos" w:hAnsi="Aptos" w:eastAsia="Aptos" w:cs="Aptos" w:csTheme="minorBidi"/>
+                <w:rFonts w:ascii="Aptos" w:hAnsi="Aptos" w:eastAsia="Aptos" w:cs="Aptos"/>
                 <w:color w:val="23313F"/>
                 <w:sz w:val="16"/>
                 <w:szCs w:val="22"/>
@@ -5305,7 +5337,7 @@
             <w:r/>
             <w:r>
               <w:rPr>
-                <w:rFonts w:ascii="Aptos" w:hAnsi="Aptos" w:eastAsia="Aptos" w:cs="Aptos" w:csTheme="minorBidi"/>
+                <w:rFonts w:ascii="Aptos" w:hAnsi="Aptos" w:eastAsia="Aptos" w:cs="Aptos"/>
                 <w:color w:val="23313F"/>
                 <w:sz w:val="16"/>
                 <w:szCs w:val="22"/>
@@ -5333,7 +5365,7 @@
             <w:r/>
             <w:r>
               <w:rPr>
-                <w:rFonts w:ascii="Aptos" w:hAnsi="Aptos" w:eastAsia="Aptos" w:cs="Aptos" w:csTheme="minorBidi"/>
+                <w:rFonts w:ascii="Aptos" w:hAnsi="Aptos" w:eastAsia="Aptos" w:cs="Aptos"/>
                 <w:color w:val="23313F"/>
                 <w:sz w:val="16"/>
                 <w:szCs w:val="22"/>
@@ -5361,7 +5393,7 @@
             <w:r/>
             <w:r>
               <w:rPr>
-                <w:rFonts w:ascii="Aptos" w:hAnsi="Aptos" w:eastAsia="Aptos" w:cs="Aptos" w:csTheme="minorBidi"/>
+                <w:rFonts w:ascii="Aptos" w:hAnsi="Aptos" w:eastAsia="Aptos" w:cs="Aptos"/>
                 <w:color w:val="23313F"/>
                 <w:sz w:val="16"/>
                 <w:szCs w:val="22"/>
@@ -5394,7 +5426,7 @@
             <w:r/>
             <w:r>
               <w:rPr>
-                <w:rFonts w:ascii="Aptos" w:hAnsi="Aptos" w:eastAsia="Aptos" w:cs="Aptos" w:csTheme="minorBidi"/>
+                <w:rFonts w:ascii="Aptos" w:hAnsi="Aptos" w:eastAsia="Aptos" w:cs="Aptos"/>
                 <w:color w:val="23313F"/>
                 <w:sz w:val="16"/>
                 <w:szCs w:val="22"/>
@@ -5422,7 +5454,7 @@
             <w:r/>
             <w:r>
               <w:rPr>
-                <w:rFonts w:ascii="Aptos" w:hAnsi="Aptos" w:eastAsia="Aptos" w:cs="Aptos" w:csTheme="minorBidi"/>
+                <w:rFonts w:ascii="Aptos" w:hAnsi="Aptos" w:eastAsia="Aptos" w:cs="Aptos"/>
                 <w:color w:val="23313F"/>
                 <w:sz w:val="16"/>
                 <w:szCs w:val="22"/>
@@ -5450,7 +5482,7 @@
             <w:r/>
             <w:r>
               <w:rPr>
-                <w:rFonts w:ascii="Aptos" w:hAnsi="Aptos" w:eastAsia="Aptos" w:cs="Aptos" w:csTheme="minorBidi"/>
+                <w:rFonts w:ascii="Aptos" w:hAnsi="Aptos" w:eastAsia="Aptos" w:cs="Aptos"/>
                 <w:color w:val="23313F"/>
                 <w:sz w:val="16"/>
                 <w:szCs w:val="22"/>
@@ -5483,7 +5515,7 @@
             <w:r/>
             <w:r>
               <w:rPr>
-                <w:rFonts w:ascii="Aptos" w:hAnsi="Aptos" w:eastAsia="Aptos" w:cs="Aptos" w:csTheme="minorBidi"/>
+                <w:rFonts w:ascii="Aptos" w:hAnsi="Aptos" w:eastAsia="Aptos" w:cs="Aptos"/>
                 <w:color w:val="23313F"/>
                 <w:sz w:val="16"/>
                 <w:szCs w:val="22"/>
@@ -5511,7 +5543,7 @@
             <w:r/>
             <w:r>
               <w:rPr>
-                <w:rFonts w:ascii="Aptos" w:hAnsi="Aptos" w:eastAsia="Aptos" w:cs="Aptos" w:csTheme="minorBidi"/>
+                <w:rFonts w:ascii="Aptos" w:hAnsi="Aptos" w:eastAsia="Aptos" w:cs="Aptos"/>
                 <w:color w:val="23313F"/>
                 <w:sz w:val="16"/>
                 <w:szCs w:val="22"/>
@@ -5539,7 +5571,7 @@
             <w:r/>
             <w:r>
               <w:rPr>
-                <w:rFonts w:ascii="Aptos" w:hAnsi="Aptos" w:eastAsia="Aptos" w:cs="Aptos" w:csTheme="minorBidi"/>
+                <w:rFonts w:ascii="Aptos" w:hAnsi="Aptos" w:eastAsia="Aptos" w:cs="Aptos"/>
                 <w:color w:val="23313F"/>
                 <w:sz w:val="16"/>
                 <w:szCs w:val="22"/>
@@ -5572,7 +5604,7 @@
             <w:r/>
             <w:r>
               <w:rPr>
-                <w:rFonts w:ascii="Aptos" w:hAnsi="Aptos" w:eastAsia="Aptos" w:cs="Aptos" w:csTheme="minorBidi"/>
+                <w:rFonts w:ascii="Aptos" w:hAnsi="Aptos" w:eastAsia="Aptos" w:cs="Aptos"/>
                 <w:color w:val="23313F"/>
                 <w:sz w:val="16"/>
                 <w:szCs w:val="22"/>
@@ -5600,7 +5632,7 @@
             <w:r/>
             <w:r>
               <w:rPr>
-                <w:rFonts w:ascii="Aptos" w:hAnsi="Aptos" w:eastAsia="Aptos" w:cs="Aptos" w:csTheme="minorBidi"/>
+                <w:rFonts w:ascii="Aptos" w:hAnsi="Aptos" w:eastAsia="Aptos" w:cs="Aptos"/>
                 <w:color w:val="23313F"/>
                 <w:sz w:val="16"/>
                 <w:szCs w:val="22"/>
@@ -5628,7 +5660,7 @@
             <w:r/>
             <w:r>
               <w:rPr>
-                <w:rFonts w:ascii="Aptos" w:hAnsi="Aptos" w:eastAsia="Aptos" w:cs="Aptos" w:csTheme="minorBidi"/>
+                <w:rFonts w:ascii="Aptos" w:hAnsi="Aptos" w:eastAsia="Aptos" w:cs="Aptos"/>
                 <w:color w:val="23313F"/>
                 <w:sz w:val="16"/>
                 <w:szCs w:val="22"/>
@@ -5661,7 +5693,7 @@
             <w:r/>
             <w:r>
               <w:rPr>
-                <w:rFonts w:ascii="Aptos" w:hAnsi="Aptos" w:eastAsia="Aptos" w:cs="Aptos" w:csTheme="minorBidi"/>
+                <w:rFonts w:ascii="Aptos" w:hAnsi="Aptos" w:eastAsia="Aptos" w:cs="Aptos"/>
                 <w:color w:val="23313F"/>
                 <w:sz w:val="16"/>
                 <w:szCs w:val="22"/>
@@ -5689,7 +5721,7 @@
             <w:r/>
             <w:r>
               <w:rPr>
-                <w:rFonts w:ascii="Aptos" w:hAnsi="Aptos" w:eastAsia="Aptos" w:cs="Aptos" w:csTheme="minorBidi"/>
+                <w:rFonts w:ascii="Aptos" w:hAnsi="Aptos" w:eastAsia="Aptos" w:cs="Aptos"/>
                 <w:color w:val="23313F"/>
                 <w:sz w:val="16"/>
                 <w:szCs w:val="22"/>
@@ -5717,7 +5749,7 @@
             <w:r/>
             <w:r>
               <w:rPr>
-                <w:rFonts w:ascii="Aptos" w:hAnsi="Aptos" w:eastAsia="Aptos" w:cs="Aptos" w:csTheme="minorBidi"/>
+                <w:rFonts w:ascii="Aptos" w:hAnsi="Aptos" w:eastAsia="Aptos" w:cs="Aptos"/>
                 <w:color w:val="23313F"/>
                 <w:sz w:val="16"/>
                 <w:szCs w:val="22"/>
@@ -5750,7 +5782,7 @@
             <w:r/>
             <w:r>
               <w:rPr>
-                <w:rFonts w:ascii="Aptos" w:hAnsi="Aptos" w:eastAsia="Aptos" w:cs="Aptos" w:csTheme="minorBidi"/>
+                <w:rFonts w:ascii="Aptos" w:hAnsi="Aptos" w:eastAsia="Aptos" w:cs="Aptos"/>
                 <w:color w:val="23313F"/>
                 <w:sz w:val="16"/>
                 <w:szCs w:val="22"/>
@@ -5778,7 +5810,7 @@
             <w:r/>
             <w:r>
               <w:rPr>
-                <w:rFonts w:ascii="Aptos" w:hAnsi="Aptos" w:eastAsia="Aptos" w:cs="Aptos" w:csTheme="minorBidi"/>
+                <w:rFonts w:ascii="Aptos" w:hAnsi="Aptos" w:eastAsia="Aptos" w:cs="Aptos"/>
                 <w:color w:val="23313F"/>
                 <w:sz w:val="16"/>
                 <w:szCs w:val="22"/>
@@ -5806,7 +5838,7 @@
             <w:r/>
             <w:r>
               <w:rPr>
-                <w:rFonts w:ascii="Aptos" w:hAnsi="Aptos" w:eastAsia="Aptos" w:cs="Aptos" w:csTheme="minorBidi"/>
+                <w:rFonts w:ascii="Aptos" w:hAnsi="Aptos" w:eastAsia="Aptos" w:cs="Aptos"/>
                 <w:color w:val="23313F"/>
                 <w:sz w:val="16"/>
                 <w:szCs w:val="22"/>
@@ -5828,7 +5860,7 @@
       </w:pPr>
       <w:r>
         <w:rPr>
-          <w:rFonts w:ascii="Aptos" w:hAnsi="Aptos" w:eastAsia="Aptos" w:cs="Aptos" w:asciiTheme="majorHAnsi" w:hAnsiTheme="majorHAnsi" w:eastAsiaTheme="majorEastAsia" w:csTheme="majorBidi"/>
+          <w:rFonts w:ascii="Aptos" w:hAnsi="Aptos" w:eastAsia="Aptos" w:cs="Aptos" w:asciiTheme="majorHAnsi" w:hAnsiTheme="majorHAnsi" w:eastAsiaTheme="majorEastAsia"/>
           <w:b/>
           <w:bCs/>
           <w:color w:val="176B87"/>
@@ -5844,7 +5876,7 @@
       </w:pPr>
       <w:r>
         <w:rPr>
-          <w:rFonts w:ascii="Aptos" w:hAnsi="Aptos" w:eastAsia="Aptos" w:cs="Aptos" w:csTheme="minorBidi"/>
+          <w:rFonts w:ascii="Aptos" w:hAnsi="Aptos" w:eastAsia="Aptos" w:cs="Aptos"/>
           <w:color w:val="23313F"/>
           <w:sz w:val="19"/>
           <w:szCs w:val="22"/>
@@ -5858,7 +5890,7 @@
       </w:pPr>
       <w:r>
         <w:rPr>
-          <w:rFonts w:ascii="Aptos Display" w:hAnsi="Aptos Display" w:eastAsia="Aptos Display" w:cs="Aptos Display" w:asciiTheme="majorHAnsi" w:hAnsiTheme="majorHAnsi" w:eastAsiaTheme="majorEastAsia" w:csTheme="majorBidi"/>
+          <w:rFonts w:ascii="Aptos Display" w:hAnsi="Aptos Display" w:eastAsia="Aptos Display" w:cs="Aptos Display" w:asciiTheme="majorHAnsi" w:hAnsiTheme="majorHAnsi" w:eastAsiaTheme="majorEastAsia"/>
           <w:b/>
           <w:bCs/>
           <w:color w:val="17324D"/>
@@ -5909,7 +5941,7 @@
             <w:r/>
             <w:r>
               <w:rPr>
-                <w:rFonts w:ascii="Aptos" w:hAnsi="Aptos" w:eastAsia="Aptos" w:cs="Aptos" w:csTheme="minorBidi"/>
+                <w:rFonts w:ascii="Aptos" w:hAnsi="Aptos" w:eastAsia="Aptos" w:cs="Aptos"/>
                 <w:b/>
                 <w:bCs/>
                 <w:color w:val="FFFFFF"/>
@@ -5939,7 +5971,7 @@
             <w:r/>
             <w:r>
               <w:rPr>
-                <w:rFonts w:ascii="Aptos" w:hAnsi="Aptos" w:eastAsia="Aptos" w:cs="Aptos" w:csTheme="minorBidi"/>
+                <w:rFonts w:ascii="Aptos" w:hAnsi="Aptos" w:eastAsia="Aptos" w:cs="Aptos"/>
                 <w:b/>
                 <w:bCs/>
                 <w:color w:val="FFFFFF"/>
@@ -5969,7 +6001,7 @@
             <w:r/>
             <w:r>
               <w:rPr>
-                <w:rFonts w:ascii="Aptos" w:hAnsi="Aptos" w:eastAsia="Aptos" w:cs="Aptos" w:csTheme="minorBidi"/>
+                <w:rFonts w:ascii="Aptos" w:hAnsi="Aptos" w:eastAsia="Aptos" w:cs="Aptos"/>
                 <w:b/>
                 <w:bCs/>
                 <w:color w:val="FFFFFF"/>
@@ -6004,7 +6036,7 @@
             <w:r/>
             <w:r>
               <w:rPr>
-                <w:rFonts w:ascii="Aptos" w:hAnsi="Aptos" w:eastAsia="Aptos" w:cs="Aptos" w:csTheme="minorBidi"/>
+                <w:rFonts w:ascii="Aptos" w:hAnsi="Aptos" w:eastAsia="Aptos" w:cs="Aptos"/>
                 <w:color w:val="23313F"/>
                 <w:sz w:val="16"/>
                 <w:szCs w:val="22"/>
@@ -6032,7 +6064,7 @@
             <w:r/>
             <w:r>
               <w:rPr>
-                <w:rFonts w:ascii="Aptos" w:hAnsi="Aptos" w:eastAsia="Aptos" w:cs="Aptos" w:csTheme="minorBidi"/>
+                <w:rFonts w:ascii="Aptos" w:hAnsi="Aptos" w:eastAsia="Aptos" w:cs="Aptos"/>
                 <w:color w:val="23313F"/>
                 <w:sz w:val="16"/>
                 <w:szCs w:val="22"/>
@@ -6060,7 +6092,7 @@
             <w:r/>
             <w:r>
               <w:rPr>
-                <w:rFonts w:ascii="Aptos" w:hAnsi="Aptos" w:eastAsia="Aptos" w:cs="Aptos" w:csTheme="minorBidi"/>
+                <w:rFonts w:ascii="Aptos" w:hAnsi="Aptos" w:eastAsia="Aptos" w:cs="Aptos"/>
                 <w:color w:val="23313F"/>
                 <w:sz w:val="16"/>
                 <w:szCs w:val="22"/>
@@ -6093,7 +6125,7 @@
             <w:r/>
             <w:r>
               <w:rPr>
-                <w:rFonts w:ascii="Aptos" w:hAnsi="Aptos" w:eastAsia="Aptos" w:cs="Aptos" w:csTheme="minorBidi"/>
+                <w:rFonts w:ascii="Aptos" w:hAnsi="Aptos" w:eastAsia="Aptos" w:cs="Aptos"/>
                 <w:color w:val="23313F"/>
                 <w:sz w:val="16"/>
                 <w:szCs w:val="22"/>
@@ -6121,7 +6153,7 @@
             <w:r/>
             <w:r>
               <w:rPr>
-                <w:rFonts w:ascii="Aptos" w:hAnsi="Aptos" w:eastAsia="Aptos" w:cs="Aptos" w:csTheme="minorBidi"/>
+                <w:rFonts w:ascii="Aptos" w:hAnsi="Aptos" w:eastAsia="Aptos" w:cs="Aptos"/>
                 <w:color w:val="23313F"/>
                 <w:sz w:val="16"/>
                 <w:szCs w:val="22"/>
@@ -6149,7 +6181,7 @@
             <w:r/>
             <w:r>
               <w:rPr>
-                <w:rFonts w:ascii="Aptos" w:hAnsi="Aptos" w:eastAsia="Aptos" w:cs="Aptos" w:csTheme="minorBidi"/>
+                <w:rFonts w:ascii="Aptos" w:hAnsi="Aptos" w:eastAsia="Aptos" w:cs="Aptos"/>
                 <w:color w:val="23313F"/>
                 <w:sz w:val="16"/>
                 <w:szCs w:val="22"/>
@@ -6182,7 +6214,7 @@
             <w:r/>
             <w:r>
               <w:rPr>
-                <w:rFonts w:ascii="Aptos" w:hAnsi="Aptos" w:eastAsia="Aptos" w:cs="Aptos" w:csTheme="minorBidi"/>
+                <w:rFonts w:ascii="Aptos" w:hAnsi="Aptos" w:eastAsia="Aptos" w:cs="Aptos"/>
                 <w:color w:val="23313F"/>
                 <w:sz w:val="16"/>
                 <w:szCs w:val="22"/>
@@ -6210,7 +6242,7 @@
             <w:r/>
             <w:r>
               <w:rPr>
-                <w:rFonts w:ascii="Aptos" w:hAnsi="Aptos" w:eastAsia="Aptos" w:cs="Aptos" w:csTheme="minorBidi"/>
+                <w:rFonts w:ascii="Aptos" w:hAnsi="Aptos" w:eastAsia="Aptos" w:cs="Aptos"/>
                 <w:color w:val="23313F"/>
                 <w:sz w:val="16"/>
                 <w:szCs w:val="22"/>
@@ -6238,7 +6270,7 @@
             <w:r/>
             <w:r>
               <w:rPr>
-                <w:rFonts w:ascii="Aptos" w:hAnsi="Aptos" w:eastAsia="Aptos" w:cs="Aptos" w:csTheme="minorBidi"/>
+                <w:rFonts w:ascii="Aptos" w:hAnsi="Aptos" w:eastAsia="Aptos" w:cs="Aptos"/>
                 <w:color w:val="23313F"/>
                 <w:sz w:val="16"/>
                 <w:szCs w:val="22"/>
@@ -6271,7 +6303,7 @@
             <w:r/>
             <w:r>
               <w:rPr>
-                <w:rFonts w:ascii="Aptos" w:hAnsi="Aptos" w:eastAsia="Aptos" w:cs="Aptos" w:csTheme="minorBidi"/>
+                <w:rFonts w:ascii="Aptos" w:hAnsi="Aptos" w:eastAsia="Aptos" w:cs="Aptos"/>
                 <w:color w:val="23313F"/>
                 <w:sz w:val="16"/>
                 <w:szCs w:val="22"/>
@@ -6299,7 +6331,7 @@
             <w:r/>
             <w:r>
               <w:rPr>
-                <w:rFonts w:ascii="Aptos" w:hAnsi="Aptos" w:eastAsia="Aptos" w:cs="Aptos" w:csTheme="minorBidi"/>
+                <w:rFonts w:ascii="Aptos" w:hAnsi="Aptos" w:eastAsia="Aptos" w:cs="Aptos"/>
                 <w:color w:val="23313F"/>
                 <w:sz w:val="16"/>
                 <w:szCs w:val="22"/>
@@ -6327,7 +6359,7 @@
             <w:r/>
             <w:r>
               <w:rPr>
-                <w:rFonts w:ascii="Aptos" w:hAnsi="Aptos" w:eastAsia="Aptos" w:cs="Aptos" w:csTheme="minorBidi"/>
+                <w:rFonts w:ascii="Aptos" w:hAnsi="Aptos" w:eastAsia="Aptos" w:cs="Aptos"/>
                 <w:color w:val="23313F"/>
                 <w:sz w:val="16"/>
                 <w:szCs w:val="22"/>
@@ -6360,7 +6392,7 @@
             <w:r/>
             <w:r>
               <w:rPr>
-                <w:rFonts w:ascii="Aptos" w:hAnsi="Aptos" w:eastAsia="Aptos" w:cs="Aptos" w:csTheme="minorBidi"/>
+                <w:rFonts w:ascii="Aptos" w:hAnsi="Aptos" w:eastAsia="Aptos" w:cs="Aptos"/>
                 <w:color w:val="23313F"/>
                 <w:sz w:val="16"/>
                 <w:szCs w:val="22"/>
@@ -6388,7 +6420,7 @@
             <w:r/>
             <w:r>
               <w:rPr>
-                <w:rFonts w:ascii="Aptos" w:hAnsi="Aptos" w:eastAsia="Aptos" w:cs="Aptos" w:csTheme="minorBidi"/>
+                <w:rFonts w:ascii="Aptos" w:hAnsi="Aptos" w:eastAsia="Aptos" w:cs="Aptos"/>
                 <w:color w:val="23313F"/>
                 <w:sz w:val="16"/>
                 <w:szCs w:val="22"/>
@@ -6416,7 +6448,7 @@
             <w:r/>
             <w:r>
               <w:rPr>
-                <w:rFonts w:ascii="Aptos" w:hAnsi="Aptos" w:eastAsia="Aptos" w:cs="Aptos" w:csTheme="minorBidi"/>
+                <w:rFonts w:ascii="Aptos" w:hAnsi="Aptos" w:eastAsia="Aptos" w:cs="Aptos"/>
                 <w:color w:val="23313F"/>
                 <w:sz w:val="16"/>
                 <w:szCs w:val="22"/>
@@ -6449,7 +6481,7 @@
             <w:r/>
             <w:r>
               <w:rPr>
-                <w:rFonts w:ascii="Aptos" w:hAnsi="Aptos" w:eastAsia="Aptos" w:cs="Aptos" w:csTheme="minorBidi"/>
+                <w:rFonts w:ascii="Aptos" w:hAnsi="Aptos" w:eastAsia="Aptos" w:cs="Aptos"/>
                 <w:color w:val="23313F"/>
                 <w:sz w:val="16"/>
                 <w:szCs w:val="22"/>
@@ -6477,7 +6509,7 @@
             <w:r/>
             <w:r>
               <w:rPr>
-                <w:rFonts w:ascii="Aptos" w:hAnsi="Aptos" w:eastAsia="Aptos" w:cs="Aptos" w:csTheme="minorBidi"/>
+                <w:rFonts w:ascii="Aptos" w:hAnsi="Aptos" w:eastAsia="Aptos" w:cs="Aptos"/>
                 <w:color w:val="23313F"/>
                 <w:sz w:val="16"/>
                 <w:szCs w:val="22"/>
@@ -6505,7 +6537,7 @@
             <w:r/>
             <w:r>
               <w:rPr>
-                <w:rFonts w:ascii="Aptos" w:hAnsi="Aptos" w:eastAsia="Aptos" w:cs="Aptos" w:csTheme="minorBidi"/>
+                <w:rFonts w:ascii="Aptos" w:hAnsi="Aptos" w:eastAsia="Aptos" w:cs="Aptos"/>
                 <w:color w:val="23313F"/>
                 <w:sz w:val="16"/>
                 <w:szCs w:val="22"/>
@@ -6538,7 +6570,7 @@
             <w:r/>
             <w:r>
               <w:rPr>
-                <w:rFonts w:ascii="Aptos" w:hAnsi="Aptos" w:eastAsia="Aptos" w:cs="Aptos" w:csTheme="minorBidi"/>
+                <w:rFonts w:ascii="Aptos" w:hAnsi="Aptos" w:eastAsia="Aptos" w:cs="Aptos"/>
                 <w:color w:val="23313F"/>
                 <w:sz w:val="16"/>
                 <w:szCs w:val="22"/>
@@ -6566,7 +6598,7 @@
             <w:r/>
             <w:r>
               <w:rPr>
-                <w:rFonts w:ascii="Aptos" w:hAnsi="Aptos" w:eastAsia="Aptos" w:cs="Aptos" w:csTheme="minorBidi"/>
+                <w:rFonts w:ascii="Aptos" w:hAnsi="Aptos" w:eastAsia="Aptos" w:cs="Aptos"/>
                 <w:color w:val="23313F"/>
                 <w:sz w:val="16"/>
                 <w:szCs w:val="22"/>
@@ -6594,7 +6626,7 @@
             <w:r/>
             <w:r>
               <w:rPr>
-                <w:rFonts w:ascii="Aptos" w:hAnsi="Aptos" w:eastAsia="Aptos" w:cs="Aptos" w:csTheme="minorBidi"/>
+                <w:rFonts w:ascii="Aptos" w:hAnsi="Aptos" w:eastAsia="Aptos" w:cs="Aptos"/>
                 <w:color w:val="23313F"/>
                 <w:sz w:val="16"/>
                 <w:szCs w:val="22"/>
@@ -6616,7 +6648,7 @@
       </w:pPr>
       <w:r>
         <w:rPr>
-          <w:rFonts w:ascii="Aptos" w:hAnsi="Aptos" w:eastAsia="Aptos" w:cs="Aptos" w:asciiTheme="majorHAnsi" w:hAnsiTheme="majorHAnsi" w:eastAsiaTheme="majorEastAsia" w:csTheme="majorBidi"/>
+          <w:rFonts w:ascii="Aptos" w:hAnsi="Aptos" w:eastAsia="Aptos" w:cs="Aptos" w:asciiTheme="majorHAnsi" w:hAnsiTheme="majorHAnsi" w:eastAsiaTheme="majorEastAsia"/>
           <w:b/>
           <w:bCs/>
           <w:color w:val="176B87"/>
@@ -6634,7 +6666,7 @@
       </w:pPr>
       <w:r>
         <w:rPr>
-          <w:rFonts w:ascii="Consolas" w:hAnsi="Consolas" w:eastAsia="Consolas" w:cs="Consolas" w:csTheme="minorBidi"/>
+          <w:rFonts w:ascii="Consolas" w:hAnsi="Consolas" w:eastAsia="Consolas" w:cs="Consolas"/>
           <w:color w:val="243746"/>
           <w:sz w:val="16"/>
           <w:szCs w:val="22"/>
@@ -6648,7 +6680,7 @@
       </w:pPr>
       <w:r>
         <w:rPr>
-          <w:rFonts w:ascii="Aptos" w:hAnsi="Aptos" w:eastAsia="Aptos" w:cs="Aptos" w:csTheme="minorBidi"/>
+          <w:rFonts w:ascii="Aptos" w:hAnsi="Aptos" w:eastAsia="Aptos" w:cs="Aptos"/>
           <w:color w:val="23313F"/>
           <w:sz w:val="19"/>
           <w:szCs w:val="22"/>
@@ -6662,7 +6694,7 @@
       </w:pPr>
       <w:r>
         <w:rPr>
-          <w:rFonts w:ascii="Aptos" w:hAnsi="Aptos" w:eastAsia="Aptos" w:cs="Aptos" w:asciiTheme="majorHAnsi" w:hAnsiTheme="majorHAnsi" w:eastAsiaTheme="majorEastAsia" w:csTheme="majorBidi"/>
+          <w:rFonts w:ascii="Aptos" w:hAnsi="Aptos" w:eastAsia="Aptos" w:cs="Aptos" w:asciiTheme="majorHAnsi" w:hAnsiTheme="majorHAnsi" w:eastAsiaTheme="majorEastAsia"/>
           <w:b/>
           <w:bCs/>
           <w:color w:val="176B87"/>
@@ -6680,7 +6712,7 @@
       </w:pPr>
       <w:r>
         <w:rPr>
-          <w:rFonts w:ascii="Consolas" w:hAnsi="Consolas" w:eastAsia="Consolas" w:cs="Consolas" w:csTheme="minorBidi"/>
+          <w:rFonts w:ascii="Consolas" w:hAnsi="Consolas" w:eastAsia="Consolas" w:cs="Consolas"/>
           <w:color w:val="243746"/>
           <w:sz w:val="16"/>
           <w:szCs w:val="22"/>
@@ -6694,7 +6726,7 @@
       </w:pPr>
       <w:r>
         <w:rPr>
-          <w:rFonts w:ascii="Aptos" w:hAnsi="Aptos" w:eastAsia="Aptos" w:cs="Aptos" w:csTheme="minorBidi"/>
+          <w:rFonts w:ascii="Aptos" w:hAnsi="Aptos" w:eastAsia="Aptos" w:cs="Aptos"/>
           <w:color w:val="23313F"/>
           <w:sz w:val="19"/>
           <w:szCs w:val="22"/>
@@ -6708,7 +6740,7 @@
       </w:pPr>
       <w:r>
         <w:rPr>
-          <w:rFonts w:ascii="Aptos" w:hAnsi="Aptos" w:eastAsia="Aptos" w:cs="Aptos" w:asciiTheme="majorHAnsi" w:hAnsiTheme="majorHAnsi" w:eastAsiaTheme="majorEastAsia" w:csTheme="majorBidi"/>
+          <w:rFonts w:ascii="Aptos" w:hAnsi="Aptos" w:eastAsia="Aptos" w:cs="Aptos" w:asciiTheme="majorHAnsi" w:hAnsiTheme="majorHAnsi" w:eastAsiaTheme="majorEastAsia"/>
           <w:b/>
           <w:bCs/>
           <w:color w:val="176B87"/>
@@ -6726,7 +6758,7 @@
       </w:pPr>
       <w:r>
         <w:rPr>
-          <w:rFonts w:ascii="Consolas" w:hAnsi="Consolas" w:eastAsia="Consolas" w:cs="Consolas" w:csTheme="minorBidi"/>
+          <w:rFonts w:ascii="Consolas" w:hAnsi="Consolas" w:eastAsia="Consolas" w:cs="Consolas"/>
           <w:color w:val="243746"/>
           <w:sz w:val="16"/>
           <w:szCs w:val="22"/>
@@ -6742,7 +6774,7 @@
       </w:pPr>
       <w:r>
         <w:rPr>
-          <w:rFonts w:ascii="Consolas" w:hAnsi="Consolas" w:eastAsia="Consolas" w:cs="Consolas" w:csTheme="minorBidi"/>
+          <w:rFonts w:ascii="Consolas" w:hAnsi="Consolas" w:eastAsia="Consolas" w:cs="Consolas"/>
           <w:color w:val="243746"/>
           <w:sz w:val="16"/>
           <w:szCs w:val="22"/>
@@ -6758,7 +6790,7 @@
       </w:pPr>
       <w:r>
         <w:rPr>
-          <w:rFonts w:ascii="Consolas" w:hAnsi="Consolas" w:eastAsia="Consolas" w:cs="Consolas" w:csTheme="minorBidi"/>
+          <w:rFonts w:ascii="Consolas" w:hAnsi="Consolas" w:eastAsia="Consolas" w:cs="Consolas"/>
           <w:color w:val="243746"/>
           <w:sz w:val="16"/>
           <w:szCs w:val="22"/>
@@ -6772,7 +6804,7 @@
       </w:pPr>
       <w:r>
         <w:rPr>
-          <w:rFonts w:ascii="Aptos" w:hAnsi="Aptos" w:eastAsia="Aptos" w:cs="Aptos" w:csTheme="minorBidi"/>
+          <w:rFonts w:ascii="Aptos" w:hAnsi="Aptos" w:eastAsia="Aptos" w:cs="Aptos"/>
           <w:color w:val="23313F"/>
           <w:sz w:val="19"/>
           <w:szCs w:val="22"/>
@@ -6786,7 +6818,7 @@
       </w:pPr>
       <w:r>
         <w:rPr>
-          <w:rFonts w:ascii="Aptos" w:hAnsi="Aptos" w:eastAsia="Aptos" w:cs="Aptos" w:asciiTheme="majorHAnsi" w:hAnsiTheme="majorHAnsi" w:eastAsiaTheme="majorEastAsia" w:csTheme="majorBidi"/>
+          <w:rFonts w:ascii="Aptos" w:hAnsi="Aptos" w:eastAsia="Aptos" w:cs="Aptos" w:asciiTheme="majorHAnsi" w:hAnsiTheme="majorHAnsi" w:eastAsiaTheme="majorEastAsia"/>
           <w:b/>
           <w:bCs/>
           <w:color w:val="176B87"/>
@@ -6802,7 +6834,7 @@
       </w:pPr>
       <w:r>
         <w:rPr>
-          <w:rFonts w:ascii="Aptos" w:hAnsi="Aptos" w:eastAsia="Aptos" w:cs="Aptos" w:csTheme="minorBidi"/>
+          <w:rFonts w:ascii="Aptos" w:hAnsi="Aptos" w:eastAsia="Aptos" w:cs="Aptos"/>
           <w:color w:val="23313F"/>
           <w:sz w:val="19"/>
           <w:szCs w:val="22"/>
@@ -6818,7 +6850,7 @@
       </w:pPr>
       <w:r>
         <w:rPr>
-          <w:rFonts w:ascii="Consolas" w:hAnsi="Consolas" w:eastAsia="Consolas" w:cs="Consolas" w:csTheme="minorBidi"/>
+          <w:rFonts w:ascii="Consolas" w:hAnsi="Consolas" w:eastAsia="Consolas" w:cs="Consolas"/>
           <w:color w:val="243746"/>
           <w:sz w:val="16"/>
           <w:szCs w:val="22"/>
@@ -6834,7 +6866,7 @@
       </w:pPr>
       <w:r>
         <w:rPr>
-          <w:rFonts w:ascii="Consolas" w:hAnsi="Consolas" w:eastAsia="Consolas" w:cs="Consolas" w:csTheme="minorBidi"/>
+          <w:rFonts w:ascii="Consolas" w:hAnsi="Consolas" w:eastAsia="Consolas" w:cs="Consolas"/>
           <w:color w:val="243746"/>
           <w:sz w:val="16"/>
           <w:szCs w:val="22"/>
@@ -6850,7 +6882,7 @@
       </w:pPr>
       <w:r>
         <w:rPr>
-          <w:rFonts w:ascii="Consolas" w:hAnsi="Consolas" w:eastAsia="Consolas" w:cs="Consolas" w:csTheme="minorBidi"/>
+          <w:rFonts w:ascii="Consolas" w:hAnsi="Consolas" w:eastAsia="Consolas" w:cs="Consolas"/>
           <w:color w:val="243746"/>
           <w:sz w:val="16"/>
           <w:szCs w:val="22"/>
@@ -6866,7 +6898,7 @@
       </w:pPr>
       <w:r>
         <w:rPr>
-          <w:rFonts w:ascii="Consolas" w:hAnsi="Consolas" w:eastAsia="Consolas" w:cs="Consolas" w:csTheme="minorBidi"/>
+          <w:rFonts w:ascii="Consolas" w:hAnsi="Consolas" w:eastAsia="Consolas" w:cs="Consolas"/>
           <w:color w:val="243746"/>
           <w:sz w:val="16"/>
           <w:szCs w:val="22"/>
@@ -6882,7 +6914,7 @@
       </w:pPr>
       <w:r>
         <w:rPr>
-          <w:rFonts w:ascii="Consolas" w:hAnsi="Consolas" w:eastAsia="Consolas" w:cs="Consolas" w:csTheme="minorBidi"/>
+          <w:rFonts w:ascii="Consolas" w:hAnsi="Consolas" w:eastAsia="Consolas" w:cs="Consolas"/>
           <w:color w:val="243746"/>
           <w:sz w:val="16"/>
           <w:szCs w:val="22"/>
@@ -6898,7 +6930,7 @@
       </w:pPr>
       <w:r>
         <w:rPr>
-          <w:rFonts w:ascii="Consolas" w:hAnsi="Consolas" w:eastAsia="Consolas" w:cs="Consolas" w:csTheme="minorBidi"/>
+          <w:rFonts w:ascii="Consolas" w:hAnsi="Consolas" w:eastAsia="Consolas" w:cs="Consolas"/>
           <w:color w:val="243746"/>
           <w:sz w:val="16"/>
           <w:szCs w:val="22"/>
@@ -6912,7 +6944,7 @@
       </w:pPr>
       <w:r>
         <w:rPr>
-          <w:rFonts w:ascii="Aptos" w:hAnsi="Aptos" w:eastAsia="Aptos" w:cs="Aptos" w:csTheme="minorBidi"/>
+          <w:rFonts w:ascii="Aptos" w:hAnsi="Aptos" w:eastAsia="Aptos" w:cs="Aptos"/>
           <w:color w:val="23313F"/>
           <w:sz w:val="19"/>
           <w:szCs w:val="22"/>
@@ -6954,7 +6986,7 @@
             <w:r/>
             <w:r>
               <w:rPr>
-                <w:rFonts w:ascii="Aptos" w:hAnsi="Aptos" w:eastAsia="Aptos" w:cs="Aptos" w:csTheme="minorBidi"/>
+                <w:rFonts w:ascii="Aptos" w:hAnsi="Aptos" w:eastAsia="Aptos" w:cs="Aptos"/>
                 <w:b/>
                 <w:bCs/>
                 <w:color w:val="B86616"/>
@@ -6970,7 +7002,7 @@
             </w:pPr>
             <w:r>
               <w:rPr>
-                <w:rFonts w:ascii="Aptos" w:hAnsi="Aptos" w:eastAsia="Aptos" w:cs="Aptos" w:csTheme="minorBidi"/>
+                <w:rFonts w:ascii="Aptos" w:hAnsi="Aptos" w:eastAsia="Aptos" w:cs="Aptos"/>
                 <w:color w:val="23313F"/>
                 <w:sz w:val="18"/>
                 <w:szCs w:val="22"/>
@@ -6992,7 +7024,7 @@
       </w:pPr>
       <w:r>
         <w:rPr>
-          <w:rFonts w:ascii="Aptos Display" w:hAnsi="Aptos Display" w:eastAsia="Aptos Display" w:cs="Aptos Display" w:asciiTheme="majorHAnsi" w:hAnsiTheme="majorHAnsi" w:eastAsiaTheme="majorEastAsia" w:csTheme="majorBidi"/>
+          <w:rFonts w:ascii="Aptos Display" w:hAnsi="Aptos Display" w:eastAsia="Aptos Display" w:cs="Aptos Display" w:asciiTheme="majorHAnsi" w:hAnsiTheme="majorHAnsi" w:eastAsiaTheme="majorEastAsia"/>
           <w:b/>
           <w:bCs/>
           <w:color w:val="17324D"/>
@@ -7042,7 +7074,7 @@
             <w:r/>
             <w:r>
               <w:rPr>
-                <w:rFonts w:ascii="Aptos" w:hAnsi="Aptos" w:eastAsia="Aptos" w:cs="Aptos" w:csTheme="minorBidi"/>
+                <w:rFonts w:ascii="Aptos" w:hAnsi="Aptos" w:eastAsia="Aptos" w:cs="Aptos"/>
                 <w:b/>
                 <w:bCs/>
                 <w:color w:val="FFFFFF"/>
@@ -7072,7 +7104,7 @@
             <w:r/>
             <w:r>
               <w:rPr>
-                <w:rFonts w:ascii="Aptos" w:hAnsi="Aptos" w:eastAsia="Aptos" w:cs="Aptos" w:csTheme="minorBidi"/>
+                <w:rFonts w:ascii="Aptos" w:hAnsi="Aptos" w:eastAsia="Aptos" w:cs="Aptos"/>
                 <w:b/>
                 <w:bCs/>
                 <w:color w:val="FFFFFF"/>
@@ -7107,7 +7139,7 @@
             <w:r/>
             <w:r>
               <w:rPr>
-                <w:rFonts w:ascii="Aptos" w:hAnsi="Aptos" w:eastAsia="Aptos" w:cs="Aptos" w:csTheme="minorBidi"/>
+                <w:rFonts w:ascii="Aptos" w:hAnsi="Aptos" w:eastAsia="Aptos" w:cs="Aptos"/>
                 <w:color w:val="23313F"/>
                 <w:sz w:val="16"/>
                 <w:szCs w:val="22"/>
@@ -7135,7 +7167,7 @@
             <w:r/>
             <w:r>
               <w:rPr>
-                <w:rFonts w:ascii="Aptos" w:hAnsi="Aptos" w:eastAsia="Aptos" w:cs="Aptos" w:csTheme="minorBidi"/>
+                <w:rFonts w:ascii="Aptos" w:hAnsi="Aptos" w:eastAsia="Aptos" w:cs="Aptos"/>
                 <w:color w:val="23313F"/>
                 <w:sz w:val="16"/>
                 <w:szCs w:val="22"/>
@@ -7168,7 +7200,7 @@
             <w:r/>
             <w:r>
               <w:rPr>
-                <w:rFonts w:ascii="Aptos" w:hAnsi="Aptos" w:eastAsia="Aptos" w:cs="Aptos" w:csTheme="minorBidi"/>
+                <w:rFonts w:ascii="Aptos" w:hAnsi="Aptos" w:eastAsia="Aptos" w:cs="Aptos"/>
                 <w:color w:val="23313F"/>
                 <w:sz w:val="16"/>
                 <w:szCs w:val="22"/>
@@ -7196,7 +7228,7 @@
             <w:r/>
             <w:r>
               <w:rPr>
-                <w:rFonts w:ascii="Aptos" w:hAnsi="Aptos" w:eastAsia="Aptos" w:cs="Aptos" w:csTheme="minorBidi"/>
+                <w:rFonts w:ascii="Aptos" w:hAnsi="Aptos" w:eastAsia="Aptos" w:cs="Aptos"/>
                 <w:color w:val="23313F"/>
                 <w:sz w:val="16"/>
                 <w:szCs w:val="22"/>
@@ -7229,7 +7261,7 @@
             <w:r/>
             <w:r>
               <w:rPr>
-                <w:rFonts w:ascii="Aptos" w:hAnsi="Aptos" w:eastAsia="Aptos" w:cs="Aptos" w:csTheme="minorBidi"/>
+                <w:rFonts w:ascii="Aptos" w:hAnsi="Aptos" w:eastAsia="Aptos" w:cs="Aptos"/>
                 <w:color w:val="23313F"/>
                 <w:sz w:val="16"/>
                 <w:szCs w:val="22"/>
@@ -7257,7 +7289,7 @@
             <w:r/>
             <w:r>
               <w:rPr>
-                <w:rFonts w:ascii="Aptos" w:hAnsi="Aptos" w:eastAsia="Aptos" w:cs="Aptos" w:csTheme="minorBidi"/>
+                <w:rFonts w:ascii="Aptos" w:hAnsi="Aptos" w:eastAsia="Aptos" w:cs="Aptos"/>
                 <w:color w:val="23313F"/>
                 <w:sz w:val="16"/>
                 <w:szCs w:val="22"/>
@@ -7290,7 +7322,7 @@
             <w:r/>
             <w:r>
               <w:rPr>
-                <w:rFonts w:ascii="Aptos" w:hAnsi="Aptos" w:eastAsia="Aptos" w:cs="Aptos" w:csTheme="minorBidi"/>
+                <w:rFonts w:ascii="Aptos" w:hAnsi="Aptos" w:eastAsia="Aptos" w:cs="Aptos"/>
                 <w:color w:val="23313F"/>
                 <w:sz w:val="16"/>
                 <w:szCs w:val="22"/>
@@ -7318,7 +7350,7 @@
             <w:r/>
             <w:r>
               <w:rPr>
-                <w:rFonts w:ascii="Aptos" w:hAnsi="Aptos" w:eastAsia="Aptos" w:cs="Aptos" w:csTheme="minorBidi"/>
+                <w:rFonts w:ascii="Aptos" w:hAnsi="Aptos" w:eastAsia="Aptos" w:cs="Aptos"/>
                 <w:color w:val="23313F"/>
                 <w:sz w:val="16"/>
                 <w:szCs w:val="22"/>
@@ -7351,7 +7383,7 @@
             <w:r/>
             <w:r>
               <w:rPr>
-                <w:rFonts w:ascii="Aptos" w:hAnsi="Aptos" w:eastAsia="Aptos" w:cs="Aptos" w:csTheme="minorBidi"/>
+                <w:rFonts w:ascii="Aptos" w:hAnsi="Aptos" w:eastAsia="Aptos" w:cs="Aptos"/>
                 <w:color w:val="23313F"/>
                 <w:sz w:val="16"/>
                 <w:szCs w:val="22"/>
@@ -7379,7 +7411,7 @@
             <w:r/>
             <w:r>
               <w:rPr>
-                <w:rFonts w:ascii="Aptos" w:hAnsi="Aptos" w:eastAsia="Aptos" w:cs="Aptos" w:csTheme="minorBidi"/>
+                <w:rFonts w:ascii="Aptos" w:hAnsi="Aptos" w:eastAsia="Aptos" w:cs="Aptos"/>
                 <w:color w:val="23313F"/>
                 <w:sz w:val="16"/>
                 <w:szCs w:val="22"/>
@@ -7401,7 +7433,7 @@
       </w:pPr>
       <w:r>
         <w:rPr>
-          <w:rFonts w:ascii="Aptos" w:hAnsi="Aptos" w:eastAsia="Aptos" w:cs="Aptos" w:asciiTheme="majorHAnsi" w:hAnsiTheme="majorHAnsi" w:eastAsiaTheme="majorEastAsia" w:csTheme="majorBidi"/>
+          <w:rFonts w:ascii="Aptos" w:hAnsi="Aptos" w:eastAsia="Aptos" w:cs="Aptos" w:asciiTheme="majorHAnsi" w:hAnsiTheme="majorHAnsi" w:eastAsiaTheme="majorEastAsia"/>
           <w:b/>
           <w:bCs/>
           <w:color w:val="176B87"/>
@@ -7419,7 +7451,7 @@
       </w:pPr>
       <w:r>
         <w:rPr>
-          <w:rFonts w:ascii="Aptos" w:hAnsi="Aptos" w:eastAsia="Aptos" w:cs="Aptos" w:csTheme="minorBidi"/>
+          <w:rFonts w:ascii="Aptos" w:hAnsi="Aptos" w:eastAsia="Aptos" w:cs="Aptos"/>
           <w:color w:val="23313F"/>
           <w:sz w:val="19"/>
           <w:szCs w:val="22"/>
@@ -7435,7 +7467,7 @@
       </w:pPr>
       <w:r>
         <w:rPr>
-          <w:rFonts w:ascii="Aptos" w:hAnsi="Aptos" w:eastAsia="Aptos" w:cs="Aptos" w:csTheme="minorBidi"/>
+          <w:rFonts w:ascii="Aptos" w:hAnsi="Aptos" w:eastAsia="Aptos" w:cs="Aptos"/>
           <w:color w:val="23313F"/>
           <w:sz w:val="19"/>
           <w:szCs w:val="22"/>
@@ -7451,7 +7483,7 @@
       </w:pPr>
       <w:r>
         <w:rPr>
-          <w:rFonts w:ascii="Aptos" w:hAnsi="Aptos" w:eastAsia="Aptos" w:cs="Aptos" w:csTheme="minorBidi"/>
+          <w:rFonts w:ascii="Aptos" w:hAnsi="Aptos" w:eastAsia="Aptos" w:cs="Aptos"/>
           <w:color w:val="23313F"/>
           <w:sz w:val="19"/>
           <w:szCs w:val="22"/>
@@ -7467,7 +7499,7 @@
       </w:pPr>
       <w:r>
         <w:rPr>
-          <w:rFonts w:ascii="Aptos" w:hAnsi="Aptos" w:eastAsia="Aptos" w:cs="Aptos" w:csTheme="minorBidi"/>
+          <w:rFonts w:ascii="Aptos" w:hAnsi="Aptos" w:eastAsia="Aptos" w:cs="Aptos"/>
           <w:color w:val="23313F"/>
           <w:sz w:val="19"/>
           <w:szCs w:val="22"/>
@@ -7483,7 +7515,7 @@
       </w:pPr>
       <w:r>
         <w:rPr>
-          <w:rFonts w:ascii="Aptos" w:hAnsi="Aptos" w:eastAsia="Aptos" w:cs="Aptos" w:csTheme="minorBidi"/>
+          <w:rFonts w:ascii="Aptos" w:hAnsi="Aptos" w:eastAsia="Aptos" w:cs="Aptos"/>
           <w:color w:val="23313F"/>
           <w:sz w:val="19"/>
           <w:szCs w:val="22"/>
@@ -7499,7 +7531,7 @@
       </w:pPr>
       <w:r>
         <w:rPr>
-          <w:rFonts w:ascii="Aptos" w:hAnsi="Aptos" w:eastAsia="Aptos" w:cs="Aptos" w:csTheme="minorBidi"/>
+          <w:rFonts w:ascii="Aptos" w:hAnsi="Aptos" w:eastAsia="Aptos" w:cs="Aptos"/>
           <w:color w:val="23313F"/>
           <w:sz w:val="19"/>
           <w:szCs w:val="22"/>
@@ -7513,7 +7545,7 @@
       </w:pPr>
       <w:r>
         <w:rPr>
-          <w:rFonts w:ascii="Aptos Display" w:hAnsi="Aptos Display" w:eastAsia="Aptos Display" w:cs="Aptos Display" w:asciiTheme="majorHAnsi" w:hAnsiTheme="majorHAnsi" w:eastAsiaTheme="majorEastAsia" w:csTheme="majorBidi"/>
+          <w:rFonts w:ascii="Aptos Display" w:hAnsi="Aptos Display" w:eastAsia="Aptos Display" w:cs="Aptos Display" w:asciiTheme="majorHAnsi" w:hAnsiTheme="majorHAnsi" w:eastAsiaTheme="majorEastAsia"/>
           <w:b/>
           <w:bCs/>
           <w:color w:val="17324D"/>
@@ -7531,7 +7563,7 @@
       </w:pPr>
       <w:r>
         <w:rPr>
-          <w:rFonts w:ascii="Aptos" w:hAnsi="Aptos" w:eastAsia="Aptos" w:cs="Aptos" w:csTheme="minorBidi"/>
+          <w:rFonts w:ascii="Aptos" w:hAnsi="Aptos" w:eastAsia="Aptos" w:cs="Aptos"/>
           <w:color w:val="23313F"/>
           <w:sz w:val="19"/>
           <w:szCs w:val="22"/>
@@ -7547,7 +7579,7 @@
       </w:pPr>
       <w:r>
         <w:rPr>
-          <w:rFonts w:ascii="Aptos" w:hAnsi="Aptos" w:eastAsia="Aptos" w:cs="Aptos" w:csTheme="minorBidi"/>
+          <w:rFonts w:ascii="Aptos" w:hAnsi="Aptos" w:eastAsia="Aptos" w:cs="Aptos"/>
           <w:color w:val="23313F"/>
           <w:sz w:val="19"/>
           <w:szCs w:val="22"/>
@@ -7563,7 +7595,7 @@
       </w:pPr>
       <w:r>
         <w:rPr>
-          <w:rFonts w:ascii="Aptos" w:hAnsi="Aptos" w:eastAsia="Aptos" w:cs="Aptos" w:csTheme="minorBidi"/>
+          <w:rFonts w:ascii="Aptos" w:hAnsi="Aptos" w:eastAsia="Aptos" w:cs="Aptos"/>
           <w:color w:val="23313F"/>
           <w:sz w:val="19"/>
           <w:szCs w:val="22"/>
@@ -7579,7 +7611,7 @@
       </w:pPr>
       <w:r>
         <w:rPr>
-          <w:rFonts w:ascii="Aptos" w:hAnsi="Aptos" w:eastAsia="Aptos" w:cs="Aptos" w:csTheme="minorBidi"/>
+          <w:rFonts w:ascii="Aptos" w:hAnsi="Aptos" w:eastAsia="Aptos" w:cs="Aptos"/>
           <w:color w:val="23313F"/>
           <w:sz w:val="19"/>
           <w:szCs w:val="22"/>
@@ -7595,7 +7627,7 @@
       </w:pPr>
       <w:r>
         <w:rPr>
-          <w:rFonts w:ascii="Aptos" w:hAnsi="Aptos" w:eastAsia="Aptos" w:cs="Aptos" w:csTheme="minorBidi"/>
+          <w:rFonts w:ascii="Aptos" w:hAnsi="Aptos" w:eastAsia="Aptos" w:cs="Aptos"/>
           <w:color w:val="23313F"/>
           <w:sz w:val="19"/>
           <w:szCs w:val="22"/>
@@ -7611,7 +7643,7 @@
       </w:pPr>
       <w:r>
         <w:rPr>
-          <w:rFonts w:ascii="Aptos" w:hAnsi="Aptos" w:eastAsia="Aptos" w:cs="Aptos" w:csTheme="minorBidi"/>
+          <w:rFonts w:ascii="Aptos" w:hAnsi="Aptos" w:eastAsia="Aptos" w:cs="Aptos"/>
           <w:color w:val="23313F"/>
           <w:sz w:val="19"/>
           <w:szCs w:val="22"/>
@@ -7627,7 +7659,7 @@
       </w:pPr>
       <w:r>
         <w:rPr>
-          <w:rFonts w:ascii="Aptos" w:hAnsi="Aptos" w:eastAsia="Aptos" w:cs="Aptos" w:csTheme="minorBidi"/>
+          <w:rFonts w:ascii="Aptos" w:hAnsi="Aptos" w:eastAsia="Aptos" w:cs="Aptos"/>
           <w:color w:val="23313F"/>
           <w:sz w:val="19"/>
           <w:szCs w:val="22"/>
@@ -7643,7 +7675,7 @@
       </w:pPr>
       <w:r>
         <w:rPr>
-          <w:rFonts w:ascii="Aptos" w:hAnsi="Aptos" w:eastAsia="Aptos" w:cs="Aptos" w:csTheme="minorBidi"/>
+          <w:rFonts w:ascii="Aptos" w:hAnsi="Aptos" w:eastAsia="Aptos" w:cs="Aptos"/>
           <w:color w:val="23313F"/>
           <w:sz w:val="19"/>
           <w:szCs w:val="22"/>
@@ -7657,7 +7689,7 @@
       </w:pPr>
       <w:r>
         <w:rPr>
-          <w:rFonts w:ascii="Aptos Display" w:hAnsi="Aptos Display" w:eastAsia="Aptos Display" w:cs="Aptos Display" w:asciiTheme="majorHAnsi" w:hAnsiTheme="majorHAnsi" w:eastAsiaTheme="majorEastAsia" w:csTheme="majorBidi"/>
+          <w:rFonts w:ascii="Aptos Display" w:hAnsi="Aptos Display" w:eastAsia="Aptos Display" w:cs="Aptos Display" w:asciiTheme="majorHAnsi" w:hAnsiTheme="majorHAnsi" w:eastAsiaTheme="majorEastAsia"/>
           <w:b/>
           <w:bCs/>
           <w:color w:val="17324D"/>
@@ -7707,7 +7739,7 @@
             <w:r/>
             <w:r>
               <w:rPr>
-                <w:rFonts w:ascii="Aptos" w:hAnsi="Aptos" w:eastAsia="Aptos" w:cs="Aptos" w:csTheme="minorBidi"/>
+                <w:rFonts w:ascii="Aptos" w:hAnsi="Aptos" w:eastAsia="Aptos" w:cs="Aptos"/>
                 <w:b/>
                 <w:bCs/>
                 <w:color w:val="FFFFFF"/>
@@ -7737,7 +7769,7 @@
             <w:r/>
             <w:r>
               <w:rPr>
-                <w:rFonts w:ascii="Aptos" w:hAnsi="Aptos" w:eastAsia="Aptos" w:cs="Aptos" w:csTheme="minorBidi"/>
+                <w:rFonts w:ascii="Aptos" w:hAnsi="Aptos" w:eastAsia="Aptos" w:cs="Aptos"/>
                 <w:b/>
                 <w:bCs/>
                 <w:color w:val="FFFFFF"/>
@@ -7772,7 +7804,7 @@
             <w:r/>
             <w:r>
               <w:rPr>
-                <w:rFonts w:ascii="Aptos" w:hAnsi="Aptos" w:eastAsia="Aptos" w:cs="Aptos" w:csTheme="minorBidi"/>
+                <w:rFonts w:ascii="Aptos" w:hAnsi="Aptos" w:eastAsia="Aptos" w:cs="Aptos"/>
                 <w:color w:val="23313F"/>
                 <w:sz w:val="16"/>
                 <w:szCs w:val="22"/>
@@ -7800,7 +7832,7 @@
             <w:r/>
             <w:r>
               <w:rPr>
-                <w:rFonts w:ascii="Aptos" w:hAnsi="Aptos" w:eastAsia="Aptos" w:cs="Aptos" w:csTheme="minorBidi"/>
+                <w:rFonts w:ascii="Aptos" w:hAnsi="Aptos" w:eastAsia="Aptos" w:cs="Aptos"/>
                 <w:color w:val="23313F"/>
                 <w:sz w:val="16"/>
                 <w:szCs w:val="22"/>
@@ -7833,7 +7865,7 @@
             <w:r/>
             <w:r>
               <w:rPr>
-                <w:rFonts w:ascii="Aptos" w:hAnsi="Aptos" w:eastAsia="Aptos" w:cs="Aptos" w:csTheme="minorBidi"/>
+                <w:rFonts w:ascii="Aptos" w:hAnsi="Aptos" w:eastAsia="Aptos" w:cs="Aptos"/>
                 <w:color w:val="23313F"/>
                 <w:sz w:val="16"/>
                 <w:szCs w:val="22"/>
@@ -7861,7 +7893,7 @@
             <w:r/>
             <w:r>
               <w:rPr>
-                <w:rFonts w:ascii="Aptos" w:hAnsi="Aptos" w:eastAsia="Aptos" w:cs="Aptos" w:csTheme="minorBidi"/>
+                <w:rFonts w:ascii="Aptos" w:hAnsi="Aptos" w:eastAsia="Aptos" w:cs="Aptos"/>
                 <w:color w:val="23313F"/>
                 <w:sz w:val="16"/>
                 <w:szCs w:val="22"/>
@@ -7894,7 +7926,7 @@
             <w:r/>
             <w:r>
               <w:rPr>
-                <w:rFonts w:ascii="Aptos" w:hAnsi="Aptos" w:eastAsia="Aptos" w:cs="Aptos" w:csTheme="minorBidi"/>
+                <w:rFonts w:ascii="Aptos" w:hAnsi="Aptos" w:eastAsia="Aptos" w:cs="Aptos"/>
                 <w:color w:val="23313F"/>
                 <w:sz w:val="16"/>
                 <w:szCs w:val="22"/>
@@ -7922,7 +7954,7 @@
             <w:r/>
             <w:r>
               <w:rPr>
-                <w:rFonts w:ascii="Aptos" w:hAnsi="Aptos" w:eastAsia="Aptos" w:cs="Aptos" w:csTheme="minorBidi"/>
+                <w:rFonts w:ascii="Aptos" w:hAnsi="Aptos" w:eastAsia="Aptos" w:cs="Aptos"/>
                 <w:color w:val="23313F"/>
                 <w:sz w:val="16"/>
                 <w:szCs w:val="22"/>
@@ -7955,7 +7987,7 @@
             <w:r/>
             <w:r>
               <w:rPr>
-                <w:rFonts w:ascii="Aptos" w:hAnsi="Aptos" w:eastAsia="Aptos" w:cs="Aptos" w:csTheme="minorBidi"/>
+                <w:rFonts w:ascii="Aptos" w:hAnsi="Aptos" w:eastAsia="Aptos" w:cs="Aptos"/>
                 <w:color w:val="23313F"/>
                 <w:sz w:val="16"/>
                 <w:szCs w:val="22"/>
@@ -7983,7 +8015,7 @@
             <w:r/>
             <w:r>
               <w:rPr>
-                <w:rFonts w:ascii="Aptos" w:hAnsi="Aptos" w:eastAsia="Aptos" w:cs="Aptos" w:csTheme="minorBidi"/>
+                <w:rFonts w:ascii="Aptos" w:hAnsi="Aptos" w:eastAsia="Aptos" w:cs="Aptos"/>
                 <w:color w:val="23313F"/>
                 <w:sz w:val="16"/>
                 <w:szCs w:val="22"/>
@@ -8016,7 +8048,7 @@
             <w:r/>
             <w:r>
               <w:rPr>
-                <w:rFonts w:ascii="Aptos" w:hAnsi="Aptos" w:eastAsia="Aptos" w:cs="Aptos" w:csTheme="minorBidi"/>
+                <w:rFonts w:ascii="Aptos" w:hAnsi="Aptos" w:eastAsia="Aptos" w:cs="Aptos"/>
                 <w:color w:val="23313F"/>
                 <w:sz w:val="16"/>
                 <w:szCs w:val="22"/>
@@ -8044,7 +8076,7 @@
             <w:r/>
             <w:r>
               <w:rPr>
-                <w:rFonts w:ascii="Aptos" w:hAnsi="Aptos" w:eastAsia="Aptos" w:cs="Aptos" w:csTheme="minorBidi"/>
+                <w:rFonts w:ascii="Aptos" w:hAnsi="Aptos" w:eastAsia="Aptos" w:cs="Aptos"/>
                 <w:color w:val="23313F"/>
                 <w:sz w:val="16"/>
                 <w:szCs w:val="22"/>
@@ -8077,7 +8109,7 @@
             <w:r/>
             <w:r>
               <w:rPr>
-                <w:rFonts w:ascii="Aptos" w:hAnsi="Aptos" w:eastAsia="Aptos" w:cs="Aptos" w:csTheme="minorBidi"/>
+                <w:rFonts w:ascii="Aptos" w:hAnsi="Aptos" w:eastAsia="Aptos" w:cs="Aptos"/>
                 <w:color w:val="23313F"/>
                 <w:sz w:val="16"/>
                 <w:szCs w:val="22"/>
@@ -8105,7 +8137,7 @@
             <w:r/>
             <w:r>
               <w:rPr>
-                <w:rFonts w:ascii="Aptos" w:hAnsi="Aptos" w:eastAsia="Aptos" w:cs="Aptos" w:csTheme="minorBidi"/>
+                <w:rFonts w:ascii="Aptos" w:hAnsi="Aptos" w:eastAsia="Aptos" w:cs="Aptos"/>
                 <w:color w:val="23313F"/>
                 <w:sz w:val="16"/>
                 <w:szCs w:val="22"/>
@@ -8138,7 +8170,7 @@
             <w:r/>
             <w:r>
               <w:rPr>
-                <w:rFonts w:ascii="Aptos" w:hAnsi="Aptos" w:eastAsia="Aptos" w:cs="Aptos" w:csTheme="minorBidi"/>
+                <w:rFonts w:ascii="Aptos" w:hAnsi="Aptos" w:eastAsia="Aptos" w:cs="Aptos"/>
                 <w:color w:val="23313F"/>
                 <w:sz w:val="16"/>
                 <w:szCs w:val="22"/>
@@ -8166,7 +8198,7 @@
             <w:r/>
             <w:r>
               <w:rPr>
-                <w:rFonts w:ascii="Aptos" w:hAnsi="Aptos" w:eastAsia="Aptos" w:cs="Aptos" w:csTheme="minorBidi"/>
+                <w:rFonts w:ascii="Aptos" w:hAnsi="Aptos" w:eastAsia="Aptos" w:cs="Aptos"/>
                 <w:color w:val="23313F"/>
                 <w:sz w:val="16"/>
                 <w:szCs w:val="22"/>
@@ -8199,7 +8231,7 @@
             <w:r/>
             <w:r>
               <w:rPr>
-                <w:rFonts w:ascii="Aptos" w:hAnsi="Aptos" w:eastAsia="Aptos" w:cs="Aptos" w:csTheme="minorBidi"/>
+                <w:rFonts w:ascii="Aptos" w:hAnsi="Aptos" w:eastAsia="Aptos" w:cs="Aptos"/>
                 <w:color w:val="23313F"/>
                 <w:sz w:val="16"/>
                 <w:szCs w:val="22"/>
@@ -8227,7 +8259,7 @@
             <w:r/>
             <w:r>
               <w:rPr>
-                <w:rFonts w:ascii="Aptos" w:hAnsi="Aptos" w:eastAsia="Aptos" w:cs="Aptos" w:csTheme="minorBidi"/>
+                <w:rFonts w:ascii="Aptos" w:hAnsi="Aptos" w:eastAsia="Aptos" w:cs="Aptos"/>
                 <w:color w:val="23313F"/>
                 <w:sz w:val="16"/>
                 <w:szCs w:val="22"/>
@@ -8260,7 +8292,7 @@
             <w:r/>
             <w:r>
               <w:rPr>
-                <w:rFonts w:ascii="Aptos" w:hAnsi="Aptos" w:eastAsia="Aptos" w:cs="Aptos" w:csTheme="minorBidi"/>
+                <w:rFonts w:ascii="Aptos" w:hAnsi="Aptos" w:eastAsia="Aptos" w:cs="Aptos"/>
                 <w:color w:val="23313F"/>
                 <w:sz w:val="16"/>
                 <w:szCs w:val="22"/>
@@ -8288,7 +8320,7 @@
             <w:r/>
             <w:r>
               <w:rPr>
-                <w:rFonts w:ascii="Aptos" w:hAnsi="Aptos" w:eastAsia="Aptos" w:cs="Aptos" w:csTheme="minorBidi"/>
+                <w:rFonts w:ascii="Aptos" w:hAnsi="Aptos" w:eastAsia="Aptos" w:cs="Aptos"/>
                 <w:color w:val="23313F"/>
                 <w:sz w:val="16"/>
                 <w:szCs w:val="22"/>
@@ -8321,7 +8353,7 @@
             <w:r/>
             <w:r>
               <w:rPr>
-                <w:rFonts w:ascii="Aptos" w:hAnsi="Aptos" w:eastAsia="Aptos" w:cs="Aptos" w:csTheme="minorBidi"/>
+                <w:rFonts w:ascii="Aptos" w:hAnsi="Aptos" w:eastAsia="Aptos" w:cs="Aptos"/>
                 <w:color w:val="23313F"/>
                 <w:sz w:val="16"/>
                 <w:szCs w:val="22"/>
@@ -8349,7 +8381,7 @@
             <w:r/>
             <w:r>
               <w:rPr>
-                <w:rFonts w:ascii="Aptos" w:hAnsi="Aptos" w:eastAsia="Aptos" w:cs="Aptos" w:csTheme="minorBidi"/>
+                <w:rFonts w:ascii="Aptos" w:hAnsi="Aptos" w:eastAsia="Aptos" w:cs="Aptos"/>
                 <w:color w:val="23313F"/>
                 <w:sz w:val="16"/>
                 <w:szCs w:val="22"/>
@@ -8371,7 +8403,7 @@
       </w:pPr>
       <w:r>
         <w:rPr>
-          <w:rFonts w:ascii="Aptos" w:hAnsi="Aptos" w:eastAsia="Aptos" w:cs="Aptos" w:asciiTheme="majorHAnsi" w:hAnsiTheme="majorHAnsi" w:eastAsiaTheme="majorEastAsia" w:csTheme="majorBidi"/>
+          <w:rFonts w:ascii="Aptos" w:hAnsi="Aptos" w:eastAsia="Aptos" w:cs="Aptos" w:asciiTheme="majorHAnsi" w:hAnsiTheme="majorHAnsi" w:eastAsiaTheme="majorEastAsia"/>
           <w:b/>
           <w:bCs/>
           <w:color w:val="176B87"/>
@@ -8387,7 +8419,7 @@
       </w:pPr>
       <w:r>
         <w:rPr>
-          <w:rFonts w:ascii="Aptos" w:hAnsi="Aptos" w:eastAsia="Aptos" w:cs="Aptos" w:csTheme="minorBidi"/>
+          <w:rFonts w:ascii="Aptos" w:hAnsi="Aptos" w:eastAsia="Aptos" w:cs="Aptos"/>
           <w:color w:val="23313F"/>
           <w:sz w:val="19"/>
           <w:szCs w:val="22"/>
@@ -8401,7 +8433,7 @@
       </w:pPr>
       <w:r>
         <w:rPr>
-          <w:rFonts w:ascii="Aptos Display" w:hAnsi="Aptos Display" w:eastAsia="Aptos Display" w:cs="Aptos Display" w:asciiTheme="majorHAnsi" w:hAnsiTheme="majorHAnsi" w:eastAsiaTheme="majorEastAsia" w:csTheme="majorBidi"/>
+          <w:rFonts w:ascii="Aptos Display" w:hAnsi="Aptos Display" w:eastAsia="Aptos Display" w:cs="Aptos Display" w:asciiTheme="majorHAnsi" w:hAnsiTheme="majorHAnsi" w:eastAsiaTheme="majorEastAsia"/>
           <w:b/>
           <w:bCs/>
           <w:color w:val="17324D"/>
@@ -8417,7 +8449,7 @@
       </w:pPr>
       <w:r>
         <w:rPr>
-          <w:rFonts w:ascii="Aptos" w:hAnsi="Aptos" w:eastAsia="Aptos" w:cs="Aptos" w:csTheme="minorBidi"/>
+          <w:rFonts w:ascii="Aptos" w:hAnsi="Aptos" w:eastAsia="Aptos" w:cs="Aptos"/>
           <w:color w:val="23313F"/>
           <w:sz w:val="19"/>
           <w:szCs w:val="22"/>
@@ -8467,7 +8499,7 @@
             <w:r/>
             <w:r>
               <w:rPr>
-                <w:rFonts w:ascii="Aptos" w:hAnsi="Aptos" w:eastAsia="Aptos" w:cs="Aptos" w:csTheme="minorBidi"/>
+                <w:rFonts w:ascii="Aptos" w:hAnsi="Aptos" w:eastAsia="Aptos" w:cs="Aptos"/>
                 <w:b/>
                 <w:bCs/>
                 <w:color w:val="FFFFFF"/>
@@ -8497,7 +8529,7 @@
             <w:r/>
             <w:r>
               <w:rPr>
-                <w:rFonts w:ascii="Aptos" w:hAnsi="Aptos" w:eastAsia="Aptos" w:cs="Aptos" w:csTheme="minorBidi"/>
+                <w:rFonts w:ascii="Aptos" w:hAnsi="Aptos" w:eastAsia="Aptos" w:cs="Aptos"/>
                 <w:b/>
                 <w:bCs/>
                 <w:color w:val="FFFFFF"/>
@@ -8527,7 +8559,7 @@
             <w:r/>
             <w:r>
               <w:rPr>
-                <w:rFonts w:ascii="Aptos" w:hAnsi="Aptos" w:eastAsia="Aptos" w:cs="Aptos" w:csTheme="minorBidi"/>
+                <w:rFonts w:ascii="Aptos" w:hAnsi="Aptos" w:eastAsia="Aptos" w:cs="Aptos"/>
                 <w:b/>
                 <w:bCs/>
                 <w:color w:val="FFFFFF"/>
@@ -8557,7 +8589,7 @@
             <w:r/>
             <w:r>
               <w:rPr>
-                <w:rFonts w:ascii="Aptos" w:hAnsi="Aptos" w:eastAsia="Aptos" w:cs="Aptos" w:csTheme="minorBidi"/>
+                <w:rFonts w:ascii="Aptos" w:hAnsi="Aptos" w:eastAsia="Aptos" w:cs="Aptos"/>
                 <w:b/>
                 <w:bCs/>
                 <w:color w:val="FFFFFF"/>
@@ -8592,7 +8624,7 @@
             <w:r/>
             <w:r>
               <w:rPr>
-                <w:rFonts w:ascii="Aptos" w:hAnsi="Aptos" w:eastAsia="Aptos" w:cs="Aptos" w:csTheme="minorBidi"/>
+                <w:rFonts w:ascii="Aptos" w:hAnsi="Aptos" w:eastAsia="Aptos" w:cs="Aptos"/>
                 <w:color w:val="23313F"/>
                 <w:sz w:val="15"/>
                 <w:szCs w:val="22"/>
@@ -8620,7 +8652,7 @@
             <w:r/>
             <w:r>
               <w:rPr>
-                <w:rFonts w:ascii="Aptos" w:hAnsi="Aptos" w:eastAsia="Aptos" w:cs="Aptos" w:csTheme="minorBidi"/>
+                <w:rFonts w:ascii="Aptos" w:hAnsi="Aptos" w:eastAsia="Aptos" w:cs="Aptos"/>
                 <w:color w:val="23313F"/>
                 <w:sz w:val="15"/>
                 <w:szCs w:val="22"/>
@@ -8648,7 +8680,7 @@
             <w:r/>
             <w:r>
               <w:rPr>
-                <w:rFonts w:ascii="Aptos" w:hAnsi="Aptos" w:eastAsia="Aptos" w:cs="Aptos" w:csTheme="minorBidi"/>
+                <w:rFonts w:ascii="Aptos" w:hAnsi="Aptos" w:eastAsia="Aptos" w:cs="Aptos"/>
                 <w:color w:val="23313F"/>
                 <w:sz w:val="15"/>
                 <w:szCs w:val="22"/>
@@ -8676,7 +8708,7 @@
             <w:r/>
             <w:r>
               <w:rPr>
-                <w:rFonts w:ascii="Aptos" w:hAnsi="Aptos" w:eastAsia="Aptos" w:cs="Aptos" w:csTheme="minorBidi"/>
+                <w:rFonts w:ascii="Aptos" w:hAnsi="Aptos" w:eastAsia="Aptos" w:cs="Aptos"/>
                 <w:color w:val="23313F"/>
                 <w:sz w:val="15"/>
                 <w:szCs w:val="22"/>
@@ -8709,7 +8741,7 @@
             <w:r/>
             <w:r>
               <w:rPr>
-                <w:rFonts w:ascii="Aptos" w:hAnsi="Aptos" w:eastAsia="Aptos" w:cs="Aptos" w:csTheme="minorBidi"/>
+                <w:rFonts w:ascii="Aptos" w:hAnsi="Aptos" w:eastAsia="Aptos" w:cs="Aptos"/>
                 <w:color w:val="23313F"/>
                 <w:sz w:val="15"/>
                 <w:szCs w:val="22"/>
@@ -8737,7 +8769,7 @@
             <w:r/>
             <w:r>
               <w:rPr>
-                <w:rFonts w:ascii="Aptos" w:hAnsi="Aptos" w:eastAsia="Aptos" w:cs="Aptos" w:csTheme="minorBidi"/>
+                <w:rFonts w:ascii="Aptos" w:hAnsi="Aptos" w:eastAsia="Aptos" w:cs="Aptos"/>
                 <w:color w:val="23313F"/>
                 <w:sz w:val="15"/>
                 <w:szCs w:val="22"/>
@@ -8765,7 +8797,7 @@
             <w:r/>
             <w:r>
               <w:rPr>
-                <w:rFonts w:ascii="Aptos" w:hAnsi="Aptos" w:eastAsia="Aptos" w:cs="Aptos" w:csTheme="minorBidi"/>
+                <w:rFonts w:ascii="Aptos" w:hAnsi="Aptos" w:eastAsia="Aptos" w:cs="Aptos"/>
                 <w:color w:val="23313F"/>
                 <w:sz w:val="15"/>
                 <w:szCs w:val="22"/>
@@ -8793,7 +8825,7 @@
             <w:r/>
             <w:r>
               <w:rPr>
-                <w:rFonts w:ascii="Aptos" w:hAnsi="Aptos" w:eastAsia="Aptos" w:cs="Aptos" w:csTheme="minorBidi"/>
+                <w:rFonts w:ascii="Aptos" w:hAnsi="Aptos" w:eastAsia="Aptos" w:cs="Aptos"/>
                 <w:color w:val="23313F"/>
                 <w:sz w:val="15"/>
                 <w:szCs w:val="22"/>
@@ -8826,7 +8858,7 @@
             <w:r/>
             <w:r>
               <w:rPr>
-                <w:rFonts w:ascii="Aptos" w:hAnsi="Aptos" w:eastAsia="Aptos" w:cs="Aptos" w:csTheme="minorBidi"/>
+                <w:rFonts w:ascii="Aptos" w:hAnsi="Aptos" w:eastAsia="Aptos" w:cs="Aptos"/>
                 <w:color w:val="23313F"/>
                 <w:sz w:val="15"/>
                 <w:szCs w:val="22"/>
@@ -8854,7 +8886,7 @@
             <w:r/>
             <w:r>
               <w:rPr>
-                <w:rFonts w:ascii="Aptos" w:hAnsi="Aptos" w:eastAsia="Aptos" w:cs="Aptos" w:csTheme="minorBidi"/>
+                <w:rFonts w:ascii="Aptos" w:hAnsi="Aptos" w:eastAsia="Aptos" w:cs="Aptos"/>
                 <w:color w:val="23313F"/>
                 <w:sz w:val="15"/>
                 <w:szCs w:val="22"/>
@@ -8882,7 +8914,7 @@
             <w:r/>
             <w:r>
               <w:rPr>
-                <w:rFonts w:ascii="Aptos" w:hAnsi="Aptos" w:eastAsia="Aptos" w:cs="Aptos" w:csTheme="minorBidi"/>
+                <w:rFonts w:ascii="Aptos" w:hAnsi="Aptos" w:eastAsia="Aptos" w:cs="Aptos"/>
                 <w:color w:val="23313F"/>
                 <w:sz w:val="15"/>
                 <w:szCs w:val="22"/>
@@ -8910,7 +8942,7 @@
             <w:r/>
             <w:r>
               <w:rPr>
-                <w:rFonts w:ascii="Aptos" w:hAnsi="Aptos" w:eastAsia="Aptos" w:cs="Aptos" w:csTheme="minorBidi"/>
+                <w:rFonts w:ascii="Aptos" w:hAnsi="Aptos" w:eastAsia="Aptos" w:cs="Aptos"/>
                 <w:color w:val="23313F"/>
                 <w:sz w:val="15"/>
                 <w:szCs w:val="22"/>
@@ -8943,7 +8975,7 @@
             <w:r/>
             <w:r>
               <w:rPr>
-                <w:rFonts w:ascii="Aptos" w:hAnsi="Aptos" w:eastAsia="Aptos" w:cs="Aptos" w:csTheme="minorBidi"/>
+                <w:rFonts w:ascii="Aptos" w:hAnsi="Aptos" w:eastAsia="Aptos" w:cs="Aptos"/>
                 <w:color w:val="23313F"/>
                 <w:sz w:val="15"/>
                 <w:szCs w:val="22"/>
@@ -8971,7 +9003,7 @@
             <w:r/>
             <w:r>
               <w:rPr>
-                <w:rFonts w:ascii="Aptos" w:hAnsi="Aptos" w:eastAsia="Aptos" w:cs="Aptos" w:csTheme="minorBidi"/>
+                <w:rFonts w:ascii="Aptos" w:hAnsi="Aptos" w:eastAsia="Aptos" w:cs="Aptos"/>
                 <w:color w:val="23313F"/>
                 <w:sz w:val="15"/>
                 <w:szCs w:val="22"/>
@@ -8999,7 +9031,7 @@
             <w:r/>
             <w:r>
               <w:rPr>
-                <w:rFonts w:ascii="Aptos" w:hAnsi="Aptos" w:eastAsia="Aptos" w:cs="Aptos" w:csTheme="minorBidi"/>
+                <w:rFonts w:ascii="Aptos" w:hAnsi="Aptos" w:eastAsia="Aptos" w:cs="Aptos"/>
                 <w:color w:val="23313F"/>
                 <w:sz w:val="15"/>
                 <w:szCs w:val="22"/>
@@ -9027,7 +9059,7 @@
             <w:r/>
             <w:r>
               <w:rPr>
-                <w:rFonts w:ascii="Aptos" w:hAnsi="Aptos" w:eastAsia="Aptos" w:cs="Aptos" w:csTheme="minorBidi"/>
+                <w:rFonts w:ascii="Aptos" w:hAnsi="Aptos" w:eastAsia="Aptos" w:cs="Aptos"/>
                 <w:color w:val="23313F"/>
                 <w:sz w:val="15"/>
                 <w:szCs w:val="22"/>
@@ -9060,7 +9092,7 @@
             <w:r/>
             <w:r>
               <w:rPr>
-                <w:rFonts w:ascii="Aptos" w:hAnsi="Aptos" w:eastAsia="Aptos" w:cs="Aptos" w:csTheme="minorBidi"/>
+                <w:rFonts w:ascii="Aptos" w:hAnsi="Aptos" w:eastAsia="Aptos" w:cs="Aptos"/>
                 <w:color w:val="23313F"/>
                 <w:sz w:val="15"/>
                 <w:szCs w:val="22"/>
@@ -9088,7 +9120,7 @@
             <w:r/>
             <w:r>
               <w:rPr>
-                <w:rFonts w:ascii="Aptos" w:hAnsi="Aptos" w:eastAsia="Aptos" w:cs="Aptos" w:csTheme="minorBidi"/>
+                <w:rFonts w:ascii="Aptos" w:hAnsi="Aptos" w:eastAsia="Aptos" w:cs="Aptos"/>
                 <w:color w:val="23313F"/>
                 <w:sz w:val="15"/>
                 <w:szCs w:val="22"/>
@@ -9116,7 +9148,7 @@
             <w:r/>
             <w:r>
               <w:rPr>
-                <w:rFonts w:ascii="Aptos" w:hAnsi="Aptos" w:eastAsia="Aptos" w:cs="Aptos" w:csTheme="minorBidi"/>
+                <w:rFonts w:ascii="Aptos" w:hAnsi="Aptos" w:eastAsia="Aptos" w:cs="Aptos"/>
                 <w:color w:val="23313F"/>
                 <w:sz w:val="15"/>
                 <w:szCs w:val="22"/>
@@ -9144,7 +9176,7 @@
             <w:r/>
             <w:r>
               <w:rPr>
-                <w:rFonts w:ascii="Aptos" w:hAnsi="Aptos" w:eastAsia="Aptos" w:cs="Aptos" w:csTheme="minorBidi"/>
+                <w:rFonts w:ascii="Aptos" w:hAnsi="Aptos" w:eastAsia="Aptos" w:cs="Aptos"/>
                 <w:color w:val="23313F"/>
                 <w:sz w:val="15"/>
                 <w:szCs w:val="22"/>
@@ -9177,7 +9209,7 @@
             <w:r/>
             <w:r>
               <w:rPr>
-                <w:rFonts w:ascii="Aptos" w:hAnsi="Aptos" w:eastAsia="Aptos" w:cs="Aptos" w:csTheme="minorBidi"/>
+                <w:rFonts w:ascii="Aptos" w:hAnsi="Aptos" w:eastAsia="Aptos" w:cs="Aptos"/>
                 <w:color w:val="23313F"/>
                 <w:sz w:val="15"/>
                 <w:szCs w:val="22"/>
@@ -9205,7 +9237,7 @@
             <w:r/>
             <w:r>
               <w:rPr>
-                <w:rFonts w:ascii="Aptos" w:hAnsi="Aptos" w:eastAsia="Aptos" w:cs="Aptos" w:csTheme="minorBidi"/>
+                <w:rFonts w:ascii="Aptos" w:hAnsi="Aptos" w:eastAsia="Aptos" w:cs="Aptos"/>
                 <w:color w:val="23313F"/>
                 <w:sz w:val="15"/>
                 <w:szCs w:val="22"/>
@@ -9233,7 +9265,7 @@
             <w:r/>
             <w:r>
               <w:rPr>
-                <w:rFonts w:ascii="Aptos" w:hAnsi="Aptos" w:eastAsia="Aptos" w:cs="Aptos" w:csTheme="minorBidi"/>
+                <w:rFonts w:ascii="Aptos" w:hAnsi="Aptos" w:eastAsia="Aptos" w:cs="Aptos"/>
                 <w:color w:val="23313F"/>
                 <w:sz w:val="15"/>
                 <w:szCs w:val="22"/>
@@ -9261,7 +9293,7 @@
             <w:r/>
             <w:r>
               <w:rPr>
-                <w:rFonts w:ascii="Aptos" w:hAnsi="Aptos" w:eastAsia="Aptos" w:cs="Aptos" w:csTheme="minorBidi"/>
+                <w:rFonts w:ascii="Aptos" w:hAnsi="Aptos" w:eastAsia="Aptos" w:cs="Aptos"/>
                 <w:color w:val="23313F"/>
                 <w:sz w:val="15"/>
                 <w:szCs w:val="22"/>
@@ -9294,7 +9326,7 @@
             <w:r/>
             <w:r>
               <w:rPr>
-                <w:rFonts w:ascii="Aptos" w:hAnsi="Aptos" w:eastAsia="Aptos" w:cs="Aptos" w:csTheme="minorBidi"/>
+                <w:rFonts w:ascii="Aptos" w:hAnsi="Aptos" w:eastAsia="Aptos" w:cs="Aptos"/>
                 <w:color w:val="23313F"/>
                 <w:sz w:val="15"/>
                 <w:szCs w:val="22"/>
@@ -9322,7 +9354,7 @@
             <w:r/>
             <w:r>
               <w:rPr>
-                <w:rFonts w:ascii="Aptos" w:hAnsi="Aptos" w:eastAsia="Aptos" w:cs="Aptos" w:csTheme="minorBidi"/>
+                <w:rFonts w:ascii="Aptos" w:hAnsi="Aptos" w:eastAsia="Aptos" w:cs="Aptos"/>
                 <w:color w:val="23313F"/>
                 <w:sz w:val="15"/>
                 <w:szCs w:val="22"/>
@@ -9350,7 +9382,7 @@
             <w:r/>
             <w:r>
               <w:rPr>
-                <w:rFonts w:ascii="Aptos" w:hAnsi="Aptos" w:eastAsia="Aptos" w:cs="Aptos" w:csTheme="minorBidi"/>
+                <w:rFonts w:ascii="Aptos" w:hAnsi="Aptos" w:eastAsia="Aptos" w:cs="Aptos"/>
                 <w:color w:val="23313F"/>
                 <w:sz w:val="15"/>
                 <w:szCs w:val="22"/>
@@ -9378,7 +9410,7 @@
             <w:r/>
             <w:r>
               <w:rPr>
-                <w:rFonts w:ascii="Aptos" w:hAnsi="Aptos" w:eastAsia="Aptos" w:cs="Aptos" w:csTheme="minorBidi"/>
+                <w:rFonts w:ascii="Aptos" w:hAnsi="Aptos" w:eastAsia="Aptos" w:cs="Aptos"/>
                 <w:color w:val="23313F"/>
                 <w:sz w:val="15"/>
                 <w:szCs w:val="22"/>
@@ -9411,7 +9443,7 @@
             <w:r/>
             <w:r>
               <w:rPr>
-                <w:rFonts w:ascii="Aptos" w:hAnsi="Aptos" w:eastAsia="Aptos" w:cs="Aptos" w:csTheme="minorBidi"/>
+                <w:rFonts w:ascii="Aptos" w:hAnsi="Aptos" w:eastAsia="Aptos" w:cs="Aptos"/>
                 <w:color w:val="23313F"/>
                 <w:sz w:val="15"/>
                 <w:szCs w:val="22"/>
@@ -9439,7 +9471,7 @@
             <w:r/>
             <w:r>
               <w:rPr>
-                <w:rFonts w:ascii="Aptos" w:hAnsi="Aptos" w:eastAsia="Aptos" w:cs="Aptos" w:csTheme="minorBidi"/>
+                <w:rFonts w:ascii="Aptos" w:hAnsi="Aptos" w:eastAsia="Aptos" w:cs="Aptos"/>
                 <w:color w:val="23313F"/>
                 <w:sz w:val="15"/>
                 <w:szCs w:val="22"/>
@@ -9467,7 +9499,7 @@
             <w:r/>
             <w:r>
               <w:rPr>
-                <w:rFonts w:ascii="Aptos" w:hAnsi="Aptos" w:eastAsia="Aptos" w:cs="Aptos" w:csTheme="minorBidi"/>
+                <w:rFonts w:ascii="Aptos" w:hAnsi="Aptos" w:eastAsia="Aptos" w:cs="Aptos"/>
                 <w:color w:val="23313F"/>
                 <w:sz w:val="15"/>
                 <w:szCs w:val="22"/>
@@ -9495,7 +9527,7 @@
             <w:r/>
             <w:r>
               <w:rPr>
-                <w:rFonts w:ascii="Aptos" w:hAnsi="Aptos" w:eastAsia="Aptos" w:cs="Aptos" w:csTheme="minorBidi"/>
+                <w:rFonts w:ascii="Aptos" w:hAnsi="Aptos" w:eastAsia="Aptos" w:cs="Aptos"/>
                 <w:color w:val="23313F"/>
                 <w:sz w:val="15"/>
                 <w:szCs w:val="22"/>
@@ -9528,7 +9560,7 @@
             <w:r/>
             <w:r>
               <w:rPr>
-                <w:rFonts w:ascii="Aptos" w:hAnsi="Aptos" w:eastAsia="Aptos" w:cs="Aptos" w:csTheme="minorBidi"/>
+                <w:rFonts w:ascii="Aptos" w:hAnsi="Aptos" w:eastAsia="Aptos" w:cs="Aptos"/>
                 <w:color w:val="23313F"/>
                 <w:sz w:val="15"/>
                 <w:szCs w:val="22"/>
@@ -9556,7 +9588,7 @@
             <w:r/>
             <w:r>
               <w:rPr>
-                <w:rFonts w:ascii="Aptos" w:hAnsi="Aptos" w:eastAsia="Aptos" w:cs="Aptos" w:csTheme="minorBidi"/>
+                <w:rFonts w:ascii="Aptos" w:hAnsi="Aptos" w:eastAsia="Aptos" w:cs="Aptos"/>
                 <w:color w:val="23313F"/>
                 <w:sz w:val="15"/>
                 <w:szCs w:val="22"/>
@@ -9584,7 +9616,7 @@
             <w:r/>
             <w:r>
               <w:rPr>
-                <w:rFonts w:ascii="Aptos" w:hAnsi="Aptos" w:eastAsia="Aptos" w:cs="Aptos" w:csTheme="minorBidi"/>
+                <w:rFonts w:ascii="Aptos" w:hAnsi="Aptos" w:eastAsia="Aptos" w:cs="Aptos"/>
                 <w:color w:val="23313F"/>
                 <w:sz w:val="15"/>
                 <w:szCs w:val="22"/>
@@ -9612,7 +9644,7 @@
             <w:r/>
             <w:r>
               <w:rPr>
-                <w:rFonts w:ascii="Aptos" w:hAnsi="Aptos" w:eastAsia="Aptos" w:cs="Aptos" w:csTheme="minorBidi"/>
+                <w:rFonts w:ascii="Aptos" w:hAnsi="Aptos" w:eastAsia="Aptos" w:cs="Aptos"/>
                 <w:color w:val="23313F"/>
                 <w:sz w:val="15"/>
                 <w:szCs w:val="22"/>
@@ -9633,9 +9665,7 @@
         <w:pageBreakBefore/>
         <w:spacing w:after="80" w:line="259" w:lineRule="auto"/>
       </w:pPr>
-      <w:r>
-        <w:lastRenderedPageBreak/>
-      </w:r>
+      <w:r/>
     </w:p>
     <w:p>
       <w:pPr>
@@ -9643,7 +9673,7 @@
       </w:pPr>
       <w:r>
         <w:rPr>
-          <w:rFonts w:ascii="Aptos Display" w:hAnsi="Aptos Display" w:eastAsia="Aptos Display" w:cs="Aptos Display" w:asciiTheme="majorHAnsi" w:hAnsiTheme="majorHAnsi" w:eastAsiaTheme="majorEastAsia" w:csTheme="majorBidi"/>
+          <w:rFonts w:ascii="Aptos Display" w:hAnsi="Aptos Display" w:eastAsia="Aptos Display" w:cs="Aptos Display" w:asciiTheme="majorHAnsi" w:hAnsiTheme="majorHAnsi" w:eastAsiaTheme="majorEastAsia"/>
           <w:b/>
           <w:bCs/>
           <w:color w:val="17324D"/>
@@ -9659,7 +9689,7 @@
       </w:pPr>
       <w:r>
         <w:rPr>
-          <w:rFonts w:ascii="Aptos" w:hAnsi="Aptos" w:eastAsia="Aptos" w:cs="Aptos" w:csTheme="minorBidi"/>
+          <w:rFonts w:ascii="Aptos" w:hAnsi="Aptos" w:eastAsia="Aptos" w:cs="Aptos"/>
           <w:color w:val="23313F"/>
           <w:sz w:val="19"/>
           <w:szCs w:val="22"/>
@@ -9676,7 +9706,7 @@
       <w:hyperlink r:id="rId11">
         <w:r>
           <w:rPr>
-            <w:rFonts w:ascii="Aptos" w:hAnsi="Aptos" w:eastAsia="Aptos" w:cs="Aptos" w:csTheme="minorBidi"/>
+            <w:rFonts w:ascii="Aptos" w:hAnsi="Aptos" w:eastAsia="Aptos" w:cs="Aptos"/>
             <w:color w:val="176B87"/>
             <w:sz w:val="19"/>
             <w:szCs w:val="22"/>
@@ -9695,7 +9725,7 @@
       <w:hyperlink r:id="rId12">
         <w:r>
           <w:rPr>
-            <w:rFonts w:ascii="Aptos" w:hAnsi="Aptos" w:eastAsia="Aptos" w:cs="Aptos" w:csTheme="minorBidi"/>
+            <w:rFonts w:ascii="Aptos" w:hAnsi="Aptos" w:eastAsia="Aptos" w:cs="Aptos"/>
             <w:color w:val="176B87"/>
             <w:sz w:val="19"/>
             <w:szCs w:val="22"/>
@@ -9714,7 +9744,7 @@
       <w:hyperlink r:id="rId13">
         <w:r>
           <w:rPr>
-            <w:rFonts w:ascii="Aptos" w:hAnsi="Aptos" w:eastAsia="Aptos" w:cs="Aptos" w:csTheme="minorBidi"/>
+            <w:rFonts w:ascii="Aptos" w:hAnsi="Aptos" w:eastAsia="Aptos" w:cs="Aptos"/>
             <w:color w:val="176B87"/>
             <w:sz w:val="19"/>
             <w:szCs w:val="22"/>
@@ -9733,7 +9763,7 @@
       <w:hyperlink r:id="rId14">
         <w:r>
           <w:rPr>
-            <w:rFonts w:ascii="Aptos" w:hAnsi="Aptos" w:eastAsia="Aptos" w:cs="Aptos" w:csTheme="minorBidi"/>
+            <w:rFonts w:ascii="Aptos" w:hAnsi="Aptos" w:eastAsia="Aptos" w:cs="Aptos"/>
             <w:color w:val="176B87"/>
             <w:sz w:val="19"/>
             <w:szCs w:val="22"/>
@@ -9752,7 +9782,7 @@
       <w:hyperlink r:id="rId15">
         <w:r>
           <w:rPr>
-            <w:rFonts w:ascii="Aptos" w:hAnsi="Aptos" w:eastAsia="Aptos" w:cs="Aptos" w:csTheme="minorBidi"/>
+            <w:rFonts w:ascii="Aptos" w:hAnsi="Aptos" w:eastAsia="Aptos" w:cs="Aptos"/>
             <w:color w:val="176B87"/>
             <w:sz w:val="19"/>
             <w:szCs w:val="22"/>
@@ -9771,7 +9801,7 @@
       <w:hyperlink r:id="rId16">
         <w:r>
           <w:rPr>
-            <w:rFonts w:ascii="Aptos" w:hAnsi="Aptos" w:eastAsia="Aptos" w:cs="Aptos" w:csTheme="minorBidi"/>
+            <w:rFonts w:ascii="Aptos" w:hAnsi="Aptos" w:eastAsia="Aptos" w:cs="Aptos"/>
             <w:color w:val="176B87"/>
             <w:sz w:val="19"/>
             <w:szCs w:val="22"/>
@@ -9790,7 +9820,7 @@
       <w:hyperlink r:id="rId17">
         <w:r>
           <w:rPr>
-            <w:rFonts w:ascii="Aptos" w:hAnsi="Aptos" w:eastAsia="Aptos" w:cs="Aptos" w:csTheme="minorBidi"/>
+            <w:rFonts w:ascii="Aptos" w:hAnsi="Aptos" w:eastAsia="Aptos" w:cs="Aptos"/>
             <w:color w:val="176B87"/>
             <w:sz w:val="19"/>
             <w:szCs w:val="22"/>
@@ -9809,7 +9839,7 @@
       <w:hyperlink r:id="rId18">
         <w:r>
           <w:rPr>
-            <w:rFonts w:ascii="Aptos" w:hAnsi="Aptos" w:eastAsia="Aptos" w:cs="Aptos" w:csTheme="minorBidi"/>
+            <w:rFonts w:ascii="Aptos" w:hAnsi="Aptos" w:eastAsia="Aptos" w:cs="Aptos"/>
             <w:color w:val="176B87"/>
             <w:sz w:val="19"/>
             <w:szCs w:val="22"/>
@@ -9828,7 +9858,7 @@
       <w:hyperlink r:id="rId19">
         <w:r>
           <w:rPr>
-            <w:rFonts w:ascii="Aptos" w:hAnsi="Aptos" w:eastAsia="Aptos" w:cs="Aptos" w:csTheme="minorBidi"/>
+            <w:rFonts w:ascii="Aptos" w:hAnsi="Aptos" w:eastAsia="Aptos" w:cs="Aptos"/>
             <w:color w:val="176B87"/>
             <w:sz w:val="19"/>
             <w:szCs w:val="22"/>
@@ -9847,7 +9877,7 @@
       <w:hyperlink r:id="rId20">
         <w:r>
           <w:rPr>
-            <w:rFonts w:ascii="Aptos" w:hAnsi="Aptos" w:eastAsia="Aptos" w:cs="Aptos" w:csTheme="minorBidi"/>
+            <w:rFonts w:ascii="Aptos" w:hAnsi="Aptos" w:eastAsia="Aptos" w:cs="Aptos"/>
             <w:color w:val="176B87"/>
             <w:sz w:val="19"/>
             <w:szCs w:val="22"/>
@@ -9863,7 +9893,7 @@
       </w:pPr>
       <w:r>
         <w:rPr>
-          <w:rFonts w:ascii="Aptos Display" w:hAnsi="Aptos Display" w:eastAsia="Aptos Display" w:cs="Aptos Display" w:asciiTheme="majorHAnsi" w:hAnsiTheme="majorHAnsi" w:eastAsiaTheme="majorEastAsia" w:csTheme="majorBidi"/>
+          <w:rFonts w:ascii="Aptos Display" w:hAnsi="Aptos Display" w:eastAsia="Aptos Display" w:cs="Aptos Display" w:asciiTheme="majorHAnsi" w:hAnsiTheme="majorHAnsi" w:eastAsiaTheme="majorEastAsia"/>
           <w:b/>
           <w:bCs/>
           <w:color w:val="17324D"/>
@@ -9913,7 +9943,7 @@
             <w:r/>
             <w:r>
               <w:rPr>
-                <w:rFonts w:ascii="Aptos" w:hAnsi="Aptos" w:eastAsia="Aptos" w:cs="Aptos" w:csTheme="minorBidi"/>
+                <w:rFonts w:ascii="Aptos" w:hAnsi="Aptos" w:eastAsia="Aptos" w:cs="Aptos"/>
                 <w:b/>
                 <w:bCs/>
                 <w:color w:val="FFFFFF"/>
@@ -9943,7 +9973,7 @@
             <w:r/>
             <w:r>
               <w:rPr>
-                <w:rFonts w:ascii="Aptos" w:hAnsi="Aptos" w:eastAsia="Aptos" w:cs="Aptos" w:csTheme="minorBidi"/>
+                <w:rFonts w:ascii="Aptos" w:hAnsi="Aptos" w:eastAsia="Aptos" w:cs="Aptos"/>
                 <w:b/>
                 <w:bCs/>
                 <w:color w:val="FFFFFF"/>
@@ -9978,7 +10008,7 @@
             <w:r/>
             <w:r>
               <w:rPr>
-                <w:rFonts w:ascii="Aptos" w:hAnsi="Aptos" w:eastAsia="Aptos" w:cs="Aptos" w:csTheme="minorBidi"/>
+                <w:rFonts w:ascii="Aptos" w:hAnsi="Aptos" w:eastAsia="Aptos" w:cs="Aptos"/>
                 <w:color w:val="23313F"/>
                 <w:sz w:val="16"/>
                 <w:szCs w:val="22"/>
@@ -10006,7 +10036,7 @@
             <w:r/>
             <w:r>
               <w:rPr>
-                <w:rFonts w:ascii="Aptos" w:hAnsi="Aptos" w:eastAsia="Aptos" w:cs="Aptos" w:csTheme="minorBidi"/>
+                <w:rFonts w:ascii="Aptos" w:hAnsi="Aptos" w:eastAsia="Aptos" w:cs="Aptos"/>
                 <w:color w:val="23313F"/>
                 <w:sz w:val="16"/>
                 <w:szCs w:val="22"/>
@@ -10039,7 +10069,7 @@
             <w:r/>
             <w:r>
               <w:rPr>
-                <w:rFonts w:ascii="Aptos" w:hAnsi="Aptos" w:eastAsia="Aptos" w:cs="Aptos" w:csTheme="minorBidi"/>
+                <w:rFonts w:ascii="Aptos" w:hAnsi="Aptos" w:eastAsia="Aptos" w:cs="Aptos"/>
                 <w:color w:val="23313F"/>
                 <w:sz w:val="16"/>
                 <w:szCs w:val="22"/>
@@ -10067,7 +10097,7 @@
             <w:r/>
             <w:r>
               <w:rPr>
-                <w:rFonts w:ascii="Aptos" w:hAnsi="Aptos" w:eastAsia="Aptos" w:cs="Aptos" w:csTheme="minorBidi"/>
+                <w:rFonts w:ascii="Aptos" w:hAnsi="Aptos" w:eastAsia="Aptos" w:cs="Aptos"/>
                 <w:color w:val="23313F"/>
                 <w:sz w:val="16"/>
                 <w:szCs w:val="22"/>
@@ -10100,7 +10130,7 @@
             <w:r/>
             <w:r>
               <w:rPr>
-                <w:rFonts w:ascii="Aptos" w:hAnsi="Aptos" w:eastAsia="Aptos" w:cs="Aptos" w:csTheme="minorBidi"/>
+                <w:rFonts w:ascii="Aptos" w:hAnsi="Aptos" w:eastAsia="Aptos" w:cs="Aptos"/>
                 <w:color w:val="23313F"/>
                 <w:sz w:val="16"/>
                 <w:szCs w:val="22"/>
@@ -10128,7 +10158,7 @@
             <w:r/>
             <w:r>
               <w:rPr>
-                <w:rFonts w:ascii="Aptos" w:hAnsi="Aptos" w:eastAsia="Aptos" w:cs="Aptos" w:csTheme="minorBidi"/>
+                <w:rFonts w:ascii="Aptos" w:hAnsi="Aptos" w:eastAsia="Aptos" w:cs="Aptos"/>
                 <w:color w:val="23313F"/>
                 <w:sz w:val="16"/>
                 <w:szCs w:val="22"/>
@@ -10161,7 +10191,7 @@
             <w:r/>
             <w:r>
               <w:rPr>
-                <w:rFonts w:ascii="Aptos" w:hAnsi="Aptos" w:eastAsia="Aptos" w:cs="Aptos" w:csTheme="minorBidi"/>
+                <w:rFonts w:ascii="Aptos" w:hAnsi="Aptos" w:eastAsia="Aptos" w:cs="Aptos"/>
                 <w:color w:val="23313F"/>
                 <w:sz w:val="16"/>
                 <w:szCs w:val="22"/>
@@ -10189,7 +10219,7 @@
             <w:r/>
             <w:r>
               <w:rPr>
-                <w:rFonts w:ascii="Aptos" w:hAnsi="Aptos" w:eastAsia="Aptos" w:cs="Aptos" w:csTheme="minorBidi"/>
+                <w:rFonts w:ascii="Aptos" w:hAnsi="Aptos" w:eastAsia="Aptos" w:cs="Aptos"/>
                 <w:color w:val="23313F"/>
                 <w:sz w:val="16"/>
                 <w:szCs w:val="22"/>
@@ -10222,7 +10252,7 @@
             <w:r/>
             <w:r>
               <w:rPr>
-                <w:rFonts w:ascii="Aptos" w:hAnsi="Aptos" w:eastAsia="Aptos" w:cs="Aptos" w:csTheme="minorBidi"/>
+                <w:rFonts w:ascii="Aptos" w:hAnsi="Aptos" w:eastAsia="Aptos" w:cs="Aptos"/>
                 <w:color w:val="23313F"/>
                 <w:sz w:val="16"/>
                 <w:szCs w:val="22"/>
@@ -10250,7 +10280,7 @@
             <w:r/>
             <w:r>
               <w:rPr>
-                <w:rFonts w:ascii="Aptos" w:hAnsi="Aptos" w:eastAsia="Aptos" w:cs="Aptos" w:csTheme="minorBidi"/>
+                <w:rFonts w:ascii="Aptos" w:hAnsi="Aptos" w:eastAsia="Aptos" w:cs="Aptos"/>
                 <w:color w:val="23313F"/>
                 <w:sz w:val="16"/>
                 <w:szCs w:val="22"/>
@@ -10283,7 +10313,7 @@
             <w:r/>
             <w:r>
               <w:rPr>
-                <w:rFonts w:ascii="Aptos" w:hAnsi="Aptos" w:eastAsia="Aptos" w:cs="Aptos" w:csTheme="minorBidi"/>
+                <w:rFonts w:ascii="Aptos" w:hAnsi="Aptos" w:eastAsia="Aptos" w:cs="Aptos"/>
                 <w:color w:val="23313F"/>
                 <w:sz w:val="16"/>
                 <w:szCs w:val="22"/>
@@ -10311,7 +10341,7 @@
             <w:r/>
             <w:r>
               <w:rPr>
-                <w:rFonts w:ascii="Aptos" w:hAnsi="Aptos" w:eastAsia="Aptos" w:cs="Aptos" w:csTheme="minorBidi"/>
+                <w:rFonts w:ascii="Aptos" w:hAnsi="Aptos" w:eastAsia="Aptos" w:cs="Aptos"/>
                 <w:color w:val="23313F"/>
                 <w:sz w:val="16"/>
                 <w:szCs w:val="22"/>
@@ -10344,7 +10374,7 @@
             <w:r/>
             <w:r>
               <w:rPr>
-                <w:rFonts w:ascii="Aptos" w:hAnsi="Aptos" w:eastAsia="Aptos" w:cs="Aptos" w:csTheme="minorBidi"/>
+                <w:rFonts w:ascii="Aptos" w:hAnsi="Aptos" w:eastAsia="Aptos" w:cs="Aptos"/>
                 <w:color w:val="23313F"/>
                 <w:sz w:val="16"/>
                 <w:szCs w:val="22"/>
@@ -10372,7 +10402,7 @@
             <w:r/>
             <w:r>
               <w:rPr>
-                <w:rFonts w:ascii="Aptos" w:hAnsi="Aptos" w:eastAsia="Aptos" w:cs="Aptos" w:csTheme="minorBidi"/>
+                <w:rFonts w:ascii="Aptos" w:hAnsi="Aptos" w:eastAsia="Aptos" w:cs="Aptos"/>
                 <w:color w:val="23313F"/>
                 <w:sz w:val="16"/>
                 <w:szCs w:val="22"/>
@@ -10405,7 +10435,7 @@
             <w:r/>
             <w:r>
               <w:rPr>
-                <w:rFonts w:ascii="Aptos" w:hAnsi="Aptos" w:eastAsia="Aptos" w:cs="Aptos" w:csTheme="minorBidi"/>
+                <w:rFonts w:ascii="Aptos" w:hAnsi="Aptos" w:eastAsia="Aptos" w:cs="Aptos"/>
                 <w:color w:val="23313F"/>
                 <w:sz w:val="16"/>
                 <w:szCs w:val="22"/>
@@ -10433,7 +10463,7 @@
             <w:r/>
             <w:r>
               <w:rPr>
-                <w:rFonts w:ascii="Aptos" w:hAnsi="Aptos" w:eastAsia="Aptos" w:cs="Aptos" w:csTheme="minorBidi"/>
+                <w:rFonts w:ascii="Aptos" w:hAnsi="Aptos" w:eastAsia="Aptos" w:cs="Aptos"/>
                 <w:color w:val="23313F"/>
                 <w:sz w:val="16"/>
                 <w:szCs w:val="22"/>
@@ -10466,7 +10496,7 @@
             <w:r/>
             <w:r>
               <w:rPr>
-                <w:rFonts w:ascii="Aptos" w:hAnsi="Aptos" w:eastAsia="Aptos" w:cs="Aptos" w:csTheme="minorBidi"/>
+                <w:rFonts w:ascii="Aptos" w:hAnsi="Aptos" w:eastAsia="Aptos" w:cs="Aptos"/>
                 <w:color w:val="23313F"/>
                 <w:sz w:val="16"/>
                 <w:szCs w:val="22"/>
@@ -10494,7 +10524,7 @@
             <w:r/>
             <w:r>
               <w:rPr>
-                <w:rFonts w:ascii="Aptos" w:hAnsi="Aptos" w:eastAsia="Aptos" w:cs="Aptos" w:csTheme="minorBidi"/>
+                <w:rFonts w:ascii="Aptos" w:hAnsi="Aptos" w:eastAsia="Aptos" w:cs="Aptos"/>
                 <w:color w:val="23313F"/>
                 <w:sz w:val="16"/>
                 <w:szCs w:val="22"/>
@@ -10527,7 +10557,7 @@
             <w:r/>
             <w:r>
               <w:rPr>
-                <w:rFonts w:ascii="Aptos" w:hAnsi="Aptos" w:eastAsia="Aptos" w:cs="Aptos" w:csTheme="minorBidi"/>
+                <w:rFonts w:ascii="Aptos" w:hAnsi="Aptos" w:eastAsia="Aptos" w:cs="Aptos"/>
                 <w:color w:val="23313F"/>
                 <w:sz w:val="16"/>
                 <w:szCs w:val="22"/>
@@ -10555,7 +10585,7 @@
             <w:r/>
             <w:r>
               <w:rPr>
-                <w:rFonts w:ascii="Aptos" w:hAnsi="Aptos" w:eastAsia="Aptos" w:cs="Aptos" w:csTheme="minorBidi"/>
+                <w:rFonts w:ascii="Aptos" w:hAnsi="Aptos" w:eastAsia="Aptos" w:cs="Aptos"/>
                 <w:color w:val="23313F"/>
                 <w:sz w:val="16"/>
                 <w:szCs w:val="22"/>
@@ -10605,7 +10635,7 @@
             <w:r/>
             <w:r>
               <w:rPr>
-                <w:rFonts w:ascii="Aptos" w:hAnsi="Aptos" w:eastAsia="Aptos" w:cs="Aptos" w:csTheme="minorBidi"/>
+                <w:rFonts w:ascii="Aptos" w:hAnsi="Aptos" w:eastAsia="Aptos" w:cs="Aptos"/>
                 <w:b/>
                 <w:bCs/>
                 <w:color w:val="20744A"/>
@@ -10621,7 +10651,7 @@
             </w:pPr>
             <w:r>
               <w:rPr>
-                <w:rFonts w:ascii="Aptos" w:hAnsi="Aptos" w:eastAsia="Aptos" w:cs="Aptos" w:csTheme="minorBidi"/>
+                <w:rFonts w:ascii="Aptos" w:hAnsi="Aptos" w:eastAsia="Aptos" w:cs="Aptos"/>
                 <w:color w:val="23313F"/>
                 <w:sz w:val="18"/>
                 <w:szCs w:val="22"/>
@@ -10642,9 +10672,7 @@
         <w:pageBreakBefore/>
         <w:spacing w:after="80" w:line="259" w:lineRule="auto"/>
       </w:pPr>
-      <w:r>
-        <w:lastRenderedPageBreak/>
-      </w:r>
+      <w:r/>
     </w:p>
     <w:p>
       <w:pPr>
@@ -10652,7 +10680,7 @@
       </w:pPr>
       <w:r>
         <w:rPr>
-          <w:rFonts w:ascii="Aptos" w:hAnsi="Aptos" w:eastAsia="Aptos" w:cs="Aptos" w:csTheme="minorBidi"/>
+          <w:rFonts w:ascii="Aptos" w:hAnsi="Aptos" w:eastAsia="Aptos" w:cs="Aptos"/>
           <w:b/>
           <w:bCs/>
           <w:color w:val="23313F"/>
@@ -10668,7 +10696,7 @@
       </w:pPr>
       <w:r>
         <w:rPr>
-          <w:rFonts w:ascii="Aptos" w:hAnsi="Aptos" w:eastAsia="Aptos" w:cs="Aptos" w:csTheme="minorBidi"/>
+          <w:rFonts w:ascii="Aptos" w:hAnsi="Aptos" w:eastAsia="Aptos" w:cs="Aptos"/>
           <w:color w:val="23313F"/>
           <w:sz w:val="19"/>
           <w:szCs w:val="22"/>
@@ -10682,7 +10710,7 @@
       </w:pPr>
       <w:r>
         <w:rPr>
-          <w:rFonts w:ascii="Aptos Display" w:hAnsi="Aptos Display" w:eastAsia="Aptos Display" w:cs="Aptos Display" w:asciiTheme="majorHAnsi" w:hAnsiTheme="majorHAnsi" w:eastAsiaTheme="majorEastAsia" w:csTheme="majorBidi"/>
+          <w:rFonts w:ascii="Aptos Display" w:hAnsi="Aptos Display" w:eastAsia="Aptos Display" w:cs="Aptos Display" w:asciiTheme="majorHAnsi" w:hAnsiTheme="majorHAnsi" w:eastAsiaTheme="majorEastAsia"/>
           <w:b/>
           <w:bCs/>
           <w:color w:val="17324D"/>
@@ -10698,7 +10726,7 @@
       </w:pPr>
       <w:r>
         <w:rPr>
-          <w:rFonts w:ascii="Aptos" w:hAnsi="Aptos" w:eastAsia="Aptos" w:cs="Aptos" w:csTheme="minorBidi"/>
+          <w:rFonts w:ascii="Aptos" w:hAnsi="Aptos" w:eastAsia="Aptos" w:cs="Aptos"/>
           <w:color w:val="23313F"/>
           <w:sz w:val="19"/>
           <w:szCs w:val="22"/>
@@ -10712,7 +10740,7 @@
       </w:pPr>
       <w:r>
         <w:rPr>
-          <w:rFonts w:ascii="Aptos" w:hAnsi="Aptos" w:eastAsia="Aptos" w:cs="Aptos" w:asciiTheme="majorHAnsi" w:hAnsiTheme="majorHAnsi" w:eastAsiaTheme="majorEastAsia" w:csTheme="majorBidi"/>
+          <w:rFonts w:ascii="Aptos" w:hAnsi="Aptos" w:eastAsia="Aptos" w:cs="Aptos" w:asciiTheme="majorHAnsi" w:hAnsiTheme="majorHAnsi" w:eastAsiaTheme="majorEastAsia"/>
           <w:b/>
           <w:bCs/>
           <w:color w:val="176B87"/>
@@ -10729,7 +10757,7 @@
       </w:pPr>
       <w:r>
         <w:rPr>
-          <w:rFonts w:ascii="Aptos" w:hAnsi="Aptos" w:eastAsia="Aptos" w:cs="Aptos" w:csTheme="minorBidi"/>
+          <w:rFonts w:ascii="Aptos" w:hAnsi="Aptos" w:eastAsia="Aptos" w:cs="Aptos"/>
           <w:color w:val="23313F"/>
           <w:sz w:val="19"/>
           <w:szCs w:val="22"/>
@@ -10744,7 +10772,7 @@
       </w:pPr>
       <w:r>
         <w:rPr>
-          <w:rFonts w:ascii="Aptos" w:hAnsi="Aptos" w:eastAsia="Aptos" w:cs="Aptos" w:csTheme="minorBidi"/>
+          <w:rFonts w:ascii="Aptos" w:hAnsi="Aptos" w:eastAsia="Aptos" w:cs="Aptos"/>
           <w:color w:val="23313F"/>
           <w:sz w:val="19"/>
           <w:szCs w:val="22"/>
@@ -10759,7 +10787,7 @@
       </w:pPr>
       <w:r>
         <w:rPr>
-          <w:rFonts w:ascii="Aptos" w:hAnsi="Aptos" w:eastAsia="Aptos" w:cs="Aptos" w:csTheme="minorBidi"/>
+          <w:rFonts w:ascii="Aptos" w:hAnsi="Aptos" w:eastAsia="Aptos" w:cs="Aptos"/>
           <w:color w:val="23313F"/>
           <w:sz w:val="19"/>
           <w:szCs w:val="22"/>
@@ -10774,7 +10802,7 @@
       </w:pPr>
       <w:r>
         <w:rPr>
-          <w:rFonts w:ascii="Aptos" w:hAnsi="Aptos" w:eastAsia="Aptos" w:cs="Aptos" w:csTheme="minorBidi"/>
+          <w:rFonts w:ascii="Aptos" w:hAnsi="Aptos" w:eastAsia="Aptos" w:cs="Aptos"/>
           <w:color w:val="23313F"/>
           <w:sz w:val="19"/>
           <w:szCs w:val="22"/>
@@ -10789,7 +10817,7 @@
       </w:pPr>
       <w:r>
         <w:rPr>
-          <w:rFonts w:ascii="Aptos" w:hAnsi="Aptos" w:eastAsia="Aptos" w:cs="Aptos" w:csTheme="minorBidi"/>
+          <w:rFonts w:ascii="Aptos" w:hAnsi="Aptos" w:eastAsia="Aptos" w:cs="Aptos"/>
           <w:color w:val="23313F"/>
           <w:sz w:val="19"/>
           <w:szCs w:val="22"/>
@@ -10803,7 +10831,7 @@
       </w:pPr>
       <w:r>
         <w:rPr>
-          <w:rFonts w:ascii="Aptos" w:hAnsi="Aptos" w:eastAsia="Aptos" w:cs="Aptos" w:asciiTheme="majorHAnsi" w:hAnsiTheme="majorHAnsi" w:eastAsiaTheme="majorEastAsia" w:csTheme="majorBidi"/>
+          <w:rFonts w:ascii="Aptos" w:hAnsi="Aptos" w:eastAsia="Aptos" w:cs="Aptos" w:asciiTheme="majorHAnsi" w:hAnsiTheme="majorHAnsi" w:eastAsiaTheme="majorEastAsia"/>
           <w:b/>
           <w:bCs/>
           <w:color w:val="176B87"/>
@@ -10819,7 +10847,7 @@
       </w:pPr>
       <w:r>
         <w:rPr>
-          <w:rFonts w:ascii="Aptos" w:hAnsi="Aptos" w:eastAsia="Aptos" w:cs="Aptos" w:csTheme="minorBidi"/>
+          <w:rFonts w:ascii="Aptos" w:hAnsi="Aptos" w:eastAsia="Aptos" w:cs="Aptos"/>
           <w:color w:val="23313F"/>
           <w:sz w:val="19"/>
           <w:szCs w:val="22"/>
@@ -10834,7 +10862,7 @@
       </w:pPr>
       <w:r>
         <w:rPr>
-          <w:rFonts w:ascii="Aptos" w:hAnsi="Aptos" w:eastAsia="Aptos" w:cs="Aptos" w:csTheme="minorBidi"/>
+          <w:rFonts w:ascii="Aptos" w:hAnsi="Aptos" w:eastAsia="Aptos" w:cs="Aptos"/>
           <w:color w:val="23313F"/>
           <w:sz w:val="19"/>
           <w:szCs w:val="22"/>
@@ -10849,7 +10877,7 @@
       </w:pPr>
       <w:r>
         <w:rPr>
-          <w:rFonts w:ascii="Aptos" w:hAnsi="Aptos" w:eastAsia="Aptos" w:cs="Aptos" w:csTheme="minorBidi"/>
+          <w:rFonts w:ascii="Aptos" w:hAnsi="Aptos" w:eastAsia="Aptos" w:cs="Aptos"/>
           <w:color w:val="23313F"/>
           <w:sz w:val="19"/>
           <w:szCs w:val="22"/>
@@ -10864,7 +10892,7 @@
       </w:pPr>
       <w:r>
         <w:rPr>
-          <w:rFonts w:ascii="Aptos" w:hAnsi="Aptos" w:eastAsia="Aptos" w:cs="Aptos" w:csTheme="minorBidi"/>
+          <w:rFonts w:ascii="Aptos" w:hAnsi="Aptos" w:eastAsia="Aptos" w:cs="Aptos"/>
           <w:color w:val="23313F"/>
           <w:sz w:val="19"/>
           <w:szCs w:val="22"/>
@@ -10878,7 +10906,7 @@
       </w:pPr>
       <w:r>
         <w:rPr>
-          <w:rFonts w:ascii="Aptos" w:hAnsi="Aptos" w:eastAsia="Aptos" w:cs="Aptos" w:csTheme="minorBidi"/>
+          <w:rFonts w:ascii="Aptos" w:hAnsi="Aptos" w:eastAsia="Aptos" w:cs="Aptos"/>
           <w:color w:val="23313F"/>
           <w:sz w:val="19"/>
           <w:szCs w:val="22"/>
@@ -10893,7 +10921,7 @@
       </w:pPr>
       <w:r>
         <w:rPr>
-          <w:rFonts w:ascii="Aptos" w:hAnsi="Aptos" w:eastAsia="Aptos" w:cs="Aptos" w:csTheme="minorBidi"/>
+          <w:rFonts w:ascii="Aptos" w:hAnsi="Aptos" w:eastAsia="Aptos" w:cs="Aptos"/>
           <w:color w:val="23313F"/>
           <w:sz w:val="19"/>
           <w:szCs w:val="22"/>
@@ -10908,7 +10936,7 @@
       </w:pPr>
       <w:r>
         <w:rPr>
-          <w:rFonts w:ascii="Aptos" w:hAnsi="Aptos" w:eastAsia="Aptos" w:cs="Aptos" w:csTheme="minorBidi"/>
+          <w:rFonts w:ascii="Aptos" w:hAnsi="Aptos" w:eastAsia="Aptos" w:cs="Aptos"/>
           <w:color w:val="23313F"/>
           <w:sz w:val="19"/>
           <w:szCs w:val="22"/>
@@ -10923,7 +10951,7 @@
       </w:pPr>
       <w:r>
         <w:rPr>
-          <w:rFonts w:ascii="Aptos" w:hAnsi="Aptos" w:eastAsia="Aptos" w:cs="Aptos" w:csTheme="minorBidi"/>
+          <w:rFonts w:ascii="Aptos" w:hAnsi="Aptos" w:eastAsia="Aptos" w:cs="Aptos"/>
           <w:color w:val="23313F"/>
           <w:sz w:val="19"/>
           <w:szCs w:val="22"/>
@@ -10938,7 +10966,7 @@
       </w:pPr>
       <w:r>
         <w:rPr>
-          <w:rFonts w:ascii="Aptos" w:hAnsi="Aptos" w:eastAsia="Aptos" w:cs="Aptos" w:csTheme="minorBidi"/>
+          <w:rFonts w:ascii="Aptos" w:hAnsi="Aptos" w:eastAsia="Aptos" w:cs="Aptos"/>
           <w:color w:val="23313F"/>
           <w:sz w:val="19"/>
           <w:szCs w:val="22"/>
@@ -10953,7 +10981,7 @@
       </w:pPr>
       <w:r>
         <w:rPr>
-          <w:rFonts w:ascii="Aptos" w:hAnsi="Aptos" w:eastAsia="Aptos" w:cs="Aptos" w:csTheme="minorBidi"/>
+          <w:rFonts w:ascii="Aptos" w:hAnsi="Aptos" w:eastAsia="Aptos" w:cs="Aptos"/>
           <w:color w:val="23313F"/>
           <w:sz w:val="19"/>
           <w:szCs w:val="22"/>
@@ -10967,7 +10995,7 @@
       </w:pPr>
       <w:r>
         <w:rPr>
-          <w:rFonts w:ascii="Aptos" w:hAnsi="Aptos" w:eastAsia="Aptos" w:cs="Aptos" w:asciiTheme="majorHAnsi" w:hAnsiTheme="majorHAnsi" w:eastAsiaTheme="majorEastAsia" w:csTheme="majorBidi"/>
+          <w:rFonts w:ascii="Aptos" w:hAnsi="Aptos" w:eastAsia="Aptos" w:cs="Aptos" w:asciiTheme="majorHAnsi" w:hAnsiTheme="majorHAnsi" w:eastAsiaTheme="majorEastAsia"/>
           <w:b/>
           <w:bCs/>
           <w:color w:val="176B87"/>
@@ -10983,7 +11011,7 @@
       </w:pPr>
       <w:r>
         <w:rPr>
-          <w:rFonts w:ascii="Aptos" w:hAnsi="Aptos" w:eastAsia="Aptos" w:cs="Aptos" w:csTheme="minorBidi"/>
+          <w:rFonts w:ascii="Aptos" w:hAnsi="Aptos" w:eastAsia="Aptos" w:cs="Aptos"/>
           <w:color w:val="23313F"/>
           <w:sz w:val="19"/>
           <w:szCs w:val="22"/>
@@ -10998,7 +11026,7 @@
       </w:pPr>
       <w:r>
         <w:rPr>
-          <w:rFonts w:ascii="Aptos" w:hAnsi="Aptos" w:eastAsia="Aptos" w:cs="Aptos" w:csTheme="minorBidi"/>
+          <w:rFonts w:ascii="Aptos" w:hAnsi="Aptos" w:eastAsia="Aptos" w:cs="Aptos"/>
           <w:color w:val="23313F"/>
           <w:sz w:val="19"/>
           <w:szCs w:val="22"/>
@@ -11012,7 +11040,7 @@
       </w:pPr>
       <w:r>
         <w:rPr>
-          <w:rFonts w:ascii="Aptos" w:hAnsi="Aptos" w:eastAsia="Aptos" w:cs="Aptos" w:csTheme="minorBidi"/>
+          <w:rFonts w:ascii="Aptos" w:hAnsi="Aptos" w:eastAsia="Aptos" w:cs="Aptos"/>
           <w:color w:val="23313F"/>
           <w:sz w:val="19"/>
           <w:szCs w:val="22"/>
@@ -11026,7 +11054,7 @@
       </w:pPr>
       <w:r>
         <w:rPr>
-          <w:rFonts w:ascii="Aptos" w:hAnsi="Aptos" w:eastAsia="Aptos" w:cs="Aptos" w:csTheme="minorBidi"/>
+          <w:rFonts w:ascii="Aptos" w:hAnsi="Aptos" w:eastAsia="Aptos" w:cs="Aptos"/>
           <w:color w:val="23313F"/>
           <w:sz w:val="19"/>
           <w:szCs w:val="22"/>
@@ -11041,7 +11069,7 @@
       </w:pPr>
       <w:r>
         <w:rPr>
-          <w:rFonts w:ascii="Aptos" w:hAnsi="Aptos" w:eastAsia="Aptos" w:cs="Aptos" w:csTheme="minorBidi"/>
+          <w:rFonts w:ascii="Aptos" w:hAnsi="Aptos" w:eastAsia="Aptos" w:cs="Aptos"/>
           <w:color w:val="23313F"/>
           <w:sz w:val="19"/>
           <w:szCs w:val="22"/>
@@ -11056,7 +11084,7 @@
       </w:pPr>
       <w:r>
         <w:rPr>
-          <w:rFonts w:ascii="Aptos" w:hAnsi="Aptos" w:eastAsia="Aptos" w:cs="Aptos" w:csTheme="minorBidi"/>
+          <w:rFonts w:ascii="Aptos" w:hAnsi="Aptos" w:eastAsia="Aptos" w:cs="Aptos"/>
           <w:color w:val="23313F"/>
           <w:sz w:val="19"/>
           <w:szCs w:val="22"/>
@@ -11071,7 +11099,7 @@
       </w:pPr>
       <w:r>
         <w:rPr>
-          <w:rFonts w:ascii="Aptos" w:hAnsi="Aptos" w:eastAsia="Aptos" w:cs="Aptos" w:csTheme="minorBidi"/>
+          <w:rFonts w:ascii="Aptos" w:hAnsi="Aptos" w:eastAsia="Aptos" w:cs="Aptos"/>
           <w:color w:val="23313F"/>
           <w:sz w:val="19"/>
           <w:szCs w:val="22"/>
@@ -11086,7 +11114,7 @@
       </w:pPr>
       <w:r>
         <w:rPr>
-          <w:rFonts w:ascii="Aptos" w:hAnsi="Aptos" w:eastAsia="Aptos" w:cs="Aptos" w:csTheme="minorBidi"/>
+          <w:rFonts w:ascii="Aptos" w:hAnsi="Aptos" w:eastAsia="Aptos" w:cs="Aptos"/>
           <w:color w:val="23313F"/>
           <w:sz w:val="19"/>
           <w:szCs w:val="22"/>
@@ -11101,7 +11129,7 @@
       </w:pPr>
       <w:r>
         <w:rPr>
-          <w:rFonts w:ascii="Aptos" w:hAnsi="Aptos" w:eastAsia="Aptos" w:cs="Aptos" w:csTheme="minorBidi"/>
+          <w:rFonts w:ascii="Aptos" w:hAnsi="Aptos" w:eastAsia="Aptos" w:cs="Aptos"/>
           <w:color w:val="23313F"/>
           <w:sz w:val="19"/>
           <w:szCs w:val="22"/>
@@ -11116,7 +11144,7 @@
       </w:pPr>
       <w:r>
         <w:rPr>
-          <w:rFonts w:ascii="Aptos" w:hAnsi="Aptos" w:eastAsia="Aptos" w:cs="Aptos" w:csTheme="minorBidi"/>
+          <w:rFonts w:ascii="Aptos" w:hAnsi="Aptos" w:eastAsia="Aptos" w:cs="Aptos"/>
           <w:color w:val="23313F"/>
           <w:sz w:val="19"/>
           <w:szCs w:val="22"/>
@@ -11130,7 +11158,7 @@
       </w:pPr>
       <w:r>
         <w:rPr>
-          <w:rFonts w:ascii="Aptos" w:hAnsi="Aptos" w:eastAsia="Aptos" w:cs="Aptos" w:asciiTheme="majorHAnsi" w:hAnsiTheme="majorHAnsi" w:eastAsiaTheme="majorEastAsia" w:csTheme="majorBidi"/>
+          <w:rFonts w:ascii="Aptos" w:hAnsi="Aptos" w:eastAsia="Aptos" w:cs="Aptos" w:asciiTheme="majorHAnsi" w:hAnsiTheme="majorHAnsi" w:eastAsiaTheme="majorEastAsia"/>
           <w:b/>
           <w:bCs/>
           <w:color w:val="176B87"/>
@@ -11146,7 +11174,7 @@
       </w:pPr>
       <w:r>
         <w:rPr>
-          <w:rFonts w:ascii="Aptos" w:hAnsi="Aptos" w:eastAsia="Aptos" w:cs="Aptos" w:csTheme="minorBidi"/>
+          <w:rFonts w:ascii="Aptos" w:hAnsi="Aptos" w:eastAsia="Aptos" w:cs="Aptos"/>
           <w:color w:val="23313F"/>
           <w:sz w:val="19"/>
           <w:szCs w:val="22"/>
@@ -11160,7 +11188,7 @@
       </w:pPr>
       <w:r>
         <w:rPr>
-          <w:rFonts w:ascii="Aptos" w:hAnsi="Aptos" w:eastAsia="Aptos" w:cs="Aptos" w:csTheme="minorBidi"/>
+          <w:rFonts w:ascii="Aptos" w:hAnsi="Aptos" w:eastAsia="Aptos" w:cs="Aptos"/>
           <w:color w:val="23313F"/>
           <w:sz w:val="19"/>
           <w:szCs w:val="22"/>
@@ -11174,7 +11202,7 @@
       </w:pPr>
       <w:r>
         <w:rPr>
-          <w:rFonts w:ascii="Aptos" w:hAnsi="Aptos" w:eastAsia="Aptos" w:cs="Aptos" w:asciiTheme="majorHAnsi" w:hAnsiTheme="majorHAnsi" w:eastAsiaTheme="majorEastAsia" w:csTheme="majorBidi"/>
+          <w:rFonts w:ascii="Aptos" w:hAnsi="Aptos" w:eastAsia="Aptos" w:cs="Aptos" w:asciiTheme="majorHAnsi" w:hAnsiTheme="majorHAnsi" w:eastAsiaTheme="majorEastAsia"/>
           <w:b/>
           <w:bCs/>
           <w:color w:val="176B87"/>
@@ -11190,7 +11218,7 @@
       </w:pPr>
       <w:r>
         <w:rPr>
-          <w:rFonts w:ascii="Aptos" w:hAnsi="Aptos" w:eastAsia="Aptos" w:cs="Aptos" w:csTheme="minorBidi"/>
+          <w:rFonts w:ascii="Aptos" w:hAnsi="Aptos" w:eastAsia="Aptos" w:cs="Aptos"/>
           <w:color w:val="23313F"/>
           <w:sz w:val="19"/>
           <w:szCs w:val="22"/>
@@ -11204,7 +11232,7 @@
       </w:pPr>
       <w:r>
         <w:rPr>
-          <w:rFonts w:ascii="Aptos" w:hAnsi="Aptos" w:eastAsia="Aptos" w:cs="Aptos" w:asciiTheme="majorHAnsi" w:hAnsiTheme="majorHAnsi" w:eastAsiaTheme="majorEastAsia" w:csTheme="majorBidi"/>
+          <w:rFonts w:ascii="Aptos" w:hAnsi="Aptos" w:eastAsia="Aptos" w:cs="Aptos" w:asciiTheme="majorHAnsi" w:hAnsiTheme="majorHAnsi" w:eastAsiaTheme="majorEastAsia"/>
           <w:b/>
           <w:bCs/>
           <w:color w:val="176B87"/>
@@ -11221,7 +11249,7 @@
       </w:pPr>
       <w:r>
         <w:rPr>
-          <w:rFonts w:ascii="Aptos" w:hAnsi="Aptos" w:eastAsia="Aptos" w:cs="Aptos" w:csTheme="minorBidi"/>
+          <w:rFonts w:ascii="Aptos" w:hAnsi="Aptos" w:eastAsia="Aptos" w:cs="Aptos"/>
           <w:color w:val="23313F"/>
           <w:sz w:val="19"/>
           <w:szCs w:val="22"/>
@@ -11236,7 +11264,7 @@
       </w:pPr>
       <w:r>
         <w:rPr>
-          <w:rFonts w:ascii="Aptos" w:hAnsi="Aptos" w:eastAsia="Aptos" w:cs="Aptos" w:csTheme="minorBidi"/>
+          <w:rFonts w:ascii="Aptos" w:hAnsi="Aptos" w:eastAsia="Aptos" w:cs="Aptos"/>
           <w:color w:val="23313F"/>
           <w:sz w:val="19"/>
           <w:szCs w:val="22"/>
@@ -11251,7 +11279,7 @@
       </w:pPr>
       <w:r>
         <w:rPr>
-          <w:rFonts w:ascii="Aptos" w:hAnsi="Aptos" w:eastAsia="Aptos" w:cs="Aptos" w:csTheme="minorBidi"/>
+          <w:rFonts w:ascii="Aptos" w:hAnsi="Aptos" w:eastAsia="Aptos" w:cs="Aptos"/>
           <w:color w:val="23313F"/>
           <w:sz w:val="19"/>
           <w:szCs w:val="22"/>
@@ -11266,7 +11294,7 @@
       </w:pPr>
       <w:r>
         <w:rPr>
-          <w:rFonts w:ascii="Aptos" w:hAnsi="Aptos" w:eastAsia="Aptos" w:cs="Aptos" w:csTheme="minorBidi"/>
+          <w:rFonts w:ascii="Aptos" w:hAnsi="Aptos" w:eastAsia="Aptos" w:cs="Aptos"/>
           <w:color w:val="23313F"/>
           <w:sz w:val="19"/>
           <w:szCs w:val="22"/>
@@ -11281,7 +11309,7 @@
       </w:pPr>
       <w:r>
         <w:rPr>
-          <w:rFonts w:ascii="Aptos" w:hAnsi="Aptos" w:eastAsia="Aptos" w:cs="Aptos" w:csTheme="minorBidi"/>
+          <w:rFonts w:ascii="Aptos" w:hAnsi="Aptos" w:eastAsia="Aptos" w:cs="Aptos"/>
           <w:color w:val="23313F"/>
           <w:sz w:val="19"/>
           <w:szCs w:val="22"/>
@@ -11295,12 +11323,600 @@
       </w:pPr>
       <w:r>
         <w:rPr>
-          <w:rFonts w:ascii="Aptos" w:hAnsi="Aptos" w:eastAsia="Aptos" w:cs="Aptos" w:csTheme="minorBidi"/>
+          <w:rFonts w:ascii="Aptos" w:hAnsi="Aptos" w:eastAsia="Aptos" w:cs="Aptos"/>
           <w:color w:val="23313F"/>
           <w:sz w:val="19"/>
           <w:szCs w:val="22"/>
         </w:rPr>
-        <w:t>Document updated: 21 October 2026. Confirmed status is based on the learner’s reported test results in the learning session; the Ad Set pause/resume route remains pending confirmation.</w:t>
+        <w:t>Document updated: 21 October 2026. Confirmed status is based on the learner’s reported test results in the learning session; the Ad Set pause/resume route remains pending confirmation</w:t>
+      </w:r>
+    </w:p>
+    <w:p>
+      <w:pPr>
+        <w:spacing w:after="80" w:line="259" w:lineRule="auto"/>
+      </w:pPr>
+    </w:p>
+    <w:p>
+      <w:pPr>
+        <w:spacing w:after="80" w:line="259" w:lineRule="auto"/>
+      </w:pPr>
+    </w:p>
+    <w:p>
+      <w:pPr>
+        <w:pStyle w:val="Title"/>
+        <w:contextualSpacing/>
+        <w:spacing w:after="100" w:line="240" w:lineRule="auto"/>
+      </w:pPr>
+      <w:r>
+        <w:rPr>
+          <w:rFonts w:ascii="Aptos Display" w:hAnsi="Aptos Display" w:cs="Aptos Display" w:asciiTheme="majorHAnsi"/>
+          <w:b/>
+          <w:bCs/>
+          <w:color w:val="17324D"/>
+          <w:sz w:val="32"/>
+          <w:szCs w:val="32"/>
+        </w:rPr>
+        <w:t>What is the Insights API?</w:t>
+      </w:r>
+    </w:p>
+    <w:p>
+      <w:r>
+        <w:t>So far, we’ve been working on configuration APIs: creating Ads, setting budgets, choosing optimization goals, and updating statuses.</w:t>
+      </w:r>
+    </w:p>
+    <w:p>
+      <w:r>
+        <w:t>The Insights API is different. It tells us how our ads are performing.</w:t>
+      </w:r>
+    </w:p>
+    <w:p>
+      <w:r>
+        <w:t>Configuration API</w:t>
+      </w:r>
+    </w:p>
+    <w:p>
+      <w:r>
+        <w:t>What is configured? Budget, status, audience, bid strategy.</w:t>
+      </w:r>
+    </w:p>
+    <w:p>
+      <w:r>
+        <w:t>Insights API</w:t>
+      </w:r>
+    </w:p>
+    <w:p>
+      <w:r>
+        <w:t>What happened? Impressions, clicks, spend and performance metrics.</w:t>
+      </w:r>
+    </w:p>
+    <w:p>
+      <w:pPr>
+        <w:pStyle w:val="Heading3"/>
+        <w:outlineLvl w:val="2"/>
+      </w:pPr>
+      <w:r>
+        <w:t>Important metrics to learn</w:t>
+      </w:r>
+    </w:p>
+    <w:p>
+      <w:pPr>
+        <w:pStyle w:val="Normal"/>
+        <w:spacing w:after="80" w:line="259" w:lineRule="auto"/>
+      </w:pPr>
+    </w:p>
+    <w:tbl>
+      <w:tblPr>
+        <w:tblBorders>
+          <w:top w:val="single" w:sz="4" w:color="000000"/>
+          <w:left w:val="single" w:sz="4" w:color="000000"/>
+          <w:bottom w:val="single" w:sz="4" w:color="000000"/>
+          <w:right w:val="single" w:sz="4" w:color="000000"/>
+          <w:insideH w:val="single" w:sz="4" w:color="000000"/>
+          <w:insideV w:val="single" w:sz="4" w:color="000000"/>
+        </w:tblBorders>
+      </w:tblPr>
+      <w:tblGrid>
+        <w:gridCol w:w="4680"/>
+        <w:gridCol w:w="4680"/>
+      </w:tblGrid>
+      <w:tr>
+        <w:tc>
+          <w:tcPr>
+            <w:tcBorders>
+              <w:top w:val="single" w:sz="4" w:color="000000"/>
+              <w:left w:val="single" w:sz="4" w:color="000000"/>
+              <w:bottom w:val="single" w:sz="4" w:color="000000"/>
+              <w:right w:val="single" w:sz="4" w:color="000000"/>
+            </w:tcBorders>
+          </w:tcPr>
+          <w:p>
+            <w:pPr>
+              <w:ind w:left="720"/>
+            </w:pPr>
+            <w:r>
+              <w:rPr>
+                <w:sz w:val="24"/>
+                <w:szCs w:val="24"/>
+              </w:rPr>
+              <w:t>Metric</w:t>
+            </w:r>
+          </w:p>
+        </w:tc>
+        <w:tc>
+          <w:tcPr>
+            <w:tcBorders>
+              <w:top w:val="single" w:sz="4" w:color="000000"/>
+              <w:left w:val="single" w:sz="4" w:color="000000"/>
+              <w:bottom w:val="single" w:sz="4" w:color="000000"/>
+              <w:right w:val="single" w:sz="4" w:color="000000"/>
+            </w:tcBorders>
+          </w:tcPr>
+          <w:p>
+            <w:pPr>
+              <w:ind w:left="720"/>
+            </w:pPr>
+            <w:r>
+              <w:t>Simple meaning</w:t>
+            </w:r>
+          </w:p>
+        </w:tc>
+      </w:tr>
+      <w:tr>
+        <w:tc>
+          <w:tcPr>
+            <w:tcBorders>
+              <w:top w:val="single" w:sz="4" w:color="000000"/>
+              <w:left w:val="single" w:sz="4" w:color="000000"/>
+              <w:bottom w:val="single" w:sz="4" w:color="000000"/>
+              <w:right w:val="single" w:sz="4" w:color="000000"/>
+            </w:tcBorders>
+          </w:tcPr>
+          <w:p>
+            <w:r>
+              <w:t>impressions</w:t>
+            </w:r>
+          </w:p>
+        </w:tc>
+        <w:tc>
+          <w:tcPr>
+            <w:tcBorders>
+              <w:top w:val="single" w:sz="4" w:color="000000"/>
+              <w:left w:val="single" w:sz="4" w:color="000000"/>
+              <w:bottom w:val="single" w:sz="4" w:color="000000"/>
+              <w:right w:val="single" w:sz="4" w:color="000000"/>
+            </w:tcBorders>
+          </w:tcPr>
+          <w:p>
+            <w:r>
+              <w:t>Total times an ad was displayed</w:t>
+            </w:r>
+          </w:p>
+        </w:tc>
+      </w:tr>
+      <w:tr>
+        <w:trPr>
+          <w:trHeight w:val="270" w:hRule="atLeast"/>
+        </w:trPr>
+        <w:tc>
+          <w:tcPr>
+            <w:tcBorders>
+              <w:top w:val="single" w:sz="4" w:color="000000"/>
+              <w:left w:val="single" w:sz="4" w:color="000000"/>
+              <w:bottom w:val="single" w:sz="4" w:color="000000"/>
+              <w:right w:val="single" w:sz="4" w:color="000000"/>
+            </w:tcBorders>
+          </w:tcPr>
+          <w:p>
+            <w:r>
+              <w:t>reach</w:t>
+            </w:r>
+          </w:p>
+        </w:tc>
+        <w:tc>
+          <w:tcPr>
+            <w:tcBorders>
+              <w:top w:val="single" w:sz="4" w:color="000000"/>
+              <w:left w:val="single" w:sz="4" w:color="000000"/>
+              <w:bottom w:val="single" w:sz="4" w:color="000000"/>
+              <w:right w:val="single" w:sz="4" w:color="000000"/>
+            </w:tcBorders>
+          </w:tcPr>
+          <w:p>
+            <w:r>
+              <w:t>Estimated number of unique people who saw it</w:t>
+            </w:r>
+          </w:p>
+        </w:tc>
+      </w:tr>
+      <w:tr>
+        <w:tc>
+          <w:tcPr>
+            <w:tcBorders>
+              <w:top w:val="single" w:sz="4" w:color="000000"/>
+              <w:left w:val="single" w:sz="4" w:color="000000"/>
+              <w:bottom w:val="single" w:sz="4" w:color="000000"/>
+              <w:right w:val="single" w:sz="4" w:color="000000"/>
+            </w:tcBorders>
+          </w:tcPr>
+          <w:p>
+            <w:r>
+              <w:t>clicks</w:t>
+            </w:r>
+          </w:p>
+        </w:tc>
+        <w:tc>
+          <w:tcPr>
+            <w:tcBorders>
+              <w:top w:val="single" w:sz="4" w:color="000000"/>
+              <w:left w:val="single" w:sz="4" w:color="000000"/>
+              <w:bottom w:val="single" w:sz="4" w:color="000000"/>
+              <w:right w:val="single" w:sz="4" w:color="000000"/>
+            </w:tcBorders>
+          </w:tcPr>
+          <w:p>
+            <w:r>
+              <w:t>Clicks counted by the selected reporting metric</w:t>
+            </w:r>
+          </w:p>
+        </w:tc>
+      </w:tr>
+      <w:tr>
+        <w:tc>
+          <w:tcPr>
+            <w:tcBorders>
+              <w:top w:val="single" w:sz="4" w:color="000000"/>
+              <w:left w:val="single" w:sz="4" w:color="000000"/>
+              <w:bottom w:val="single" w:sz="4" w:color="000000"/>
+              <w:right w:val="single" w:sz="4" w:color="000000"/>
+            </w:tcBorders>
+          </w:tcPr>
+          <w:p>
+            <w:r>
+              <w:t>spend</w:t>
+            </w:r>
+          </w:p>
+        </w:tc>
+        <w:tc>
+          <w:tcPr>
+            <w:tcBorders>
+              <w:top w:val="single" w:sz="4" w:color="000000"/>
+              <w:left w:val="single" w:sz="4" w:color="000000"/>
+              <w:bottom w:val="single" w:sz="4" w:color="000000"/>
+              <w:right w:val="single" w:sz="4" w:color="000000"/>
+            </w:tcBorders>
+          </w:tcPr>
+          <w:p>
+            <w:r>
+              <w:t>Amount spent during the selected period</w:t>
+            </w:r>
+          </w:p>
+        </w:tc>
+      </w:tr>
+      <w:tr>
+        <w:tc>
+          <w:tcPr>
+            <w:tcBorders>
+              <w:top w:val="single" w:sz="4" w:color="000000"/>
+              <w:left w:val="single" w:sz="4" w:color="000000"/>
+              <w:bottom w:val="single" w:sz="4" w:color="000000"/>
+              <w:right w:val="single" w:sz="4" w:color="000000"/>
+            </w:tcBorders>
+          </w:tcPr>
+          <w:p>
+            <w:r>
+              <w:t>ctr</w:t>
+            </w:r>
+          </w:p>
+        </w:tc>
+        <w:tc>
+          <w:tcPr>
+            <w:tcBorders>
+              <w:top w:val="single" w:sz="4" w:color="000000"/>
+              <w:left w:val="single" w:sz="4" w:color="000000"/>
+              <w:bottom w:val="single" w:sz="4" w:color="000000"/>
+              <w:right w:val="single" w:sz="4" w:color="000000"/>
+            </w:tcBorders>
+          </w:tcPr>
+          <w:p>
+            <w:r>
+              <w:t>Click-through rate, expressed as a percentage</w:t>
+            </w:r>
+          </w:p>
+        </w:tc>
+      </w:tr>
+      <w:tr>
+        <w:tc>
+          <w:tcPr>
+            <w:tcBorders>
+              <w:top w:val="single" w:sz="4" w:color="000000"/>
+              <w:left w:val="single" w:sz="4" w:color="000000"/>
+              <w:bottom w:val="single" w:sz="4" w:color="000000"/>
+              <w:right w:val="single" w:sz="4" w:color="000000"/>
+            </w:tcBorders>
+          </w:tcPr>
+          <w:p>
+            <w:r>
+              <w:t>cpc</w:t>
+            </w:r>
+          </w:p>
+        </w:tc>
+        <w:tc>
+          <w:tcPr>
+            <w:tcBorders>
+              <w:top w:val="single" w:sz="4" w:color="000000"/>
+              <w:left w:val="single" w:sz="4" w:color="000000"/>
+              <w:bottom w:val="single" w:sz="4" w:color="000000"/>
+              <w:right w:val="single" w:sz="4" w:color="000000"/>
+            </w:tcBorders>
+          </w:tcPr>
+          <w:p>
+            <w:r>
+              <w:t>Cost per click, as defined by the reporting metric</w:t>
+            </w:r>
+          </w:p>
+        </w:tc>
+      </w:tr>
+      <w:tr>
+        <w:tc>
+          <w:tcPr>
+            <w:tcBorders>
+              <w:top w:val="single" w:sz="4" w:color="000000"/>
+              <w:left w:val="single" w:sz="4" w:color="000000"/>
+              <w:bottom w:val="single" w:sz="4" w:color="000000"/>
+              <w:right w:val="single" w:sz="4" w:color="000000"/>
+            </w:tcBorders>
+          </w:tcPr>
+          <w:p>
+            <w:r>
+              <w:t>cpm</w:t>
+            </w:r>
+          </w:p>
+        </w:tc>
+        <w:tc>
+          <w:tcPr>
+            <w:tcBorders>
+              <w:top w:val="single" w:sz="4" w:color="000000"/>
+              <w:left w:val="single" w:sz="4" w:color="000000"/>
+              <w:bottom w:val="single" w:sz="4" w:color="000000"/>
+              <w:right w:val="single" w:sz="4" w:color="000000"/>
+            </w:tcBorders>
+          </w:tcPr>
+          <w:p>
+            <w:r>
+              <w:t>Cost per 1,000 impressions</w:t>
+            </w:r>
+          </w:p>
+        </w:tc>
+      </w:tr>
+    </w:tbl>
+    <w:p>
+      <w:r>
+        <w:t>For example, if an ad has 1,000 impressions and 20 clicks, its simple click-through rate is \(20/1000 \times 100 = 2\%\). Meta's reported CTR can depend on which CTR field you request, so we'll choose fields carefully.</w:t>
+      </w:r>
+    </w:p>
+    <w:p>
+      <w:pPr>
+        <w:pStyle w:val="Heading2"/>
+        <w:outlineLvl w:val="1"/>
+      </w:pPr>
+      <w:r>
+        <w:t>2. How does the Insights endpoint work?</w:t>
+      </w:r>
+    </w:p>
+    <w:p>
+      <w:r>
+        <w:t>Meta provides reporting through an endpoint like this:</w:t>
+      </w:r>
+    </w:p>
+    <w:p>
+      <w:r>
+        <w:t>GET /{ad-id}/insights</w:t>
+      </w:r>
+    </w:p>
+    <w:p>
+      <w:r>
+        <w:t>Example using our existing Ad ID:</w:t>
+      </w:r>
+    </w:p>
+    <w:p>
+      <w:r>
+        <w:t>GET /v25.0/120249201376090775/insights</w:t>
+      </w:r>
+    </w:p>
+    <w:p>
+      <w:r>
+        <w:t>Note: 120249201376090775 is our Ad Set ID, not an Ad ID. For Ad-level reporting, we must use the actual Ad ID returned by the Ad creation route. We can also request insights using a Campaign ID or Ad Set ID.</w:t>
+      </w:r>
+    </w:p>
+    <w:p>
+      <w:pPr>
+        <w:pStyle w:val="Heading3"/>
+        <w:outlineLvl w:val="2"/>
+      </w:pPr>
+      <w:r>
+        <w:t>Parameters we will use</w:t>
+      </w:r>
+    </w:p>
+    <w:tbl>
+      <w:tblPr/>
+      <w:tblGrid>
+        <w:gridCol w:w="4680"/>
+        <w:gridCol w:w="4680"/>
+      </w:tblGrid>
+      <w:tr>
+        <w:tc>
+          <w:p>
+            <w:r>
+              <w:t>Parameter</w:t>
+            </w:r>
+          </w:p>
+        </w:tc>
+        <w:tc>
+          <w:p>
+            <w:r>
+              <w:t>Purpose</w:t>
+            </w:r>
+          </w:p>
+        </w:tc>
+      </w:tr>
+      <w:tr>
+        <w:tc>
+          <w:p>
+            <w:r>
+              <w:t>fields</w:t>
+            </w:r>
+          </w:p>
+        </w:tc>
+        <w:tc>
+          <w:p>
+            <w:r>
+              <w:t>Which metrics to return</w:t>
+            </w:r>
+          </w:p>
+        </w:tc>
+      </w:tr>
+      <w:tr>
+        <w:tc>
+          <w:p>
+            <w:r>
+              <w:t>date_preset</w:t>
+            </w:r>
+          </w:p>
+        </w:tc>
+        <w:tc>
+          <w:p>
+            <w:r>
+              <w:t>Reporting period, e.g. last_7d</w:t>
+            </w:r>
+          </w:p>
+        </w:tc>
+      </w:tr>
+      <w:tr>
+        <w:tc>
+          <w:p>
+            <w:r>
+              <w:t>time_range</w:t>
+            </w:r>
+          </w:p>
+        </w:tc>
+        <w:tc>
+          <w:p>
+            <w:r>
+              <w:t>A custom start and end date</w:t>
+            </w:r>
+          </w:p>
+        </w:tc>
+      </w:tr>
+      <w:tr>
+        <w:tc>
+          <w:p>
+            <w:r>
+              <w:t>level</w:t>
+            </w:r>
+          </w:p>
+        </w:tc>
+        <w:tc>
+          <w:p>
+            <w:r>
+              <w:t>Reporting breakdown level, such as campaign, adset, or ad</w:t>
+            </w:r>
+          </w:p>
+        </w:tc>
+      </w:tr>
+    </w:tbl>
+    <w:p>
+      <w:r>
+        <w:t>Example request:</w:t>
+      </w:r>
+    </w:p>
+    <w:p>
+      <w:r>
+        <w:t xml:space="preserve">GET /v25.0/{ad-id}/insights   ?fields=impressions,reach,clicks,spend,ctr,cpc,cpm   &amp;date_preset=last_7d</w:t>
+      </w:r>
+    </w:p>
+    <w:p>
+      <w:r>
+        <w:t>The line breaks are for readability; the actual request uses a single URL with query parameters.</w:t>
+      </w:r>
+    </w:p>
+    <w:p>
+      <w:r>
+        <w:t>A successful response may contain data like this (illustrative only):</w:t>
+      </w:r>
+    </w:p>
+    <w:p>
+      <w:r>
+        <w:t xml:space="preserve">{   "data": [     {       "impressions": "1000",       "reach": "850",       "clicks": "20",       "spend": "150.00",       "ctr": "2.00",       "cpc": "7.50",       "cpm": "150.00"     }   ] }</w:t>
+      </w:r>
+    </w:p>
+    <w:p>
+      <w:r>
+        <w:t>These values are examples, not results from your account. If an Ad has not delivered during the selected period, the response may be empty or contain no meaningful delivery metrics.</w:t>
+      </w:r>
+    </w:p>
+    <w:p>
+      <w:pPr>
+        <w:pStyle w:val="Heading2"/>
+        <w:outlineLvl w:val="1"/>
+      </w:pPr>
+      <w:r>
+        <w:t>3. What we’ll build next</w:t>
+      </w:r>
+    </w:p>
+    <w:p>
+      <w:r>
+        <w:t>We’ll create a separate file, routes/insights.routes.ts, with routes to:</w:t>
+      </w:r>
+    </w:p>
+    <w:p>
+      <w:r>
+        <w:t>Fetch insights for an Ad.</w:t>
+      </w:r>
+    </w:p>
+    <w:p>
+      <w:r>
+        <w:t>Fetch insights for an Ad Set.</w:t>
+      </w:r>
+    </w:p>
+    <w:p>
+      <w:r>
+        <w:t>Fetch insights for a Campaign.</w:t>
+      </w:r>
+    </w:p>
+    <w:p>
+      <w:r>
+        <w:t>Support a date preset or custom date range.</w:t>
+      </w:r>
+    </w:p>
+    <w:p>
+      <w:r>
+        <w:t>We’ll follow your existing approach: separate route handlers, the existing token-reading pattern, and a small src/server.ts.</w:t>
+      </w:r>
+    </w:p>
+    <w:p>
+      <w:r>
+        <w:t>Before we write the code, one important distinction: the Insights API can be learned and implemented without live account access, but we cannot confirm its real response until Meta access is restored. We should also use a real Ad ID rather than accidentally passing an Ad Set ID.</w:t>
+      </w:r>
+    </w:p>
+    <w:p>
+      <w:r>
+        <w:t>Next, we can implement the Insights routes and prepare their Postman requests without publishing or activating anything.</w:t>
+      </w:r>
+    </w:p>
+    <w:p/>
+    <w:p>
+      <w:r>
+        <w:t>Think</w:t>
+      </w:r>
+    </w:p>
+    <w:p>
+      <w:r>
+        <w:t xml:space="preserve"> To pick up a draggable item, press the space bar. While dragging, use the arrow keys to move the item. Press space again to drop the item in its new position, or press escape to cancel.</w:t>
+      </w:r>
+    </w:p>
+    <w:p>
+      <w:r>
+        <w:t xml:space="preserve"> To pick up a draggable item, press the space bar. While dragging, use the arrow keys to move the item. Press space again to drop the item in its new position, or press escape to cancel.</w:t>
       </w:r>
     </w:p>
     <w:sectPr>

</xml_diff>